<commit_message>
update change in flood threshold in Salto
</commit_message>
<xml_diff>
--- a/automatic docx/doc_master.docx
+++ b/automatic docx/doc_master.docx
@@ -1,6 +1,6 @@
 
 <file path=word/document.xml><?xml version="1.0" encoding="utf-8"?>
-<w:document xmlns:wpc="http://schemas.microsoft.com/office/word/2010/wordprocessingCanvas" xmlns:cx="http://schemas.microsoft.com/office/drawing/2014/chartex" xmlns:cx1="http://schemas.microsoft.com/office/drawing/2015/9/8/chartex" xmlns:cx2="http://schemas.microsoft.com/office/drawing/2015/10/21/chartex" xmlns:cx3="http://schemas.microsoft.com/office/drawing/2016/5/9/chartex" xmlns:cx4="http://schemas.microsoft.com/office/drawing/2016/5/10/chartex" xmlns:cx5="http://schemas.microsoft.com/office/drawing/2016/5/11/chartex" xmlns:cx6="http://schemas.microsoft.com/office/drawing/2016/5/12/chartex" xmlns:cx7="http://schemas.microsoft.com/office/drawing/2016/5/13/chartex" xmlns:cx8="http://schemas.microsoft.com/office/drawing/2016/5/14/chartex" xmlns:mc="http://schemas.openxmlformats.org/markup-compatibility/2006" xmlns:aink="http://schemas.microsoft.com/office/drawing/2016/ink" xmlns:am3d="http://schemas.microsoft.com/office/drawing/2017/model3d" xmlns:o="urn:schemas-microsoft-com:office:office" xmlns:oel="http://schemas.microsoft.com/office/2019/extlst" xmlns:r="http://schemas.openxmlformats.org/officeDocument/2006/relationships" xmlns:m="http://schemas.openxmlformats.org/officeDocument/2006/math" xmlns:v="urn:schemas-microsoft-com:vml" xmlns:wp14="http://schemas.microsoft.com/office/word/2010/wordprocessingDrawing" xmlns:wp="http://schemas.openxmlformats.org/drawingml/2006/wordprocessingDrawing" xmlns:w10="urn:schemas-microsoft-com:office:word" xmlns:w="http://schemas.openxmlformats.org/wordprocessingml/2006/main" xmlns:w14="http://schemas.microsoft.com/office/word/2010/wordml" xmlns:w15="http://schemas.microsoft.com/office/word/2012/wordml" xmlns:w16cei="http://schemas.microsoft.com/office/word/2026/wordml/cei" xmlns:w16cex="http://schemas.microsoft.com/office/word/2018/wordml/cex" xmlns:w16cid="http://schemas.microsoft.com/office/word/2016/wordml/cid" xmlns:w16="http://schemas.microsoft.com/office/word/2018/wordml" xmlns:w16du="http://schemas.microsoft.com/office/word/2023/wordml/word16du" xmlns:w16sdtdh="http://schemas.microsoft.com/office/word/2020/wordml/sdtdatahash" xmlns:w16sdtfl="http://schemas.microsoft.com/office/word/2024/wordml/sdtformatlock" xmlns:w16se="http://schemas.microsoft.com/office/word/2015/wordml/symex" xmlns:wpg="http://schemas.microsoft.com/office/word/2010/wordprocessingGroup" xmlns:wpi="http://schemas.microsoft.com/office/word/2010/wordprocessingInk" xmlns:wne="http://schemas.microsoft.com/office/word/2006/wordml" xmlns:wps="http://schemas.microsoft.com/office/word/2010/wordprocessingShape" mc:Ignorable="w14 w15 w16se w16cid w16 w16cex w16sdtdh w16sdtfl w16du wp14">
+<w:document xmlns:wpc="http://schemas.microsoft.com/office/word/2010/wordprocessingCanvas" xmlns:cx="http://schemas.microsoft.com/office/drawing/2014/chartex" xmlns:cx1="http://schemas.microsoft.com/office/drawing/2015/9/8/chartex" xmlns:cx2="http://schemas.microsoft.com/office/drawing/2015/10/21/chartex" xmlns:cx3="http://schemas.microsoft.com/office/drawing/2016/5/9/chartex" xmlns:cx4="http://schemas.microsoft.com/office/drawing/2016/5/10/chartex" xmlns:cx5="http://schemas.microsoft.com/office/drawing/2016/5/11/chartex" xmlns:cx6="http://schemas.microsoft.com/office/drawing/2016/5/12/chartex" xmlns:cx7="http://schemas.microsoft.com/office/drawing/2016/5/13/chartex" xmlns:cx8="http://schemas.microsoft.com/office/drawing/2016/5/14/chartex" xmlns:mc="http://schemas.openxmlformats.org/markup-compatibility/2006" xmlns:aink="http://schemas.microsoft.com/office/drawing/2016/ink" xmlns:am3d="http://schemas.microsoft.com/office/drawing/2017/model3d" xmlns:o="urn:schemas-microsoft-com:office:office" xmlns:oel="http://schemas.microsoft.com/office/2019/extlst" xmlns:r="http://schemas.openxmlformats.org/officeDocument/2006/relationships" xmlns:m="http://schemas.openxmlformats.org/officeDocument/2006/math" xmlns:v="urn:schemas-microsoft-com:vml" xmlns:wp14="http://schemas.microsoft.com/office/word/2010/wordprocessingDrawing" xmlns:wp="http://schemas.openxmlformats.org/drawingml/2006/wordprocessingDrawing" xmlns:w10="urn:schemas-microsoft-com:office:word" xmlns:w="http://schemas.openxmlformats.org/wordprocessingml/2006/main" xmlns:w14="http://schemas.microsoft.com/office/word/2010/wordml" xmlns:w15="http://schemas.microsoft.com/office/word/2012/wordml" xmlns:w16cex="http://schemas.microsoft.com/office/word/2018/wordml/cex" xmlns:w16cid="http://schemas.microsoft.com/office/word/2016/wordml/cid" xmlns:w16="http://schemas.microsoft.com/office/word/2018/wordml" xmlns:w16du="http://schemas.microsoft.com/office/word/2023/wordml/word16du" xmlns:w16sdtdh="http://schemas.microsoft.com/office/word/2020/wordml/sdtdatahash" xmlns:w16sdtfl="http://schemas.microsoft.com/office/word/2024/wordml/sdtformatlock" xmlns:w16se="http://schemas.microsoft.com/office/word/2015/wordml/symex" xmlns:wpg="http://schemas.microsoft.com/office/word/2010/wordprocessingGroup" xmlns:wpi="http://schemas.microsoft.com/office/word/2010/wordprocessingInk" xmlns:wne="http://schemas.microsoft.com/office/word/2006/wordml" xmlns:wps="http://schemas.microsoft.com/office/word/2010/wordprocessingShape" mc:Ignorable="w14 w15 w16se w16cid w16 w16cex w16sdtdh w16sdtfl w16du wp14">
   <w:body>
     <w:p>
       <w:pPr>
@@ -135,55 +135,7 @@
           <w:sz w:val="56"/>
           <w:szCs w:val="56"/>
         </w:rPr>
-        <w:t>INFORME DE SITUACIÓN Y PRONÓSTICO HIDROLÓGICO N</w:t>
-      </w:r>
-      <w:proofErr w:type="gramStart"/>
-      <w:r>
-        <w:rPr>
-          <w:rFonts w:ascii="Segoe UI" w:hAnsi="Segoe UI" w:cs="Segoe UI"/>
-          <w:b/>
-          <w:bCs/>
-          <w:color w:val="FFFFFF" w:themeColor="background1"/>
-          <w:sz w:val="56"/>
-          <w:szCs w:val="56"/>
-        </w:rPr>
-        <w:t>°{{ numero</w:t>
-      </w:r>
-      <w:proofErr w:type="gramEnd"/>
-      <w:r>
-        <w:rPr>
-          <w:rFonts w:ascii="Segoe UI" w:hAnsi="Segoe UI" w:cs="Segoe UI"/>
-          <w:b/>
-          <w:bCs/>
-          <w:color w:val="FFFFFF" w:themeColor="background1"/>
-          <w:sz w:val="56"/>
-          <w:szCs w:val="56"/>
-        </w:rPr>
-        <w:t>_</w:t>
-      </w:r>
-      <w:proofErr w:type="gramStart"/>
-      <w:r>
-        <w:rPr>
-          <w:rFonts w:ascii="Segoe UI" w:hAnsi="Segoe UI" w:cs="Segoe UI"/>
-          <w:b/>
-          <w:bCs/>
-          <w:color w:val="FFFFFF" w:themeColor="background1"/>
-          <w:sz w:val="56"/>
-          <w:szCs w:val="56"/>
-        </w:rPr>
-        <w:t>id }</w:t>
-      </w:r>
-      <w:proofErr w:type="gramEnd"/>
-      <w:r>
-        <w:rPr>
-          <w:rFonts w:ascii="Segoe UI" w:hAnsi="Segoe UI" w:cs="Segoe UI"/>
-          <w:b/>
-          <w:bCs/>
-          <w:color w:val="FFFFFF" w:themeColor="background1"/>
-          <w:sz w:val="56"/>
-          <w:szCs w:val="56"/>
-        </w:rPr>
-        <w:t>}</w:t>
+        <w:t>INFORME DE SITUACIÓN Y PRONÓSTICO HIDROLÓGICO N°{{ numero_id }}</w:t>
       </w:r>
     </w:p>
     <w:p>
@@ -230,7 +182,6 @@
           <w:szCs w:val="56"/>
         </w:rPr>
       </w:pPr>
-      <w:proofErr w:type="gramStart"/>
       <w:r>
         <w:rPr>
           <w:rFonts w:ascii="Segoe UI" w:hAnsi="Segoe UI" w:cs="Segoe UI"/>
@@ -240,19 +191,7 @@
           <w:sz w:val="48"/>
           <w:szCs w:val="48"/>
         </w:rPr>
-        <w:t>{{ titulo</w:t>
-      </w:r>
-      <w:proofErr w:type="gramEnd"/>
-      <w:r>
-        <w:rPr>
-          <w:rFonts w:ascii="Segoe UI" w:hAnsi="Segoe UI" w:cs="Segoe UI"/>
-          <w:b/>
-          <w:bCs/>
-          <w:color w:val="FFFFFF" w:themeColor="background1"/>
-          <w:sz w:val="48"/>
-          <w:szCs w:val="48"/>
-        </w:rPr>
-        <w:t xml:space="preserve"> }}</w:t>
+        <w:t>{{ titulo }}</w:t>
       </w:r>
     </w:p>
     <w:p>
@@ -335,7 +274,6 @@
         </w:rPr>
         <w:t xml:space="preserve">Fecha y hora de emisión: </w:t>
       </w:r>
-      <w:proofErr w:type="gramStart"/>
       <w:r>
         <w:rPr>
           <w:rFonts w:ascii="Segoe UI" w:hAnsi="Segoe UI" w:cs="Segoe UI"/>
@@ -343,37 +281,7 @@
           <w:sz w:val="32"/>
           <w:szCs w:val="32"/>
         </w:rPr>
-        <w:t>{{ fecha</w:t>
-      </w:r>
-      <w:proofErr w:type="gramEnd"/>
-      <w:r>
-        <w:rPr>
-          <w:rFonts w:ascii="Segoe UI" w:hAnsi="Segoe UI" w:cs="Segoe UI"/>
-          <w:color w:val="FFFFFF" w:themeColor="background1"/>
-          <w:sz w:val="32"/>
-          <w:szCs w:val="32"/>
-        </w:rPr>
-        <w:t>_</w:t>
-      </w:r>
-      <w:proofErr w:type="gramStart"/>
-      <w:r>
-        <w:rPr>
-          <w:rFonts w:ascii="Segoe UI" w:hAnsi="Segoe UI" w:cs="Segoe UI"/>
-          <w:color w:val="FFFFFF" w:themeColor="background1"/>
-          <w:sz w:val="32"/>
-          <w:szCs w:val="32"/>
-        </w:rPr>
-        <w:t>emision }</w:t>
-      </w:r>
-      <w:proofErr w:type="gramEnd"/>
-      <w:r>
-        <w:rPr>
-          <w:rFonts w:ascii="Segoe UI" w:hAnsi="Segoe UI" w:cs="Segoe UI"/>
-          <w:color w:val="FFFFFF" w:themeColor="background1"/>
-          <w:sz w:val="32"/>
-          <w:szCs w:val="32"/>
-        </w:rPr>
-        <w:t>}</w:t>
+        <w:t>{{ fecha_emision }}</w:t>
       </w:r>
     </w:p>
     <w:p>
@@ -400,7 +308,6 @@
         </w:rPr>
         <w:t xml:space="preserve">Próxima actualización: </w:t>
       </w:r>
-      <w:proofErr w:type="gramStart"/>
       <w:r>
         <w:rPr>
           <w:rFonts w:ascii="Segoe UI" w:hAnsi="Segoe UI" w:cs="Segoe UI"/>
@@ -408,37 +315,7 @@
           <w:sz w:val="32"/>
           <w:szCs w:val="32"/>
         </w:rPr>
-        <w:t>{{ fecha</w:t>
-      </w:r>
-      <w:proofErr w:type="gramEnd"/>
-      <w:r>
-        <w:rPr>
-          <w:rFonts w:ascii="Segoe UI" w:hAnsi="Segoe UI" w:cs="Segoe UI"/>
-          <w:color w:val="FFFFFF" w:themeColor="background1"/>
-          <w:sz w:val="32"/>
-          <w:szCs w:val="32"/>
-        </w:rPr>
-        <w:t>_pronos_</w:t>
-      </w:r>
-      <w:proofErr w:type="gramStart"/>
-      <w:r>
-        <w:rPr>
-          <w:rFonts w:ascii="Segoe UI" w:hAnsi="Segoe UI" w:cs="Segoe UI"/>
-          <w:color w:val="FFFFFF" w:themeColor="background1"/>
-          <w:sz w:val="32"/>
-          <w:szCs w:val="32"/>
-        </w:rPr>
-        <w:t>24 }</w:t>
-      </w:r>
-      <w:proofErr w:type="gramEnd"/>
-      <w:r>
-        <w:rPr>
-          <w:rFonts w:ascii="Segoe UI" w:hAnsi="Segoe UI" w:cs="Segoe UI"/>
-          <w:color w:val="FFFFFF" w:themeColor="background1"/>
-          <w:sz w:val="32"/>
-          <w:szCs w:val="32"/>
-        </w:rPr>
-        <w:t>}</w:t>
+        <w:t>{{ fecha_pronos_24 }}</w:t>
       </w:r>
     </w:p>
     <w:p>
@@ -1912,7 +1789,6 @@
                 <w:szCs w:val="22"/>
               </w:rPr>
             </w:pPr>
-            <w:proofErr w:type="gramStart"/>
             <w:r>
               <w:rPr>
                 <w:rFonts w:ascii="Segoe UI" w:hAnsi="Segoe UI" w:cs="Segoe UI"/>
@@ -1927,16 +1803,7 @@
                 <w:sz w:val="22"/>
                 <w:szCs w:val="22"/>
               </w:rPr>
-              <w:t>nivel</w:t>
-            </w:r>
-            <w:proofErr w:type="gramEnd"/>
-            <w:r>
-              <w:rPr>
-                <w:rFonts w:ascii="Segoe UI" w:hAnsi="Segoe UI" w:cs="Segoe UI"/>
-                <w:sz w:val="22"/>
-                <w:szCs w:val="22"/>
-              </w:rPr>
-              <w:t>_actual_sarandi</w:t>
+              <w:t>nivel_actual_sarandi</w:t>
             </w:r>
             <w:r>
               <w:rPr>
@@ -1963,7 +1830,6 @@
                 <w:szCs w:val="22"/>
               </w:rPr>
             </w:pPr>
-            <w:proofErr w:type="gramStart"/>
             <w:r>
               <w:rPr>
                 <w:rFonts w:ascii="Segoe UI" w:hAnsi="Segoe UI" w:cs="Segoe UI"/>
@@ -1972,7 +1838,6 @@
               </w:rPr>
               <w:t>{{ tasa</w:t>
             </w:r>
-            <w:proofErr w:type="gramEnd"/>
             <w:r>
               <w:rPr>
                 <w:rFonts w:ascii="Segoe UI" w:hAnsi="Segoe UI" w:cs="Segoe UI"/>
@@ -4282,7 +4147,6 @@
                 <w:szCs w:val="22"/>
               </w:rPr>
             </w:pPr>
-            <w:proofErr w:type="gramStart"/>
             <w:r>
               <w:rPr>
                 <w:rFonts w:ascii="Segoe UI" w:hAnsi="Segoe UI" w:cs="Segoe UI"/>
@@ -4297,16 +4161,7 @@
                 <w:sz w:val="22"/>
                 <w:szCs w:val="22"/>
               </w:rPr>
-              <w:t>nivel</w:t>
-            </w:r>
-            <w:proofErr w:type="gramEnd"/>
-            <w:r>
-              <w:rPr>
-                <w:rFonts w:ascii="Segoe UI" w:hAnsi="Segoe UI" w:cs="Segoe UI"/>
-                <w:sz w:val="22"/>
-                <w:szCs w:val="22"/>
-              </w:rPr>
-              <w:t>_actual_</w:t>
+              <w:t>nivel_actual_</w:t>
             </w:r>
             <w:r>
               <w:rPr>
@@ -4333,7 +4188,6 @@
                 <w:szCs w:val="22"/>
               </w:rPr>
             </w:pPr>
-            <w:proofErr w:type="gramStart"/>
             <w:r>
               <w:rPr>
                 <w:rFonts w:ascii="Segoe UI" w:hAnsi="Segoe UI" w:cs="Segoe UI"/>
@@ -4342,7 +4196,6 @@
               </w:rPr>
               <w:t>{{ tasa</w:t>
             </w:r>
-            <w:proofErr w:type="gramEnd"/>
             <w:r>
               <w:rPr>
                 <w:rFonts w:ascii="Segoe UI" w:hAnsi="Segoe UI" w:cs="Segoe UI"/>
@@ -4351,23 +4204,13 @@
               </w:rPr>
               <w:t>_</w:t>
             </w:r>
-            <w:proofErr w:type="gramStart"/>
-            <w:r>
-              <w:rPr>
-                <w:rFonts w:ascii="Segoe UI" w:hAnsi="Segoe UI" w:cs="Segoe UI"/>
-                <w:sz w:val="22"/>
-                <w:szCs w:val="22"/>
-              </w:rPr>
-              <w:t>catalan }</w:t>
-            </w:r>
-            <w:proofErr w:type="gramEnd"/>
-            <w:r>
-              <w:rPr>
-                <w:rFonts w:ascii="Segoe UI" w:hAnsi="Segoe UI" w:cs="Segoe UI"/>
-                <w:sz w:val="22"/>
-                <w:szCs w:val="22"/>
-              </w:rPr>
-              <w:t xml:space="preserve">} </w:t>
+            <w:r>
+              <w:rPr>
+                <w:rFonts w:ascii="Segoe UI" w:hAnsi="Segoe UI" w:cs="Segoe UI"/>
+                <w:sz w:val="22"/>
+                <w:szCs w:val="22"/>
+              </w:rPr>
+              <w:t xml:space="preserve">catalan }} </w:t>
             </w:r>
           </w:p>
         </w:tc>
@@ -4387,7 +4230,6 @@
                 <w:szCs w:val="22"/>
               </w:rPr>
             </w:pPr>
-            <w:proofErr w:type="gramStart"/>
             <w:r>
               <w:rPr>
                 <w:rFonts w:ascii="Segoe UI" w:hAnsi="Segoe UI" w:cs="Segoe UI"/>
@@ -4402,34 +4244,15 @@
                 <w:sz w:val="22"/>
                 <w:szCs w:val="22"/>
               </w:rPr>
-              <w:t>tendencia</w:t>
-            </w:r>
-            <w:proofErr w:type="gramEnd"/>
-            <w:r>
-              <w:rPr>
-                <w:rFonts w:ascii="Segoe UI" w:hAnsi="Segoe UI" w:cs="Segoe UI"/>
-                <w:sz w:val="22"/>
-                <w:szCs w:val="22"/>
-              </w:rPr>
-              <w:t>_</w:t>
-            </w:r>
-            <w:proofErr w:type="gramStart"/>
-            <w:r>
-              <w:rPr>
-                <w:rFonts w:ascii="Segoe UI" w:hAnsi="Segoe UI" w:cs="Segoe UI"/>
-                <w:sz w:val="22"/>
-                <w:szCs w:val="22"/>
-              </w:rPr>
-              <w:t>catalan }</w:t>
-            </w:r>
-            <w:proofErr w:type="gramEnd"/>
-            <w:r>
-              <w:rPr>
-                <w:rFonts w:ascii="Segoe UI" w:hAnsi="Segoe UI" w:cs="Segoe UI"/>
-                <w:sz w:val="22"/>
-                <w:szCs w:val="22"/>
-              </w:rPr>
-              <w:t xml:space="preserve">} </w:t>
+              <w:t>tendencia_</w:t>
+            </w:r>
+            <w:r>
+              <w:rPr>
+                <w:rFonts w:ascii="Segoe UI" w:hAnsi="Segoe UI" w:cs="Segoe UI"/>
+                <w:sz w:val="22"/>
+                <w:szCs w:val="22"/>
+              </w:rPr>
+              <w:t xml:space="preserve">catalan }} </w:t>
             </w:r>
           </w:p>
         </w:tc>
@@ -4501,7 +4324,6 @@
                 <w:szCs w:val="22"/>
               </w:rPr>
             </w:pPr>
-            <w:proofErr w:type="gramStart"/>
             <w:r>
               <w:rPr>
                 <w:rFonts w:ascii="Segoe UI" w:hAnsi="Segoe UI" w:cs="Segoe UI"/>
@@ -4516,16 +4338,7 @@
                 <w:sz w:val="22"/>
                 <w:szCs w:val="22"/>
               </w:rPr>
-              <w:t>nivel</w:t>
-            </w:r>
-            <w:proofErr w:type="gramEnd"/>
-            <w:r>
-              <w:rPr>
-                <w:rFonts w:ascii="Segoe UI" w:hAnsi="Segoe UI" w:cs="Segoe UI"/>
-                <w:sz w:val="22"/>
-                <w:szCs w:val="22"/>
-              </w:rPr>
-              <w:t>_actual_</w:t>
+              <w:t>nivel_actual_</w:t>
             </w:r>
             <w:r>
               <w:rPr>
@@ -4552,7 +4365,6 @@
                 <w:szCs w:val="22"/>
               </w:rPr>
             </w:pPr>
-            <w:proofErr w:type="gramStart"/>
             <w:r>
               <w:rPr>
                 <w:rFonts w:ascii="Segoe UI" w:hAnsi="Segoe UI" w:cs="Segoe UI"/>
@@ -4561,7 +4373,6 @@
               </w:rPr>
               <w:t>{{ tasa</w:t>
             </w:r>
-            <w:proofErr w:type="gramEnd"/>
             <w:r>
               <w:rPr>
                 <w:rFonts w:ascii="Segoe UI" w:hAnsi="Segoe UI" w:cs="Segoe UI"/>
@@ -4596,7 +4407,6 @@
                 <w:szCs w:val="22"/>
               </w:rPr>
             </w:pPr>
-            <w:proofErr w:type="gramStart"/>
             <w:r>
               <w:rPr>
                 <w:rFonts w:ascii="Segoe UI" w:hAnsi="Segoe UI" w:cs="Segoe UI"/>
@@ -4611,16 +4421,7 @@
                 <w:sz w:val="22"/>
                 <w:szCs w:val="22"/>
               </w:rPr>
-              <w:t>tendencia</w:t>
-            </w:r>
-            <w:proofErr w:type="gramEnd"/>
-            <w:r>
-              <w:rPr>
-                <w:rFonts w:ascii="Segoe UI" w:hAnsi="Segoe UI" w:cs="Segoe UI"/>
-                <w:sz w:val="22"/>
-                <w:szCs w:val="22"/>
-              </w:rPr>
-              <w:t>_</w:t>
+              <w:t>tendencia_</w:t>
             </w:r>
             <w:r>
               <w:rPr>
@@ -4781,51 +4582,7 @@
                 <w:sz w:val="22"/>
                 <w:szCs w:val="22"/>
               </w:rPr>
-              <w:t xml:space="preserve"> </w:t>
-            </w:r>
-            <w:proofErr w:type="gramStart"/>
-            <w:r>
-              <w:rPr>
-                <w:rFonts w:ascii="Segoe UI" w:hAnsi="Segoe UI" w:cs="Segoe UI"/>
-                <w:b w:val="0"/>
-                <w:bCs w:val="0"/>
-                <w:sz w:val="22"/>
-                <w:szCs w:val="22"/>
-              </w:rPr>
-              <w:t>{{ pobs</w:t>
-            </w:r>
-            <w:proofErr w:type="gramEnd"/>
-            <w:r>
-              <w:rPr>
-                <w:rFonts w:ascii="Segoe UI" w:hAnsi="Segoe UI" w:cs="Segoe UI"/>
-                <w:b w:val="0"/>
-                <w:bCs w:val="0"/>
-                <w:sz w:val="22"/>
-                <w:szCs w:val="22"/>
-              </w:rPr>
-              <w:t>_24_</w:t>
-            </w:r>
-            <w:proofErr w:type="gramStart"/>
-            <w:r>
-              <w:rPr>
-                <w:rFonts w:ascii="Segoe UI" w:hAnsi="Segoe UI" w:cs="Segoe UI"/>
-                <w:b w:val="0"/>
-                <w:bCs w:val="0"/>
-                <w:sz w:val="22"/>
-                <w:szCs w:val="22"/>
-              </w:rPr>
-              <w:t>cuareim }</w:t>
-            </w:r>
-            <w:proofErr w:type="gramEnd"/>
-            <w:r>
-              <w:rPr>
-                <w:rFonts w:ascii="Segoe UI" w:hAnsi="Segoe UI" w:cs="Segoe UI"/>
-                <w:b w:val="0"/>
-                <w:bCs w:val="0"/>
-                <w:sz w:val="22"/>
-                <w:szCs w:val="22"/>
-              </w:rPr>
-              <w:t>} mm</w:t>
+              <w:t xml:space="preserve"> {{ pobs_24_cuareim }} mm</w:t>
             </w:r>
           </w:p>
           <w:p>
@@ -4869,51 +4626,7 @@
                 <w:sz w:val="22"/>
                 <w:szCs w:val="22"/>
               </w:rPr>
-              <w:t xml:space="preserve"> </w:t>
-            </w:r>
-            <w:proofErr w:type="gramStart"/>
-            <w:r>
-              <w:rPr>
-                <w:rFonts w:ascii="Segoe UI" w:hAnsi="Segoe UI" w:cs="Segoe UI"/>
-                <w:b w:val="0"/>
-                <w:bCs w:val="0"/>
-                <w:sz w:val="22"/>
-                <w:szCs w:val="22"/>
-              </w:rPr>
-              <w:t>{{ pobs</w:t>
-            </w:r>
-            <w:proofErr w:type="gramEnd"/>
-            <w:r>
-              <w:rPr>
-                <w:rFonts w:ascii="Segoe UI" w:hAnsi="Segoe UI" w:cs="Segoe UI"/>
-                <w:b w:val="0"/>
-                <w:bCs w:val="0"/>
-                <w:sz w:val="22"/>
-                <w:szCs w:val="22"/>
-              </w:rPr>
-              <w:t>_48_</w:t>
-            </w:r>
-            <w:proofErr w:type="gramStart"/>
-            <w:r>
-              <w:rPr>
-                <w:rFonts w:ascii="Segoe UI" w:hAnsi="Segoe UI" w:cs="Segoe UI"/>
-                <w:b w:val="0"/>
-                <w:bCs w:val="0"/>
-                <w:sz w:val="22"/>
-                <w:szCs w:val="22"/>
-              </w:rPr>
-              <w:t>cuareim }</w:t>
-            </w:r>
-            <w:proofErr w:type="gramEnd"/>
-            <w:r>
-              <w:rPr>
-                <w:rFonts w:ascii="Segoe UI" w:hAnsi="Segoe UI" w:cs="Segoe UI"/>
-                <w:b w:val="0"/>
-                <w:bCs w:val="0"/>
-                <w:sz w:val="22"/>
-                <w:szCs w:val="22"/>
-              </w:rPr>
-              <w:t>} mm</w:t>
+              <w:t xml:space="preserve"> {{ pobs_48_cuareim }} mm</w:t>
             </w:r>
           </w:p>
           <w:p>
@@ -4950,51 +4663,7 @@
                 <w:sz w:val="22"/>
                 <w:szCs w:val="22"/>
               </w:rPr>
-              <w:t xml:space="preserve"> </w:t>
-            </w:r>
-            <w:proofErr w:type="gramStart"/>
-            <w:r>
-              <w:rPr>
-                <w:rFonts w:ascii="Segoe UI" w:hAnsi="Segoe UI" w:cs="Segoe UI"/>
-                <w:b w:val="0"/>
-                <w:bCs w:val="0"/>
-                <w:sz w:val="22"/>
-                <w:szCs w:val="22"/>
-              </w:rPr>
-              <w:t>{{ pobs</w:t>
-            </w:r>
-            <w:proofErr w:type="gramEnd"/>
-            <w:r>
-              <w:rPr>
-                <w:rFonts w:ascii="Segoe UI" w:hAnsi="Segoe UI" w:cs="Segoe UI"/>
-                <w:b w:val="0"/>
-                <w:bCs w:val="0"/>
-                <w:sz w:val="22"/>
-                <w:szCs w:val="22"/>
-              </w:rPr>
-              <w:t>_72_</w:t>
-            </w:r>
-            <w:proofErr w:type="gramStart"/>
-            <w:r>
-              <w:rPr>
-                <w:rFonts w:ascii="Segoe UI" w:hAnsi="Segoe UI" w:cs="Segoe UI"/>
-                <w:b w:val="0"/>
-                <w:bCs w:val="0"/>
-                <w:sz w:val="22"/>
-                <w:szCs w:val="22"/>
-              </w:rPr>
-              <w:t>cuareim }</w:t>
-            </w:r>
-            <w:proofErr w:type="gramEnd"/>
-            <w:r>
-              <w:rPr>
-                <w:rFonts w:ascii="Segoe UI" w:hAnsi="Segoe UI" w:cs="Segoe UI"/>
-                <w:b w:val="0"/>
-                <w:bCs w:val="0"/>
-                <w:sz w:val="22"/>
-                <w:szCs w:val="22"/>
-              </w:rPr>
-              <w:t>} mm</w:t>
+              <w:t xml:space="preserve"> {{ pobs_72_cuareim }} mm</w:t>
             </w:r>
           </w:p>
         </w:tc>
@@ -5144,29 +4813,16 @@
               </w:rPr>
               <w:t xml:space="preserve"> </w:t>
             </w:r>
-            <w:proofErr w:type="gramStart"/>
-            <w:r>
-              <w:rPr>
-                <w:rFonts w:ascii="Segoe UI" w:hAnsi="Segoe UI" w:cs="Segoe UI"/>
-                <w:b w:val="0"/>
-                <w:bCs w:val="0"/>
-                <w:sz w:val="22"/>
-                <w:szCs w:val="22"/>
-              </w:rPr>
-              <w:t>{{ psim</w:t>
-            </w:r>
-            <w:proofErr w:type="gramEnd"/>
-            <w:r>
-              <w:rPr>
-                <w:rFonts w:ascii="Segoe UI" w:hAnsi="Segoe UI" w:cs="Segoe UI"/>
-                <w:b w:val="0"/>
-                <w:bCs w:val="0"/>
-                <w:sz w:val="22"/>
-                <w:szCs w:val="22"/>
-              </w:rPr>
-              <w:t>_24_</w:t>
-            </w:r>
-            <w:proofErr w:type="gramStart"/>
+            <w:r>
+              <w:rPr>
+                <w:rFonts w:ascii="Segoe UI" w:hAnsi="Segoe UI" w:cs="Segoe UI"/>
+                <w:b w:val="0"/>
+                <w:bCs w:val="0"/>
+                <w:sz w:val="22"/>
+                <w:szCs w:val="22"/>
+              </w:rPr>
+              <w:t>{{ psim_24_</w:t>
+            </w:r>
             <w:r>
               <w:rPr>
                 <w:rFonts w:ascii="Segoe UI" w:hAnsi="Segoe UI" w:cs="Segoe UI"/>
@@ -5185,18 +4841,7 @@
                 <w:sz w:val="22"/>
                 <w:szCs w:val="22"/>
               </w:rPr>
-              <w:t xml:space="preserve"> }</w:t>
-            </w:r>
-            <w:proofErr w:type="gramEnd"/>
-            <w:r>
-              <w:rPr>
-                <w:rFonts w:ascii="Segoe UI" w:hAnsi="Segoe UI" w:cs="Segoe UI"/>
-                <w:b w:val="0"/>
-                <w:bCs w:val="0"/>
-                <w:sz w:val="22"/>
-                <w:szCs w:val="22"/>
-              </w:rPr>
-              <w:t>} mm</w:t>
+              <w:t xml:space="preserve"> }} mm</w:t>
             </w:r>
           </w:p>
           <w:p>
@@ -5242,29 +4887,16 @@
               </w:rPr>
               <w:t xml:space="preserve"> </w:t>
             </w:r>
-            <w:proofErr w:type="gramStart"/>
-            <w:r>
-              <w:rPr>
-                <w:rFonts w:ascii="Segoe UI" w:hAnsi="Segoe UI" w:cs="Segoe UI"/>
-                <w:b w:val="0"/>
-                <w:bCs w:val="0"/>
-                <w:sz w:val="22"/>
-                <w:szCs w:val="22"/>
-              </w:rPr>
-              <w:t>{{ psim</w:t>
-            </w:r>
-            <w:proofErr w:type="gramEnd"/>
-            <w:r>
-              <w:rPr>
-                <w:rFonts w:ascii="Segoe UI" w:hAnsi="Segoe UI" w:cs="Segoe UI"/>
-                <w:b w:val="0"/>
-                <w:bCs w:val="0"/>
-                <w:sz w:val="22"/>
-                <w:szCs w:val="22"/>
-              </w:rPr>
-              <w:t>_48_</w:t>
-            </w:r>
-            <w:proofErr w:type="gramStart"/>
+            <w:r>
+              <w:rPr>
+                <w:rFonts w:ascii="Segoe UI" w:hAnsi="Segoe UI" w:cs="Segoe UI"/>
+                <w:b w:val="0"/>
+                <w:bCs w:val="0"/>
+                <w:sz w:val="22"/>
+                <w:szCs w:val="22"/>
+              </w:rPr>
+              <w:t>{{ psim_48_</w:t>
+            </w:r>
             <w:r>
               <w:rPr>
                 <w:rFonts w:ascii="Segoe UI" w:hAnsi="Segoe UI" w:cs="Segoe UI"/>
@@ -5283,18 +4915,7 @@
                 <w:sz w:val="22"/>
                 <w:szCs w:val="22"/>
               </w:rPr>
-              <w:t xml:space="preserve"> }</w:t>
-            </w:r>
-            <w:proofErr w:type="gramEnd"/>
-            <w:r>
-              <w:rPr>
-                <w:rFonts w:ascii="Segoe UI" w:hAnsi="Segoe UI" w:cs="Segoe UI"/>
-                <w:b w:val="0"/>
-                <w:bCs w:val="0"/>
-                <w:sz w:val="22"/>
-                <w:szCs w:val="22"/>
-              </w:rPr>
-              <w:t>} mm</w:t>
+              <w:t xml:space="preserve"> }} mm</w:t>
             </w:r>
           </w:p>
           <w:p>
@@ -5338,31 +4959,8 @@
                 <w:sz w:val="22"/>
                 <w:szCs w:val="22"/>
               </w:rPr>
-              <w:t xml:space="preserve"> </w:t>
-            </w:r>
-            <w:proofErr w:type="gramStart"/>
-            <w:r>
-              <w:rPr>
-                <w:rFonts w:ascii="Segoe UI" w:hAnsi="Segoe UI" w:cs="Segoe UI"/>
-                <w:b w:val="0"/>
-                <w:bCs w:val="0"/>
-                <w:sz w:val="22"/>
-                <w:szCs w:val="22"/>
-              </w:rPr>
-              <w:t>{{ psim</w:t>
-            </w:r>
-            <w:proofErr w:type="gramEnd"/>
-            <w:r>
-              <w:rPr>
-                <w:rFonts w:ascii="Segoe UI" w:hAnsi="Segoe UI" w:cs="Segoe UI"/>
-                <w:b w:val="0"/>
-                <w:bCs w:val="0"/>
-                <w:sz w:val="22"/>
-                <w:szCs w:val="22"/>
-              </w:rPr>
-              <w:t>_72_</w:t>
-            </w:r>
-            <w:proofErr w:type="gramStart"/>
+              <w:t xml:space="preserve"> {{ psim_72_</w:t>
+            </w:r>
             <w:r>
               <w:rPr>
                 <w:rFonts w:ascii="Segoe UI" w:hAnsi="Segoe UI" w:cs="Segoe UI"/>
@@ -5381,18 +4979,7 @@
                 <w:sz w:val="22"/>
                 <w:szCs w:val="22"/>
               </w:rPr>
-              <w:t xml:space="preserve"> }</w:t>
-            </w:r>
-            <w:proofErr w:type="gramEnd"/>
-            <w:r>
-              <w:rPr>
-                <w:rFonts w:ascii="Segoe UI" w:hAnsi="Segoe UI" w:cs="Segoe UI"/>
-                <w:b w:val="0"/>
-                <w:bCs w:val="0"/>
-                <w:sz w:val="22"/>
-                <w:szCs w:val="22"/>
-              </w:rPr>
-              <w:t>} mm</w:t>
+              <w:t xml:space="preserve"> }} mm</w:t>
             </w:r>
           </w:p>
         </w:tc>
@@ -5584,23 +5171,13 @@
                 <w:szCs w:val="22"/>
               </w:rPr>
             </w:pPr>
-            <w:proofErr w:type="gramStart"/>
-            <w:r>
-              <w:rPr>
-                <w:rFonts w:ascii="Segoe UI" w:hAnsi="Segoe UI" w:cs="Segoe UI"/>
-                <w:sz w:val="22"/>
-                <w:szCs w:val="22"/>
-              </w:rPr>
-              <w:t>{{ pronos</w:t>
-            </w:r>
-            <w:proofErr w:type="gramEnd"/>
-            <w:r>
-              <w:rPr>
-                <w:rFonts w:ascii="Segoe UI" w:hAnsi="Segoe UI" w:cs="Segoe UI"/>
-                <w:sz w:val="22"/>
-                <w:szCs w:val="22"/>
-              </w:rPr>
-              <w:t>_cuareim }}</w:t>
+            <w:r>
+              <w:rPr>
+                <w:rFonts w:ascii="Segoe UI" w:hAnsi="Segoe UI" w:cs="Segoe UI"/>
+                <w:sz w:val="22"/>
+                <w:szCs w:val="22"/>
+              </w:rPr>
+              <w:t>{{ pronos_cuareim }}</w:t>
             </w:r>
           </w:p>
         </w:tc>
@@ -5619,23 +5196,13 @@
                 <w:szCs w:val="22"/>
               </w:rPr>
             </w:pPr>
-            <w:proofErr w:type="gramStart"/>
-            <w:r>
-              <w:rPr>
-                <w:rFonts w:ascii="Segoe UI" w:hAnsi="Segoe UI" w:cs="Segoe UI"/>
-                <w:sz w:val="22"/>
-                <w:szCs w:val="22"/>
-              </w:rPr>
-              <w:t>{{ fecha</w:t>
-            </w:r>
-            <w:proofErr w:type="gramEnd"/>
-            <w:r>
-              <w:rPr>
-                <w:rFonts w:ascii="Segoe UI" w:hAnsi="Segoe UI" w:cs="Segoe UI"/>
-                <w:sz w:val="22"/>
-                <w:szCs w:val="22"/>
-              </w:rPr>
-              <w:t>_cuareim }}</w:t>
+            <w:r>
+              <w:rPr>
+                <w:rFonts w:ascii="Segoe UI" w:hAnsi="Segoe UI" w:cs="Segoe UI"/>
+                <w:sz w:val="22"/>
+                <w:szCs w:val="22"/>
+              </w:rPr>
+              <w:t>{{ fecha_cuareim }}</w:t>
             </w:r>
           </w:p>
         </w:tc>
@@ -5684,23 +5251,13 @@
                 <w:szCs w:val="22"/>
               </w:rPr>
             </w:pPr>
-            <w:proofErr w:type="gramStart"/>
-            <w:r>
-              <w:rPr>
-                <w:rFonts w:ascii="Segoe UI" w:hAnsi="Segoe UI" w:cs="Segoe UI"/>
-                <w:sz w:val="22"/>
-                <w:szCs w:val="22"/>
-              </w:rPr>
-              <w:t>{{ pronos</w:t>
-            </w:r>
-            <w:proofErr w:type="gramEnd"/>
-            <w:r>
-              <w:rPr>
-                <w:rFonts w:ascii="Segoe UI" w:hAnsi="Segoe UI" w:cs="Segoe UI"/>
-                <w:sz w:val="22"/>
-                <w:szCs w:val="22"/>
-              </w:rPr>
-              <w:t>_catalan }}</w:t>
+            <w:r>
+              <w:rPr>
+                <w:rFonts w:ascii="Segoe UI" w:hAnsi="Segoe UI" w:cs="Segoe UI"/>
+                <w:sz w:val="22"/>
+                <w:szCs w:val="22"/>
+              </w:rPr>
+              <w:t>{{ pronos_catalan }}</w:t>
             </w:r>
           </w:p>
         </w:tc>
@@ -5719,23 +5276,13 @@
                 <w:szCs w:val="22"/>
               </w:rPr>
             </w:pPr>
-            <w:proofErr w:type="gramStart"/>
-            <w:r>
-              <w:rPr>
-                <w:rFonts w:ascii="Segoe UI" w:hAnsi="Segoe UI" w:cs="Segoe UI"/>
-                <w:sz w:val="22"/>
-                <w:szCs w:val="22"/>
-              </w:rPr>
-              <w:t>{{ fecha</w:t>
-            </w:r>
-            <w:proofErr w:type="gramEnd"/>
-            <w:r>
-              <w:rPr>
-                <w:rFonts w:ascii="Segoe UI" w:hAnsi="Segoe UI" w:cs="Segoe UI"/>
-                <w:sz w:val="22"/>
-                <w:szCs w:val="22"/>
-              </w:rPr>
-              <w:t>_catalan }}</w:t>
+            <w:r>
+              <w:rPr>
+                <w:rFonts w:ascii="Segoe UI" w:hAnsi="Segoe UI" w:cs="Segoe UI"/>
+                <w:sz w:val="22"/>
+                <w:szCs w:val="22"/>
+              </w:rPr>
+              <w:t>{{ fecha_catalan }}</w:t>
             </w:r>
           </w:p>
         </w:tc>
@@ -5784,23 +5331,13 @@
                 <w:szCs w:val="22"/>
               </w:rPr>
             </w:pPr>
-            <w:proofErr w:type="gramStart"/>
-            <w:r>
-              <w:rPr>
-                <w:rFonts w:ascii="Segoe UI" w:hAnsi="Segoe UI" w:cs="Segoe UI"/>
-                <w:sz w:val="22"/>
-                <w:szCs w:val="22"/>
-              </w:rPr>
-              <w:t>{{ pronos</w:t>
-            </w:r>
-            <w:proofErr w:type="gramEnd"/>
-            <w:r>
-              <w:rPr>
-                <w:rFonts w:ascii="Segoe UI" w:hAnsi="Segoe UI" w:cs="Segoe UI"/>
-                <w:sz w:val="22"/>
-                <w:szCs w:val="22"/>
-              </w:rPr>
-              <w:t>_artigas }}</w:t>
+            <w:r>
+              <w:rPr>
+                <w:rFonts w:ascii="Segoe UI" w:hAnsi="Segoe UI" w:cs="Segoe UI"/>
+                <w:sz w:val="22"/>
+                <w:szCs w:val="22"/>
+              </w:rPr>
+              <w:t>{{ pronos_artigas }}</w:t>
             </w:r>
           </w:p>
         </w:tc>
@@ -5819,23 +5356,13 @@
                 <w:szCs w:val="22"/>
               </w:rPr>
             </w:pPr>
-            <w:proofErr w:type="gramStart"/>
-            <w:r>
-              <w:rPr>
-                <w:rFonts w:ascii="Segoe UI" w:hAnsi="Segoe UI" w:cs="Segoe UI"/>
-                <w:sz w:val="22"/>
-                <w:szCs w:val="22"/>
-              </w:rPr>
-              <w:t>{{ fecha</w:t>
-            </w:r>
-            <w:proofErr w:type="gramEnd"/>
-            <w:r>
-              <w:rPr>
-                <w:rFonts w:ascii="Segoe UI" w:hAnsi="Segoe UI" w:cs="Segoe UI"/>
-                <w:sz w:val="22"/>
-                <w:szCs w:val="22"/>
-              </w:rPr>
-              <w:t>_artigas }}</w:t>
+            <w:r>
+              <w:rPr>
+                <w:rFonts w:ascii="Segoe UI" w:hAnsi="Segoe UI" w:cs="Segoe UI"/>
+                <w:sz w:val="22"/>
+                <w:szCs w:val="22"/>
+              </w:rPr>
+              <w:t>{{ fecha_artigas }}</w:t>
             </w:r>
           </w:p>
         </w:tc>
@@ -5901,7 +5428,6 @@
                 <w:lang w:val="en-US"/>
               </w:rPr>
             </w:pPr>
-            <w:proofErr w:type="gramStart"/>
             <w:r>
               <w:rPr>
                 <w:rFonts w:ascii="Segoe UI" w:hAnsi="Segoe UI" w:cs="Segoe UI"/>
@@ -5911,9 +5437,8 @@
                 <w:szCs w:val="22"/>
                 <w:lang w:val="en-US"/>
               </w:rPr>
-              <w:t>{{ diagnostico</w:t>
-            </w:r>
-            <w:proofErr w:type="gramEnd"/>
+              <w:t>{{ diagnostico_</w:t>
+            </w:r>
             <w:r>
               <w:rPr>
                 <w:rFonts w:ascii="Segoe UI" w:hAnsi="Segoe UI" w:cs="Segoe UI"/>
@@ -5923,9 +5448,8 @@
                 <w:szCs w:val="22"/>
                 <w:lang w:val="en-US"/>
               </w:rPr>
-              <w:t>_</w:t>
-            </w:r>
-            <w:proofErr w:type="gramStart"/>
+              <w:t>cuareim</w:t>
+            </w:r>
             <w:r>
               <w:rPr>
                 <w:rFonts w:ascii="Segoe UI" w:hAnsi="Segoe UI" w:cs="Segoe UI"/>
@@ -5935,30 +5459,7 @@
                 <w:szCs w:val="22"/>
                 <w:lang w:val="en-US"/>
               </w:rPr>
-              <w:t>cuareim</w:t>
-            </w:r>
-            <w:r>
-              <w:rPr>
-                <w:rFonts w:ascii="Segoe UI" w:hAnsi="Segoe UI" w:cs="Segoe UI"/>
-                <w:b w:val="0"/>
-                <w:bCs w:val="0"/>
-                <w:sz w:val="22"/>
-                <w:szCs w:val="22"/>
-                <w:lang w:val="en-US"/>
-              </w:rPr>
-              <w:t xml:space="preserve"> }</w:t>
-            </w:r>
-            <w:proofErr w:type="gramEnd"/>
-            <w:r>
-              <w:rPr>
-                <w:rFonts w:ascii="Segoe UI" w:hAnsi="Segoe UI" w:cs="Segoe UI"/>
-                <w:b w:val="0"/>
-                <w:bCs w:val="0"/>
-                <w:sz w:val="22"/>
-                <w:szCs w:val="22"/>
-                <w:lang w:val="en-US"/>
-              </w:rPr>
-              <w:t>}</w:t>
+              <w:t xml:space="preserve"> }}</w:t>
             </w:r>
           </w:p>
           <w:p>
@@ -6028,7 +5529,6 @@
                 <w:lang w:val="en-US"/>
               </w:rPr>
             </w:pPr>
-            <w:proofErr w:type="gramStart"/>
             <w:r>
               <w:rPr>
                 <w:rFonts w:ascii="Segoe UI" w:hAnsi="Segoe UI" w:cs="Segoe UI"/>
@@ -6038,19 +5538,7 @@
                 <w:szCs w:val="22"/>
                 <w:lang w:val="en-US"/>
               </w:rPr>
-              <w:t>{{ recomendacion</w:t>
-            </w:r>
-            <w:proofErr w:type="gramEnd"/>
-            <w:r>
-              <w:rPr>
-                <w:rFonts w:ascii="Segoe UI" w:hAnsi="Segoe UI" w:cs="Segoe UI"/>
-                <w:b w:val="0"/>
-                <w:bCs w:val="0"/>
-                <w:sz w:val="22"/>
-                <w:szCs w:val="22"/>
-                <w:lang w:val="en-US"/>
-              </w:rPr>
-              <w:t>_</w:t>
+              <w:t>{{ recomendacion_</w:t>
             </w:r>
             <w:r>
               <w:rPr>
@@ -6540,23 +6028,13 @@
                 <w:szCs w:val="22"/>
               </w:rPr>
             </w:pPr>
-            <w:proofErr w:type="gramStart"/>
-            <w:r>
-              <w:rPr>
-                <w:rFonts w:ascii="Segoe UI" w:hAnsi="Segoe UI" w:cs="Segoe UI"/>
-                <w:sz w:val="22"/>
-                <w:szCs w:val="22"/>
-              </w:rPr>
-              <w:t>{{ nivel</w:t>
-            </w:r>
-            <w:proofErr w:type="gramEnd"/>
-            <w:r>
-              <w:rPr>
-                <w:rFonts w:ascii="Segoe UI" w:hAnsi="Segoe UI" w:cs="Segoe UI"/>
-                <w:sz w:val="22"/>
-                <w:szCs w:val="22"/>
-              </w:rPr>
-              <w:t>_actual_fmarcos }}</w:t>
+            <w:r>
+              <w:rPr>
+                <w:rFonts w:ascii="Segoe UI" w:hAnsi="Segoe UI" w:cs="Segoe UI"/>
+                <w:sz w:val="22"/>
+                <w:szCs w:val="22"/>
+              </w:rPr>
+              <w:t>{{ nivel_actual_fmarcos }}</w:t>
             </w:r>
           </w:p>
         </w:tc>
@@ -6575,23 +6053,13 @@
                 <w:szCs w:val="22"/>
               </w:rPr>
             </w:pPr>
-            <w:proofErr w:type="gramStart"/>
-            <w:r>
-              <w:rPr>
-                <w:rFonts w:ascii="Segoe UI" w:hAnsi="Segoe UI" w:cs="Segoe UI"/>
-                <w:sz w:val="22"/>
-                <w:szCs w:val="22"/>
-              </w:rPr>
-              <w:t>{{ tasa</w:t>
-            </w:r>
-            <w:proofErr w:type="gramEnd"/>
-            <w:r>
-              <w:rPr>
-                <w:rFonts w:ascii="Segoe UI" w:hAnsi="Segoe UI" w:cs="Segoe UI"/>
-                <w:sz w:val="22"/>
-                <w:szCs w:val="22"/>
-              </w:rPr>
-              <w:t>_fmarcos }}</w:t>
+            <w:r>
+              <w:rPr>
+                <w:rFonts w:ascii="Segoe UI" w:hAnsi="Segoe UI" w:cs="Segoe UI"/>
+                <w:sz w:val="22"/>
+                <w:szCs w:val="22"/>
+              </w:rPr>
+              <w:t>{{ tasa_fmarcos }}</w:t>
             </w:r>
           </w:p>
         </w:tc>
@@ -6610,23 +6078,13 @@
                 <w:szCs w:val="22"/>
               </w:rPr>
             </w:pPr>
-            <w:proofErr w:type="gramStart"/>
-            <w:r>
-              <w:rPr>
-                <w:rFonts w:ascii="Segoe UI" w:hAnsi="Segoe UI" w:cs="Segoe UI"/>
-                <w:sz w:val="22"/>
-                <w:szCs w:val="22"/>
-              </w:rPr>
-              <w:t>{{ tendencia</w:t>
-            </w:r>
-            <w:proofErr w:type="gramEnd"/>
-            <w:r>
-              <w:rPr>
-                <w:rFonts w:ascii="Segoe UI" w:hAnsi="Segoe UI" w:cs="Segoe UI"/>
-                <w:sz w:val="22"/>
-                <w:szCs w:val="22"/>
-              </w:rPr>
-              <w:t>_fmarcos }}</w:t>
+            <w:r>
+              <w:rPr>
+                <w:rFonts w:ascii="Segoe UI" w:hAnsi="Segoe UI" w:cs="Segoe UI"/>
+                <w:sz w:val="22"/>
+                <w:szCs w:val="22"/>
+              </w:rPr>
+              <w:t>{{ tendencia_fmarcos }}</w:t>
             </w:r>
           </w:p>
         </w:tc>
@@ -6698,23 +6156,13 @@
                 <w:szCs w:val="22"/>
               </w:rPr>
             </w:pPr>
-            <w:proofErr w:type="gramStart"/>
-            <w:r>
-              <w:rPr>
-                <w:rFonts w:ascii="Segoe UI" w:hAnsi="Segoe UI" w:cs="Segoe UI"/>
-                <w:sz w:val="22"/>
-                <w:szCs w:val="22"/>
-              </w:rPr>
-              <w:t>{{ nivel</w:t>
-            </w:r>
-            <w:proofErr w:type="gramEnd"/>
-            <w:r>
-              <w:rPr>
-                <w:rFonts w:ascii="Segoe UI" w:hAnsi="Segoe UI" w:cs="Segoe UI"/>
-                <w:sz w:val="22"/>
-                <w:szCs w:val="22"/>
-              </w:rPr>
-              <w:t>_actual_pache }}</w:t>
+            <w:r>
+              <w:rPr>
+                <w:rFonts w:ascii="Segoe UI" w:hAnsi="Segoe UI" w:cs="Segoe UI"/>
+                <w:sz w:val="22"/>
+                <w:szCs w:val="22"/>
+              </w:rPr>
+              <w:t>{{ nivel_actual_pache }}</w:t>
             </w:r>
           </w:p>
         </w:tc>
@@ -6733,23 +6181,13 @@
                 <w:szCs w:val="22"/>
               </w:rPr>
             </w:pPr>
-            <w:proofErr w:type="gramStart"/>
-            <w:r>
-              <w:rPr>
-                <w:rFonts w:ascii="Segoe UI" w:hAnsi="Segoe UI" w:cs="Segoe UI"/>
-                <w:sz w:val="22"/>
-                <w:szCs w:val="22"/>
-              </w:rPr>
-              <w:t>{{ tasa</w:t>
-            </w:r>
-            <w:proofErr w:type="gramEnd"/>
-            <w:r>
-              <w:rPr>
-                <w:rFonts w:ascii="Segoe UI" w:hAnsi="Segoe UI" w:cs="Segoe UI"/>
-                <w:sz w:val="22"/>
-                <w:szCs w:val="22"/>
-              </w:rPr>
-              <w:t>_pache }}</w:t>
+            <w:r>
+              <w:rPr>
+                <w:rFonts w:ascii="Segoe UI" w:hAnsi="Segoe UI" w:cs="Segoe UI"/>
+                <w:sz w:val="22"/>
+                <w:szCs w:val="22"/>
+              </w:rPr>
+              <w:t>{{ tasa_pache }}</w:t>
             </w:r>
           </w:p>
         </w:tc>
@@ -6768,23 +6206,13 @@
                 <w:szCs w:val="22"/>
               </w:rPr>
             </w:pPr>
-            <w:proofErr w:type="gramStart"/>
-            <w:r>
-              <w:rPr>
-                <w:rFonts w:ascii="Segoe UI" w:hAnsi="Segoe UI" w:cs="Segoe UI"/>
-                <w:sz w:val="22"/>
-                <w:szCs w:val="22"/>
-              </w:rPr>
-              <w:t>{{ tendencia</w:t>
-            </w:r>
-            <w:proofErr w:type="gramEnd"/>
-            <w:r>
-              <w:rPr>
-                <w:rFonts w:ascii="Segoe UI" w:hAnsi="Segoe UI" w:cs="Segoe UI"/>
-                <w:sz w:val="22"/>
-                <w:szCs w:val="22"/>
-              </w:rPr>
-              <w:t>_pache }}</w:t>
+            <w:r>
+              <w:rPr>
+                <w:rFonts w:ascii="Segoe UI" w:hAnsi="Segoe UI" w:cs="Segoe UI"/>
+                <w:sz w:val="22"/>
+                <w:szCs w:val="22"/>
+              </w:rPr>
+              <w:t>{{ tendencia_pache }}</w:t>
             </w:r>
           </w:p>
         </w:tc>
@@ -6855,23 +6283,13 @@
                 <w:szCs w:val="22"/>
               </w:rPr>
             </w:pPr>
-            <w:proofErr w:type="gramStart"/>
-            <w:r>
-              <w:rPr>
-                <w:rFonts w:ascii="Segoe UI" w:hAnsi="Segoe UI" w:cs="Segoe UI"/>
-                <w:sz w:val="22"/>
-                <w:szCs w:val="22"/>
-              </w:rPr>
-              <w:t>{{ nivel</w:t>
-            </w:r>
-            <w:proofErr w:type="gramEnd"/>
-            <w:r>
-              <w:rPr>
-                <w:rFonts w:ascii="Segoe UI" w:hAnsi="Segoe UI" w:cs="Segoe UI"/>
-                <w:sz w:val="22"/>
-                <w:szCs w:val="22"/>
-              </w:rPr>
-              <w:t>_actual_</w:t>
+            <w:r>
+              <w:rPr>
+                <w:rFonts w:ascii="Segoe UI" w:hAnsi="Segoe UI" w:cs="Segoe UI"/>
+                <w:sz w:val="22"/>
+                <w:szCs w:val="22"/>
+              </w:rPr>
+              <w:t>{{ nivel_actual_</w:t>
             </w:r>
             <w:r>
               <w:rPr>
@@ -6905,23 +6323,13 @@
                 <w:szCs w:val="22"/>
               </w:rPr>
             </w:pPr>
-            <w:proofErr w:type="gramStart"/>
-            <w:r>
-              <w:rPr>
-                <w:rFonts w:ascii="Segoe UI" w:hAnsi="Segoe UI" w:cs="Segoe UI"/>
-                <w:sz w:val="22"/>
-                <w:szCs w:val="22"/>
-              </w:rPr>
-              <w:t>{{ tasa</w:t>
-            </w:r>
-            <w:proofErr w:type="gramEnd"/>
-            <w:r>
-              <w:rPr>
-                <w:rFonts w:ascii="Segoe UI" w:hAnsi="Segoe UI" w:cs="Segoe UI"/>
-                <w:sz w:val="22"/>
-                <w:szCs w:val="22"/>
-              </w:rPr>
-              <w:t>_</w:t>
+            <w:r>
+              <w:rPr>
+                <w:rFonts w:ascii="Segoe UI" w:hAnsi="Segoe UI" w:cs="Segoe UI"/>
+                <w:sz w:val="22"/>
+                <w:szCs w:val="22"/>
+              </w:rPr>
+              <w:t>{{ tasa_</w:t>
             </w:r>
             <w:r>
               <w:rPr>
@@ -6956,23 +6364,13 @@
                 <w:szCs w:val="22"/>
               </w:rPr>
             </w:pPr>
-            <w:proofErr w:type="gramStart"/>
-            <w:r>
-              <w:rPr>
-                <w:rFonts w:ascii="Segoe UI" w:hAnsi="Segoe UI" w:cs="Segoe UI"/>
-                <w:sz w:val="22"/>
-                <w:szCs w:val="22"/>
-              </w:rPr>
-              <w:t>{{ tendencia</w:t>
-            </w:r>
-            <w:proofErr w:type="gramEnd"/>
-            <w:r>
-              <w:rPr>
-                <w:rFonts w:ascii="Segoe UI" w:hAnsi="Segoe UI" w:cs="Segoe UI"/>
-                <w:sz w:val="22"/>
-                <w:szCs w:val="22"/>
-              </w:rPr>
-              <w:t>_</w:t>
+            <w:r>
+              <w:rPr>
+                <w:rFonts w:ascii="Segoe UI" w:hAnsi="Segoe UI" w:cs="Segoe UI"/>
+                <w:sz w:val="22"/>
+                <w:szCs w:val="22"/>
+              </w:rPr>
+              <w:t>{{ tendencia_</w:t>
             </w:r>
             <w:r>
               <w:rPr>
@@ -7060,23 +6458,13 @@
                 <w:szCs w:val="22"/>
               </w:rPr>
             </w:pPr>
-            <w:proofErr w:type="gramStart"/>
-            <w:r>
-              <w:rPr>
-                <w:rFonts w:ascii="Segoe UI" w:hAnsi="Segoe UI" w:cs="Segoe UI"/>
-                <w:sz w:val="22"/>
-                <w:szCs w:val="22"/>
-              </w:rPr>
-              <w:t>{{ nivel</w:t>
-            </w:r>
-            <w:proofErr w:type="gramEnd"/>
-            <w:r>
-              <w:rPr>
-                <w:rFonts w:ascii="Segoe UI" w:hAnsi="Segoe UI" w:cs="Segoe UI"/>
-                <w:sz w:val="22"/>
-                <w:szCs w:val="22"/>
-              </w:rPr>
-              <w:t>_actual_florida }}</w:t>
+            <w:r>
+              <w:rPr>
+                <w:rFonts w:ascii="Segoe UI" w:hAnsi="Segoe UI" w:cs="Segoe UI"/>
+                <w:sz w:val="22"/>
+                <w:szCs w:val="22"/>
+              </w:rPr>
+              <w:t>{{ nivel_actual_florida }}</w:t>
             </w:r>
           </w:p>
         </w:tc>
@@ -7095,23 +6483,13 @@
                 <w:szCs w:val="22"/>
               </w:rPr>
             </w:pPr>
-            <w:proofErr w:type="gramStart"/>
-            <w:r>
-              <w:rPr>
-                <w:rFonts w:ascii="Segoe UI" w:hAnsi="Segoe UI" w:cs="Segoe UI"/>
-                <w:sz w:val="22"/>
-                <w:szCs w:val="22"/>
-              </w:rPr>
-              <w:t>{{ tasa</w:t>
-            </w:r>
-            <w:proofErr w:type="gramEnd"/>
-            <w:r>
-              <w:rPr>
-                <w:rFonts w:ascii="Segoe UI" w:hAnsi="Segoe UI" w:cs="Segoe UI"/>
-                <w:sz w:val="22"/>
-                <w:szCs w:val="22"/>
-              </w:rPr>
-              <w:t>_florida }}</w:t>
+            <w:r>
+              <w:rPr>
+                <w:rFonts w:ascii="Segoe UI" w:hAnsi="Segoe UI" w:cs="Segoe UI"/>
+                <w:sz w:val="22"/>
+                <w:szCs w:val="22"/>
+              </w:rPr>
+              <w:t>{{ tasa_florida }}</w:t>
             </w:r>
           </w:p>
         </w:tc>
@@ -7130,23 +6508,13 @@
                 <w:szCs w:val="22"/>
               </w:rPr>
             </w:pPr>
-            <w:proofErr w:type="gramStart"/>
-            <w:r>
-              <w:rPr>
-                <w:rFonts w:ascii="Segoe UI" w:hAnsi="Segoe UI" w:cs="Segoe UI"/>
-                <w:sz w:val="22"/>
-                <w:szCs w:val="22"/>
-              </w:rPr>
-              <w:t>{{ tendencia</w:t>
-            </w:r>
-            <w:proofErr w:type="gramEnd"/>
-            <w:r>
-              <w:rPr>
-                <w:rFonts w:ascii="Segoe UI" w:hAnsi="Segoe UI" w:cs="Segoe UI"/>
-                <w:sz w:val="22"/>
-                <w:szCs w:val="22"/>
-              </w:rPr>
-              <w:t>_florida }}</w:t>
+            <w:r>
+              <w:rPr>
+                <w:rFonts w:ascii="Segoe UI" w:hAnsi="Segoe UI" w:cs="Segoe UI"/>
+                <w:sz w:val="22"/>
+                <w:szCs w:val="22"/>
+              </w:rPr>
+              <w:t>{{ tendencia_florida }}</w:t>
             </w:r>
           </w:p>
         </w:tc>
@@ -7218,23 +6586,13 @@
                 <w:szCs w:val="22"/>
               </w:rPr>
             </w:pPr>
-            <w:proofErr w:type="gramStart"/>
-            <w:r>
-              <w:rPr>
-                <w:rFonts w:ascii="Segoe UI" w:hAnsi="Segoe UI" w:cs="Segoe UI"/>
-                <w:sz w:val="22"/>
-                <w:szCs w:val="22"/>
-              </w:rPr>
-              <w:t>{{ nivel</w:t>
-            </w:r>
-            <w:proofErr w:type="gramEnd"/>
-            <w:r>
-              <w:rPr>
-                <w:rFonts w:ascii="Segoe UI" w:hAnsi="Segoe UI" w:cs="Segoe UI"/>
-                <w:sz w:val="22"/>
-                <w:szCs w:val="22"/>
-              </w:rPr>
-              <w:t>_actual_lucia }}</w:t>
+            <w:r>
+              <w:rPr>
+                <w:rFonts w:ascii="Segoe UI" w:hAnsi="Segoe UI" w:cs="Segoe UI"/>
+                <w:sz w:val="22"/>
+                <w:szCs w:val="22"/>
+              </w:rPr>
+              <w:t>{{ nivel_actual_lucia }}</w:t>
             </w:r>
           </w:p>
         </w:tc>
@@ -7253,23 +6611,13 @@
                 <w:szCs w:val="22"/>
               </w:rPr>
             </w:pPr>
-            <w:proofErr w:type="gramStart"/>
-            <w:r>
-              <w:rPr>
-                <w:rFonts w:ascii="Segoe UI" w:hAnsi="Segoe UI" w:cs="Segoe UI"/>
-                <w:sz w:val="22"/>
-                <w:szCs w:val="22"/>
-              </w:rPr>
-              <w:t>{{ tasa</w:t>
-            </w:r>
-            <w:proofErr w:type="gramEnd"/>
-            <w:r>
-              <w:rPr>
-                <w:rFonts w:ascii="Segoe UI" w:hAnsi="Segoe UI" w:cs="Segoe UI"/>
-                <w:sz w:val="22"/>
-                <w:szCs w:val="22"/>
-              </w:rPr>
-              <w:t>_lucia }}</w:t>
+            <w:r>
+              <w:rPr>
+                <w:rFonts w:ascii="Segoe UI" w:hAnsi="Segoe UI" w:cs="Segoe UI"/>
+                <w:sz w:val="22"/>
+                <w:szCs w:val="22"/>
+              </w:rPr>
+              <w:t>{{ tasa_lucia }}</w:t>
             </w:r>
           </w:p>
         </w:tc>
@@ -7288,23 +6636,13 @@
                 <w:szCs w:val="22"/>
               </w:rPr>
             </w:pPr>
-            <w:proofErr w:type="gramStart"/>
-            <w:r>
-              <w:rPr>
-                <w:rFonts w:ascii="Segoe UI" w:hAnsi="Segoe UI" w:cs="Segoe UI"/>
-                <w:sz w:val="22"/>
-                <w:szCs w:val="22"/>
-              </w:rPr>
-              <w:t>{{ tendencia</w:t>
-            </w:r>
-            <w:proofErr w:type="gramEnd"/>
-            <w:r>
-              <w:rPr>
-                <w:rFonts w:ascii="Segoe UI" w:hAnsi="Segoe UI" w:cs="Segoe UI"/>
-                <w:sz w:val="22"/>
-                <w:szCs w:val="22"/>
-              </w:rPr>
-              <w:t>_lucia }}</w:t>
+            <w:r>
+              <w:rPr>
+                <w:rFonts w:ascii="Segoe UI" w:hAnsi="Segoe UI" w:cs="Segoe UI"/>
+                <w:sz w:val="22"/>
+                <w:szCs w:val="22"/>
+              </w:rPr>
+              <w:t>{{ tendencia_lucia }}</w:t>
             </w:r>
           </w:p>
         </w:tc>
@@ -7477,31 +6815,8 @@
                 <w:sz w:val="22"/>
                 <w:szCs w:val="22"/>
               </w:rPr>
-              <w:t xml:space="preserve"> </w:t>
-            </w:r>
-            <w:proofErr w:type="gramStart"/>
-            <w:r>
-              <w:rPr>
-                <w:rFonts w:ascii="Segoe UI" w:hAnsi="Segoe UI" w:cs="Segoe UI"/>
-                <w:b w:val="0"/>
-                <w:bCs w:val="0"/>
-                <w:sz w:val="22"/>
-                <w:szCs w:val="22"/>
-              </w:rPr>
-              <w:t>{{ pobs</w:t>
-            </w:r>
-            <w:proofErr w:type="gramEnd"/>
-            <w:r>
-              <w:rPr>
-                <w:rFonts w:ascii="Segoe UI" w:hAnsi="Segoe UI" w:cs="Segoe UI"/>
-                <w:b w:val="0"/>
-                <w:bCs w:val="0"/>
-                <w:sz w:val="22"/>
-                <w:szCs w:val="22"/>
-              </w:rPr>
-              <w:t>_24_</w:t>
-            </w:r>
-            <w:proofErr w:type="gramStart"/>
+              <w:t xml:space="preserve"> {{ pobs_24_</w:t>
+            </w:r>
             <w:r>
               <w:rPr>
                 <w:rFonts w:ascii="Segoe UI" w:hAnsi="Segoe UI" w:cs="Segoe UI"/>
@@ -7520,18 +6835,7 @@
                 <w:sz w:val="22"/>
                 <w:szCs w:val="22"/>
               </w:rPr>
-              <w:t xml:space="preserve"> }</w:t>
-            </w:r>
-            <w:proofErr w:type="gramEnd"/>
-            <w:r>
-              <w:rPr>
-                <w:rFonts w:ascii="Segoe UI" w:hAnsi="Segoe UI" w:cs="Segoe UI"/>
-                <w:b w:val="0"/>
-                <w:bCs w:val="0"/>
-                <w:sz w:val="22"/>
-                <w:szCs w:val="22"/>
-              </w:rPr>
-              <w:t>} mm</w:t>
+              <w:t xml:space="preserve"> }} mm</w:t>
             </w:r>
           </w:p>
           <w:p>
@@ -7575,31 +6879,8 @@
                 <w:sz w:val="22"/>
                 <w:szCs w:val="22"/>
               </w:rPr>
-              <w:t xml:space="preserve"> </w:t>
-            </w:r>
-            <w:proofErr w:type="gramStart"/>
-            <w:r>
-              <w:rPr>
-                <w:rFonts w:ascii="Segoe UI" w:hAnsi="Segoe UI" w:cs="Segoe UI"/>
-                <w:b w:val="0"/>
-                <w:bCs w:val="0"/>
-                <w:sz w:val="22"/>
-                <w:szCs w:val="22"/>
-              </w:rPr>
-              <w:t>{{ pobs</w:t>
-            </w:r>
-            <w:proofErr w:type="gramEnd"/>
-            <w:r>
-              <w:rPr>
-                <w:rFonts w:ascii="Segoe UI" w:hAnsi="Segoe UI" w:cs="Segoe UI"/>
-                <w:b w:val="0"/>
-                <w:bCs w:val="0"/>
-                <w:sz w:val="22"/>
-                <w:szCs w:val="22"/>
-              </w:rPr>
-              <w:t>_48_</w:t>
-            </w:r>
-            <w:proofErr w:type="gramStart"/>
+              <w:t xml:space="preserve"> {{ pobs_48_</w:t>
+            </w:r>
             <w:r>
               <w:rPr>
                 <w:rFonts w:ascii="Segoe UI" w:hAnsi="Segoe UI" w:cs="Segoe UI"/>
@@ -7618,18 +6899,7 @@
                 <w:sz w:val="22"/>
                 <w:szCs w:val="22"/>
               </w:rPr>
-              <w:t xml:space="preserve"> }</w:t>
-            </w:r>
-            <w:proofErr w:type="gramEnd"/>
-            <w:r>
-              <w:rPr>
-                <w:rFonts w:ascii="Segoe UI" w:hAnsi="Segoe UI" w:cs="Segoe UI"/>
-                <w:b w:val="0"/>
-                <w:bCs w:val="0"/>
-                <w:sz w:val="22"/>
-                <w:szCs w:val="22"/>
-              </w:rPr>
-              <w:t>} mm</w:t>
+              <w:t xml:space="preserve"> }} mm</w:t>
             </w:r>
           </w:p>
           <w:p>
@@ -7684,31 +6954,8 @@
                 <w:sz w:val="22"/>
                 <w:szCs w:val="22"/>
               </w:rPr>
-              <w:t xml:space="preserve"> </w:t>
-            </w:r>
-            <w:proofErr w:type="gramStart"/>
-            <w:r>
-              <w:rPr>
-                <w:rFonts w:ascii="Segoe UI" w:hAnsi="Segoe UI" w:cs="Segoe UI"/>
-                <w:b w:val="0"/>
-                <w:bCs w:val="0"/>
-                <w:sz w:val="22"/>
-                <w:szCs w:val="22"/>
-              </w:rPr>
-              <w:t>{{ pobs</w:t>
-            </w:r>
-            <w:proofErr w:type="gramEnd"/>
-            <w:r>
-              <w:rPr>
-                <w:rFonts w:ascii="Segoe UI" w:hAnsi="Segoe UI" w:cs="Segoe UI"/>
-                <w:b w:val="0"/>
-                <w:bCs w:val="0"/>
-                <w:sz w:val="22"/>
-                <w:szCs w:val="22"/>
-              </w:rPr>
-              <w:t>_72_</w:t>
-            </w:r>
-            <w:proofErr w:type="gramStart"/>
+              <w:t xml:space="preserve"> {{ pobs_72_</w:t>
+            </w:r>
             <w:r>
               <w:rPr>
                 <w:rFonts w:ascii="Segoe UI" w:hAnsi="Segoe UI" w:cs="Segoe UI"/>
@@ -7727,18 +6974,7 @@
                 <w:sz w:val="22"/>
                 <w:szCs w:val="22"/>
               </w:rPr>
-              <w:t xml:space="preserve"> }</w:t>
-            </w:r>
-            <w:proofErr w:type="gramEnd"/>
-            <w:r>
-              <w:rPr>
-                <w:rFonts w:ascii="Segoe UI" w:hAnsi="Segoe UI" w:cs="Segoe UI"/>
-                <w:b w:val="0"/>
-                <w:bCs w:val="0"/>
-                <w:sz w:val="22"/>
-                <w:szCs w:val="22"/>
-              </w:rPr>
-              <w:t>} mm</w:t>
+              <w:t xml:space="preserve"> }} mm</w:t>
             </w:r>
           </w:p>
         </w:tc>
@@ -7968,29 +7204,16 @@
               </w:rPr>
               <w:t xml:space="preserve"> </w:t>
             </w:r>
-            <w:proofErr w:type="gramStart"/>
-            <w:r>
-              <w:rPr>
-                <w:rFonts w:ascii="Segoe UI" w:hAnsi="Segoe UI" w:cs="Segoe UI"/>
-                <w:b w:val="0"/>
-                <w:bCs w:val="0"/>
-                <w:sz w:val="22"/>
-                <w:szCs w:val="22"/>
-              </w:rPr>
-              <w:t>{{ psim</w:t>
-            </w:r>
-            <w:proofErr w:type="gramEnd"/>
-            <w:r>
-              <w:rPr>
-                <w:rFonts w:ascii="Segoe UI" w:hAnsi="Segoe UI" w:cs="Segoe UI"/>
-                <w:b w:val="0"/>
-                <w:bCs w:val="0"/>
-                <w:sz w:val="22"/>
-                <w:szCs w:val="22"/>
-              </w:rPr>
-              <w:t>_24_</w:t>
-            </w:r>
-            <w:proofErr w:type="gramStart"/>
+            <w:r>
+              <w:rPr>
+                <w:rFonts w:ascii="Segoe UI" w:hAnsi="Segoe UI" w:cs="Segoe UI"/>
+                <w:b w:val="0"/>
+                <w:bCs w:val="0"/>
+                <w:sz w:val="22"/>
+                <w:szCs w:val="22"/>
+              </w:rPr>
+              <w:t>{{ psim_24_</w:t>
+            </w:r>
             <w:r>
               <w:rPr>
                 <w:rFonts w:ascii="Segoe UI" w:hAnsi="Segoe UI" w:cs="Segoe UI"/>
@@ -8009,18 +7232,7 @@
                 <w:sz w:val="22"/>
                 <w:szCs w:val="22"/>
               </w:rPr>
-              <w:t xml:space="preserve"> }</w:t>
-            </w:r>
-            <w:proofErr w:type="gramEnd"/>
-            <w:r>
-              <w:rPr>
-                <w:rFonts w:ascii="Segoe UI" w:hAnsi="Segoe UI" w:cs="Segoe UI"/>
-                <w:b w:val="0"/>
-                <w:bCs w:val="0"/>
-                <w:sz w:val="22"/>
-                <w:szCs w:val="22"/>
-              </w:rPr>
-              <w:t>} mm</w:t>
+              <w:t xml:space="preserve"> }} mm</w:t>
             </w:r>
           </w:p>
           <w:p>
@@ -8066,29 +7278,16 @@
               </w:rPr>
               <w:t xml:space="preserve"> </w:t>
             </w:r>
-            <w:proofErr w:type="gramStart"/>
-            <w:r>
-              <w:rPr>
-                <w:rFonts w:ascii="Segoe UI" w:hAnsi="Segoe UI" w:cs="Segoe UI"/>
-                <w:b w:val="0"/>
-                <w:bCs w:val="0"/>
-                <w:sz w:val="22"/>
-                <w:szCs w:val="22"/>
-              </w:rPr>
-              <w:t>{{ psim</w:t>
-            </w:r>
-            <w:proofErr w:type="gramEnd"/>
-            <w:r>
-              <w:rPr>
-                <w:rFonts w:ascii="Segoe UI" w:hAnsi="Segoe UI" w:cs="Segoe UI"/>
-                <w:b w:val="0"/>
-                <w:bCs w:val="0"/>
-                <w:sz w:val="22"/>
-                <w:szCs w:val="22"/>
-              </w:rPr>
-              <w:t>_48_</w:t>
-            </w:r>
-            <w:proofErr w:type="gramStart"/>
+            <w:r>
+              <w:rPr>
+                <w:rFonts w:ascii="Segoe UI" w:hAnsi="Segoe UI" w:cs="Segoe UI"/>
+                <w:b w:val="0"/>
+                <w:bCs w:val="0"/>
+                <w:sz w:val="22"/>
+                <w:szCs w:val="22"/>
+              </w:rPr>
+              <w:t>{{ psim_48_</w:t>
+            </w:r>
             <w:r>
               <w:rPr>
                 <w:rFonts w:ascii="Segoe UI" w:hAnsi="Segoe UI" w:cs="Segoe UI"/>
@@ -8107,18 +7306,7 @@
                 <w:sz w:val="22"/>
                 <w:szCs w:val="22"/>
               </w:rPr>
-              <w:t xml:space="preserve"> }</w:t>
-            </w:r>
-            <w:proofErr w:type="gramEnd"/>
-            <w:r>
-              <w:rPr>
-                <w:rFonts w:ascii="Segoe UI" w:hAnsi="Segoe UI" w:cs="Segoe UI"/>
-                <w:b w:val="0"/>
-                <w:bCs w:val="0"/>
-                <w:sz w:val="22"/>
-                <w:szCs w:val="22"/>
-              </w:rPr>
-              <w:t>} mm</w:t>
+              <w:t xml:space="preserve"> }} mm</w:t>
             </w:r>
           </w:p>
           <w:p>
@@ -8162,31 +7350,8 @@
                 <w:sz w:val="22"/>
                 <w:szCs w:val="22"/>
               </w:rPr>
-              <w:t xml:space="preserve"> </w:t>
-            </w:r>
-            <w:proofErr w:type="gramStart"/>
-            <w:r>
-              <w:rPr>
-                <w:rFonts w:ascii="Segoe UI" w:hAnsi="Segoe UI" w:cs="Segoe UI"/>
-                <w:b w:val="0"/>
-                <w:bCs w:val="0"/>
-                <w:sz w:val="22"/>
-                <w:szCs w:val="22"/>
-              </w:rPr>
-              <w:t>{{ psim</w:t>
-            </w:r>
-            <w:proofErr w:type="gramEnd"/>
-            <w:r>
-              <w:rPr>
-                <w:rFonts w:ascii="Segoe UI" w:hAnsi="Segoe UI" w:cs="Segoe UI"/>
-                <w:b w:val="0"/>
-                <w:bCs w:val="0"/>
-                <w:sz w:val="22"/>
-                <w:szCs w:val="22"/>
-              </w:rPr>
-              <w:t>_72_</w:t>
-            </w:r>
-            <w:proofErr w:type="gramStart"/>
+              <w:t xml:space="preserve"> {{ psim_72_</w:t>
+            </w:r>
             <w:r>
               <w:rPr>
                 <w:rFonts w:ascii="Segoe UI" w:hAnsi="Segoe UI" w:cs="Segoe UI"/>
@@ -8205,18 +7370,7 @@
                 <w:sz w:val="22"/>
                 <w:szCs w:val="22"/>
               </w:rPr>
-              <w:t xml:space="preserve"> }</w:t>
-            </w:r>
-            <w:proofErr w:type="gramEnd"/>
-            <w:r>
-              <w:rPr>
-                <w:rFonts w:ascii="Segoe UI" w:hAnsi="Segoe UI" w:cs="Segoe UI"/>
-                <w:b w:val="0"/>
-                <w:bCs w:val="0"/>
-                <w:sz w:val="22"/>
-                <w:szCs w:val="22"/>
-              </w:rPr>
-              <w:t>} mm</w:t>
+              <w:t xml:space="preserve"> }} mm</w:t>
             </w:r>
           </w:p>
         </w:tc>
@@ -8408,23 +7562,13 @@
                 <w:szCs w:val="22"/>
               </w:rPr>
             </w:pPr>
-            <w:proofErr w:type="gramStart"/>
-            <w:r>
-              <w:rPr>
-                <w:rFonts w:ascii="Segoe UI" w:hAnsi="Segoe UI" w:cs="Segoe UI"/>
-                <w:sz w:val="22"/>
-                <w:szCs w:val="22"/>
-              </w:rPr>
-              <w:t>{{ pronos</w:t>
-            </w:r>
-            <w:proofErr w:type="gramEnd"/>
-            <w:r>
-              <w:rPr>
-                <w:rFonts w:ascii="Segoe UI" w:hAnsi="Segoe UI" w:cs="Segoe UI"/>
-                <w:sz w:val="22"/>
-                <w:szCs w:val="22"/>
-              </w:rPr>
-              <w:t>_ramon }}</w:t>
+            <w:r>
+              <w:rPr>
+                <w:rFonts w:ascii="Segoe UI" w:hAnsi="Segoe UI" w:cs="Segoe UI"/>
+                <w:sz w:val="22"/>
+                <w:szCs w:val="22"/>
+              </w:rPr>
+              <w:t>{{ pronos_ramon }}</w:t>
             </w:r>
           </w:p>
         </w:tc>
@@ -8443,23 +7587,13 @@
                 <w:szCs w:val="22"/>
               </w:rPr>
             </w:pPr>
-            <w:proofErr w:type="gramStart"/>
-            <w:r>
-              <w:rPr>
-                <w:rFonts w:ascii="Segoe UI" w:hAnsi="Segoe UI" w:cs="Segoe UI"/>
-                <w:sz w:val="22"/>
-                <w:szCs w:val="22"/>
-              </w:rPr>
-              <w:t>{{ fecha</w:t>
-            </w:r>
-            <w:proofErr w:type="gramEnd"/>
-            <w:r>
-              <w:rPr>
-                <w:rFonts w:ascii="Segoe UI" w:hAnsi="Segoe UI" w:cs="Segoe UI"/>
-                <w:sz w:val="22"/>
-                <w:szCs w:val="22"/>
-              </w:rPr>
-              <w:t>_ramon }}</w:t>
+            <w:r>
+              <w:rPr>
+                <w:rFonts w:ascii="Segoe UI" w:hAnsi="Segoe UI" w:cs="Segoe UI"/>
+                <w:sz w:val="22"/>
+                <w:szCs w:val="22"/>
+              </w:rPr>
+              <w:t>{{ fecha_ramon }}</w:t>
             </w:r>
           </w:p>
         </w:tc>
@@ -8508,23 +7642,13 @@
                 <w:szCs w:val="22"/>
               </w:rPr>
             </w:pPr>
-            <w:proofErr w:type="gramStart"/>
-            <w:r>
-              <w:rPr>
-                <w:rFonts w:ascii="Segoe UI" w:hAnsi="Segoe UI" w:cs="Segoe UI"/>
-                <w:sz w:val="22"/>
-                <w:szCs w:val="22"/>
-              </w:rPr>
-              <w:t>{{ pronos</w:t>
-            </w:r>
-            <w:proofErr w:type="gramEnd"/>
-            <w:r>
-              <w:rPr>
-                <w:rFonts w:ascii="Segoe UI" w:hAnsi="Segoe UI" w:cs="Segoe UI"/>
-                <w:sz w:val="22"/>
-                <w:szCs w:val="22"/>
-              </w:rPr>
-              <w:t>_pache }}</w:t>
+            <w:r>
+              <w:rPr>
+                <w:rFonts w:ascii="Segoe UI" w:hAnsi="Segoe UI" w:cs="Segoe UI"/>
+                <w:sz w:val="22"/>
+                <w:szCs w:val="22"/>
+              </w:rPr>
+              <w:t>{{ pronos_pache }}</w:t>
             </w:r>
           </w:p>
         </w:tc>
@@ -8543,23 +7667,13 @@
                 <w:szCs w:val="22"/>
               </w:rPr>
             </w:pPr>
-            <w:proofErr w:type="gramStart"/>
-            <w:r>
-              <w:rPr>
-                <w:rFonts w:ascii="Segoe UI" w:hAnsi="Segoe UI" w:cs="Segoe UI"/>
-                <w:sz w:val="22"/>
-                <w:szCs w:val="22"/>
-              </w:rPr>
-              <w:t>{{ fecha</w:t>
-            </w:r>
-            <w:proofErr w:type="gramEnd"/>
-            <w:r>
-              <w:rPr>
-                <w:rFonts w:ascii="Segoe UI" w:hAnsi="Segoe UI" w:cs="Segoe UI"/>
-                <w:sz w:val="22"/>
-                <w:szCs w:val="22"/>
-              </w:rPr>
-              <w:t>_pache }}</w:t>
+            <w:r>
+              <w:rPr>
+                <w:rFonts w:ascii="Segoe UI" w:hAnsi="Segoe UI" w:cs="Segoe UI"/>
+                <w:sz w:val="22"/>
+                <w:szCs w:val="22"/>
+              </w:rPr>
+              <w:t>{{ fecha_pache }}</w:t>
             </w:r>
           </w:p>
         </w:tc>
@@ -8608,23 +7722,13 @@
                 <w:szCs w:val="22"/>
               </w:rPr>
             </w:pPr>
-            <w:proofErr w:type="gramStart"/>
-            <w:r>
-              <w:rPr>
-                <w:rFonts w:ascii="Segoe UI" w:hAnsi="Segoe UI" w:cs="Segoe UI"/>
-                <w:sz w:val="22"/>
-                <w:szCs w:val="22"/>
-              </w:rPr>
-              <w:t>{{ pronos</w:t>
-            </w:r>
-            <w:proofErr w:type="gramEnd"/>
-            <w:r>
-              <w:rPr>
-                <w:rFonts w:ascii="Segoe UI" w:hAnsi="Segoe UI" w:cs="Segoe UI"/>
-                <w:sz w:val="22"/>
-                <w:szCs w:val="22"/>
-              </w:rPr>
-              <w:t>_florida }}</w:t>
+            <w:r>
+              <w:rPr>
+                <w:rFonts w:ascii="Segoe UI" w:hAnsi="Segoe UI" w:cs="Segoe UI"/>
+                <w:sz w:val="22"/>
+                <w:szCs w:val="22"/>
+              </w:rPr>
+              <w:t>{{ pronos_florida }}</w:t>
             </w:r>
           </w:p>
         </w:tc>
@@ -8643,23 +7747,13 @@
                 <w:szCs w:val="22"/>
               </w:rPr>
             </w:pPr>
-            <w:proofErr w:type="gramStart"/>
-            <w:r>
-              <w:rPr>
-                <w:rFonts w:ascii="Segoe UI" w:hAnsi="Segoe UI" w:cs="Segoe UI"/>
-                <w:sz w:val="22"/>
-                <w:szCs w:val="22"/>
-              </w:rPr>
-              <w:t>{{ fecha</w:t>
-            </w:r>
-            <w:proofErr w:type="gramEnd"/>
-            <w:r>
-              <w:rPr>
-                <w:rFonts w:ascii="Segoe UI" w:hAnsi="Segoe UI" w:cs="Segoe UI"/>
-                <w:sz w:val="22"/>
-                <w:szCs w:val="22"/>
-              </w:rPr>
-              <w:t>_florida }}</w:t>
+            <w:r>
+              <w:rPr>
+                <w:rFonts w:ascii="Segoe UI" w:hAnsi="Segoe UI" w:cs="Segoe UI"/>
+                <w:sz w:val="22"/>
+                <w:szCs w:val="22"/>
+              </w:rPr>
+              <w:t>{{ fecha_florida }}</w:t>
             </w:r>
           </w:p>
         </w:tc>
@@ -8708,23 +7802,13 @@
                 <w:szCs w:val="22"/>
               </w:rPr>
             </w:pPr>
-            <w:proofErr w:type="gramStart"/>
-            <w:r>
-              <w:rPr>
-                <w:rFonts w:ascii="Segoe UI" w:hAnsi="Segoe UI" w:cs="Segoe UI"/>
-                <w:sz w:val="22"/>
-                <w:szCs w:val="22"/>
-              </w:rPr>
-              <w:t>{{ pronos</w:t>
-            </w:r>
-            <w:proofErr w:type="gramEnd"/>
-            <w:r>
-              <w:rPr>
-                <w:rFonts w:ascii="Segoe UI" w:hAnsi="Segoe UI" w:cs="Segoe UI"/>
-                <w:sz w:val="22"/>
-                <w:szCs w:val="22"/>
-              </w:rPr>
-              <w:t>_canelones }}</w:t>
+            <w:r>
+              <w:rPr>
+                <w:rFonts w:ascii="Segoe UI" w:hAnsi="Segoe UI" w:cs="Segoe UI"/>
+                <w:sz w:val="22"/>
+                <w:szCs w:val="22"/>
+              </w:rPr>
+              <w:t>{{ pronos_canelones }}</w:t>
             </w:r>
           </w:p>
         </w:tc>
@@ -8743,23 +7827,13 @@
                 <w:szCs w:val="22"/>
               </w:rPr>
             </w:pPr>
-            <w:proofErr w:type="gramStart"/>
-            <w:r>
-              <w:rPr>
-                <w:rFonts w:ascii="Segoe UI" w:hAnsi="Segoe UI" w:cs="Segoe UI"/>
-                <w:sz w:val="22"/>
-                <w:szCs w:val="22"/>
-              </w:rPr>
-              <w:t>{{ fecha</w:t>
-            </w:r>
-            <w:proofErr w:type="gramEnd"/>
-            <w:r>
-              <w:rPr>
-                <w:rFonts w:ascii="Segoe UI" w:hAnsi="Segoe UI" w:cs="Segoe UI"/>
-                <w:sz w:val="22"/>
-                <w:szCs w:val="22"/>
-              </w:rPr>
-              <w:t>_canelones }}</w:t>
+            <w:r>
+              <w:rPr>
+                <w:rFonts w:ascii="Segoe UI" w:hAnsi="Segoe UI" w:cs="Segoe UI"/>
+                <w:sz w:val="22"/>
+                <w:szCs w:val="22"/>
+              </w:rPr>
+              <w:t>{{ fecha_canelones }}</w:t>
             </w:r>
           </w:p>
         </w:tc>
@@ -8808,23 +7882,13 @@
                 <w:szCs w:val="22"/>
               </w:rPr>
             </w:pPr>
-            <w:proofErr w:type="gramStart"/>
-            <w:r>
-              <w:rPr>
-                <w:rFonts w:ascii="Segoe UI" w:hAnsi="Segoe UI" w:cs="Segoe UI"/>
-                <w:sz w:val="22"/>
-                <w:szCs w:val="22"/>
-              </w:rPr>
-              <w:t>{{ pronos</w:t>
-            </w:r>
-            <w:proofErr w:type="gramEnd"/>
-            <w:r>
-              <w:rPr>
-                <w:rFonts w:ascii="Segoe UI" w:hAnsi="Segoe UI" w:cs="Segoe UI"/>
-                <w:sz w:val="22"/>
-                <w:szCs w:val="22"/>
-              </w:rPr>
-              <w:t>_santalucia }}</w:t>
+            <w:r>
+              <w:rPr>
+                <w:rFonts w:ascii="Segoe UI" w:hAnsi="Segoe UI" w:cs="Segoe UI"/>
+                <w:sz w:val="22"/>
+                <w:szCs w:val="22"/>
+              </w:rPr>
+              <w:t>{{ pronos_santalucia }}</w:t>
             </w:r>
           </w:p>
         </w:tc>
@@ -8843,23 +7907,13 @@
                 <w:szCs w:val="22"/>
               </w:rPr>
             </w:pPr>
-            <w:proofErr w:type="gramStart"/>
-            <w:r>
-              <w:rPr>
-                <w:rFonts w:ascii="Segoe UI" w:hAnsi="Segoe UI" w:cs="Segoe UI"/>
-                <w:sz w:val="22"/>
-                <w:szCs w:val="22"/>
-              </w:rPr>
-              <w:t>{{ fecha</w:t>
-            </w:r>
-            <w:proofErr w:type="gramEnd"/>
-            <w:r>
-              <w:rPr>
-                <w:rFonts w:ascii="Segoe UI" w:hAnsi="Segoe UI" w:cs="Segoe UI"/>
-                <w:sz w:val="22"/>
-                <w:szCs w:val="22"/>
-              </w:rPr>
-              <w:t>_santalucia }}</w:t>
+            <w:r>
+              <w:rPr>
+                <w:rFonts w:ascii="Segoe UI" w:hAnsi="Segoe UI" w:cs="Segoe UI"/>
+                <w:sz w:val="22"/>
+                <w:szCs w:val="22"/>
+              </w:rPr>
+              <w:t>{{ fecha_santalucia }}</w:t>
             </w:r>
           </w:p>
         </w:tc>
@@ -8916,7 +7970,6 @@
                 <w:lang w:val="en-US"/>
               </w:rPr>
             </w:pPr>
-            <w:proofErr w:type="gramStart"/>
             <w:r>
               <w:rPr>
                 <w:rFonts w:ascii="Segoe UI" w:hAnsi="Segoe UI" w:cs="Segoe UI"/>
@@ -8926,19 +7979,7 @@
                 <w:szCs w:val="22"/>
                 <w:lang w:val="en-US"/>
               </w:rPr>
-              <w:t>{{ diagnostico</w:t>
-            </w:r>
-            <w:proofErr w:type="gramEnd"/>
-            <w:r>
-              <w:rPr>
-                <w:rFonts w:ascii="Segoe UI" w:hAnsi="Segoe UI" w:cs="Segoe UI"/>
-                <w:b w:val="0"/>
-                <w:bCs w:val="0"/>
-                <w:sz w:val="22"/>
-                <w:szCs w:val="22"/>
-                <w:lang w:val="en-US"/>
-              </w:rPr>
-              <w:t>_santalucia }}</w:t>
+              <w:t>{{ diagnostico_santalucia }}</w:t>
             </w:r>
           </w:p>
         </w:tc>
@@ -8995,7 +8036,6 @@
                 <w:lang w:val="en-US"/>
               </w:rPr>
             </w:pPr>
-            <w:proofErr w:type="gramStart"/>
             <w:r>
               <w:rPr>
                 <w:rFonts w:ascii="Segoe UI" w:hAnsi="Segoe UI" w:cs="Segoe UI"/>
@@ -9005,43 +8045,7 @@
                 <w:szCs w:val="22"/>
                 <w:lang w:val="en-US"/>
               </w:rPr>
-              <w:t>{{ recomendacion</w:t>
-            </w:r>
-            <w:proofErr w:type="gramEnd"/>
-            <w:r>
-              <w:rPr>
-                <w:rFonts w:ascii="Segoe UI" w:hAnsi="Segoe UI" w:cs="Segoe UI"/>
-                <w:b w:val="0"/>
-                <w:bCs w:val="0"/>
-                <w:sz w:val="22"/>
-                <w:szCs w:val="22"/>
-                <w:lang w:val="en-US"/>
-              </w:rPr>
-              <w:t>_</w:t>
-            </w:r>
-            <w:proofErr w:type="gramStart"/>
-            <w:r>
-              <w:rPr>
-                <w:rFonts w:ascii="Segoe UI" w:hAnsi="Segoe UI" w:cs="Segoe UI"/>
-                <w:b w:val="0"/>
-                <w:bCs w:val="0"/>
-                <w:sz w:val="22"/>
-                <w:szCs w:val="22"/>
-                <w:lang w:val="en-US"/>
-              </w:rPr>
-              <w:t>santalucia }</w:t>
-            </w:r>
-            <w:proofErr w:type="gramEnd"/>
-            <w:r>
-              <w:rPr>
-                <w:rFonts w:ascii="Segoe UI" w:hAnsi="Segoe UI" w:cs="Segoe UI"/>
-                <w:b w:val="0"/>
-                <w:bCs w:val="0"/>
-                <w:sz w:val="22"/>
-                <w:szCs w:val="22"/>
-                <w:lang w:val="en-US"/>
-              </w:rPr>
-              <w:t>}</w:t>
+              <w:t>{{ recomendacion_santalucia }}</w:t>
             </w:r>
             <w:r>
               <w:rPr>
@@ -9520,23 +8524,13 @@
                 <w:szCs w:val="22"/>
               </w:rPr>
             </w:pPr>
-            <w:proofErr w:type="gramStart"/>
-            <w:r>
-              <w:rPr>
-                <w:rFonts w:ascii="Segoe UI" w:hAnsi="Segoe UI" w:cs="Segoe UI"/>
-                <w:sz w:val="22"/>
-                <w:szCs w:val="22"/>
-              </w:rPr>
-              <w:t>{{ nivel</w:t>
-            </w:r>
-            <w:proofErr w:type="gramEnd"/>
-            <w:r>
-              <w:rPr>
-                <w:rFonts w:ascii="Segoe UI" w:hAnsi="Segoe UI" w:cs="Segoe UI"/>
-                <w:sz w:val="22"/>
-                <w:szCs w:val="22"/>
-              </w:rPr>
-              <w:t>_actual_libres }}</w:t>
+            <w:r>
+              <w:rPr>
+                <w:rFonts w:ascii="Segoe UI" w:hAnsi="Segoe UI" w:cs="Segoe UI"/>
+                <w:sz w:val="22"/>
+                <w:szCs w:val="22"/>
+              </w:rPr>
+              <w:t>{{ nivel_actual_libres }}</w:t>
             </w:r>
           </w:p>
         </w:tc>
@@ -9555,23 +8549,13 @@
                 <w:szCs w:val="22"/>
               </w:rPr>
             </w:pPr>
-            <w:proofErr w:type="gramStart"/>
-            <w:r>
-              <w:rPr>
-                <w:rFonts w:ascii="Segoe UI" w:hAnsi="Segoe UI" w:cs="Segoe UI"/>
-                <w:sz w:val="22"/>
-                <w:szCs w:val="22"/>
-              </w:rPr>
-              <w:t>{{ tasa</w:t>
-            </w:r>
-            <w:proofErr w:type="gramEnd"/>
-            <w:r>
-              <w:rPr>
-                <w:rFonts w:ascii="Segoe UI" w:hAnsi="Segoe UI" w:cs="Segoe UI"/>
-                <w:sz w:val="22"/>
-                <w:szCs w:val="22"/>
-              </w:rPr>
-              <w:t>_libres }}</w:t>
+            <w:r>
+              <w:rPr>
+                <w:rFonts w:ascii="Segoe UI" w:hAnsi="Segoe UI" w:cs="Segoe UI"/>
+                <w:sz w:val="22"/>
+                <w:szCs w:val="22"/>
+              </w:rPr>
+              <w:t>{{ tasa_libres }}</w:t>
             </w:r>
           </w:p>
         </w:tc>
@@ -9590,23 +8574,13 @@
                 <w:szCs w:val="22"/>
               </w:rPr>
             </w:pPr>
-            <w:proofErr w:type="gramStart"/>
-            <w:r>
-              <w:rPr>
-                <w:rFonts w:ascii="Segoe UI" w:hAnsi="Segoe UI" w:cs="Segoe UI"/>
-                <w:sz w:val="22"/>
-                <w:szCs w:val="22"/>
-              </w:rPr>
-              <w:t>{{ tendencia</w:t>
-            </w:r>
-            <w:proofErr w:type="gramEnd"/>
-            <w:r>
-              <w:rPr>
-                <w:rFonts w:ascii="Segoe UI" w:hAnsi="Segoe UI" w:cs="Segoe UI"/>
-                <w:sz w:val="22"/>
-                <w:szCs w:val="22"/>
-              </w:rPr>
-              <w:t>_libres }}</w:t>
+            <w:r>
+              <w:rPr>
+                <w:rFonts w:ascii="Segoe UI" w:hAnsi="Segoe UI" w:cs="Segoe UI"/>
+                <w:sz w:val="22"/>
+                <w:szCs w:val="22"/>
+              </w:rPr>
+              <w:t>{{ tendencia_libres }}</w:t>
             </w:r>
           </w:p>
         </w:tc>
@@ -9678,23 +8652,13 @@
                 <w:szCs w:val="22"/>
               </w:rPr>
             </w:pPr>
-            <w:proofErr w:type="gramStart"/>
-            <w:r>
-              <w:rPr>
-                <w:rFonts w:ascii="Segoe UI" w:hAnsi="Segoe UI" w:cs="Segoe UI"/>
-                <w:sz w:val="22"/>
-                <w:szCs w:val="22"/>
-              </w:rPr>
-              <w:t>{{ nivel</w:t>
-            </w:r>
-            <w:proofErr w:type="gramEnd"/>
-            <w:r>
-              <w:rPr>
-                <w:rFonts w:ascii="Segoe UI" w:hAnsi="Segoe UI" w:cs="Segoe UI"/>
-                <w:sz w:val="22"/>
-                <w:szCs w:val="22"/>
-              </w:rPr>
-              <w:t>_actual_bella }}</w:t>
+            <w:r>
+              <w:rPr>
+                <w:rFonts w:ascii="Segoe UI" w:hAnsi="Segoe UI" w:cs="Segoe UI"/>
+                <w:sz w:val="22"/>
+                <w:szCs w:val="22"/>
+              </w:rPr>
+              <w:t>{{ nivel_actual_bella }}</w:t>
             </w:r>
           </w:p>
         </w:tc>
@@ -9713,23 +8677,13 @@
                 <w:szCs w:val="22"/>
               </w:rPr>
             </w:pPr>
-            <w:proofErr w:type="gramStart"/>
-            <w:r>
-              <w:rPr>
-                <w:rFonts w:ascii="Segoe UI" w:hAnsi="Segoe UI" w:cs="Segoe UI"/>
-                <w:sz w:val="22"/>
-                <w:szCs w:val="22"/>
-              </w:rPr>
-              <w:t>{{ tasa</w:t>
-            </w:r>
-            <w:proofErr w:type="gramEnd"/>
-            <w:r>
-              <w:rPr>
-                <w:rFonts w:ascii="Segoe UI" w:hAnsi="Segoe UI" w:cs="Segoe UI"/>
-                <w:sz w:val="22"/>
-                <w:szCs w:val="22"/>
-              </w:rPr>
-              <w:t>_bella }}</w:t>
+            <w:r>
+              <w:rPr>
+                <w:rFonts w:ascii="Segoe UI" w:hAnsi="Segoe UI" w:cs="Segoe UI"/>
+                <w:sz w:val="22"/>
+                <w:szCs w:val="22"/>
+              </w:rPr>
+              <w:t>{{ tasa_bella }}</w:t>
             </w:r>
           </w:p>
         </w:tc>
@@ -9748,23 +8702,13 @@
                 <w:szCs w:val="22"/>
               </w:rPr>
             </w:pPr>
-            <w:proofErr w:type="gramStart"/>
-            <w:r>
-              <w:rPr>
-                <w:rFonts w:ascii="Segoe UI" w:hAnsi="Segoe UI" w:cs="Segoe UI"/>
-                <w:sz w:val="22"/>
-                <w:szCs w:val="22"/>
-              </w:rPr>
-              <w:t>{{ tendencia</w:t>
-            </w:r>
-            <w:proofErr w:type="gramEnd"/>
-            <w:r>
-              <w:rPr>
-                <w:rFonts w:ascii="Segoe UI" w:hAnsi="Segoe UI" w:cs="Segoe UI"/>
-                <w:sz w:val="22"/>
-                <w:szCs w:val="22"/>
-              </w:rPr>
-              <w:t>_bella }}</w:t>
+            <w:r>
+              <w:rPr>
+                <w:rFonts w:ascii="Segoe UI" w:hAnsi="Segoe UI" w:cs="Segoe UI"/>
+                <w:sz w:val="22"/>
+                <w:szCs w:val="22"/>
+              </w:rPr>
+              <w:t>{{ tendencia_bella }}</w:t>
             </w:r>
           </w:p>
         </w:tc>
@@ -9836,23 +8780,13 @@
                 <w:szCs w:val="22"/>
               </w:rPr>
             </w:pPr>
-            <w:proofErr w:type="gramStart"/>
-            <w:r>
-              <w:rPr>
-                <w:rFonts w:ascii="Segoe UI" w:hAnsi="Segoe UI" w:cs="Segoe UI"/>
-                <w:sz w:val="22"/>
-                <w:szCs w:val="22"/>
-              </w:rPr>
-              <w:t>{{ nivel</w:t>
-            </w:r>
-            <w:proofErr w:type="gramEnd"/>
-            <w:r>
-              <w:rPr>
-                <w:rFonts w:ascii="Segoe UI" w:hAnsi="Segoe UI" w:cs="Segoe UI"/>
-                <w:sz w:val="22"/>
-                <w:szCs w:val="22"/>
-              </w:rPr>
-              <w:t>_actual_salto }}</w:t>
+            <w:r>
+              <w:rPr>
+                <w:rFonts w:ascii="Segoe UI" w:hAnsi="Segoe UI" w:cs="Segoe UI"/>
+                <w:sz w:val="22"/>
+                <w:szCs w:val="22"/>
+              </w:rPr>
+              <w:t>{{ nivel_actual_salto }}</w:t>
             </w:r>
           </w:p>
         </w:tc>
@@ -9871,23 +8805,13 @@
                 <w:szCs w:val="22"/>
               </w:rPr>
             </w:pPr>
-            <w:proofErr w:type="gramStart"/>
-            <w:r>
-              <w:rPr>
-                <w:rFonts w:ascii="Segoe UI" w:hAnsi="Segoe UI" w:cs="Segoe UI"/>
-                <w:sz w:val="22"/>
-                <w:szCs w:val="22"/>
-              </w:rPr>
-              <w:t>{{ tasa</w:t>
-            </w:r>
-            <w:proofErr w:type="gramEnd"/>
-            <w:r>
-              <w:rPr>
-                <w:rFonts w:ascii="Segoe UI" w:hAnsi="Segoe UI" w:cs="Segoe UI"/>
-                <w:sz w:val="22"/>
-                <w:szCs w:val="22"/>
-              </w:rPr>
-              <w:t>_salto }}</w:t>
+            <w:r>
+              <w:rPr>
+                <w:rFonts w:ascii="Segoe UI" w:hAnsi="Segoe UI" w:cs="Segoe UI"/>
+                <w:sz w:val="22"/>
+                <w:szCs w:val="22"/>
+              </w:rPr>
+              <w:t>{{ tasa_salto }}</w:t>
             </w:r>
           </w:p>
         </w:tc>
@@ -9906,23 +8830,13 @@
                 <w:szCs w:val="22"/>
               </w:rPr>
             </w:pPr>
-            <w:proofErr w:type="gramStart"/>
-            <w:r>
-              <w:rPr>
-                <w:rFonts w:ascii="Segoe UI" w:hAnsi="Segoe UI" w:cs="Segoe UI"/>
-                <w:sz w:val="22"/>
-                <w:szCs w:val="22"/>
-              </w:rPr>
-              <w:t>{{ tendencia</w:t>
-            </w:r>
-            <w:proofErr w:type="gramEnd"/>
-            <w:r>
-              <w:rPr>
-                <w:rFonts w:ascii="Segoe UI" w:hAnsi="Segoe UI" w:cs="Segoe UI"/>
-                <w:sz w:val="22"/>
-                <w:szCs w:val="22"/>
-              </w:rPr>
-              <w:t>_salto }}</w:t>
+            <w:r>
+              <w:rPr>
+                <w:rFonts w:ascii="Segoe UI" w:hAnsi="Segoe UI" w:cs="Segoe UI"/>
+                <w:sz w:val="22"/>
+                <w:szCs w:val="22"/>
+              </w:rPr>
+              <w:t>{{ tendencia_salto }}</w:t>
             </w:r>
           </w:p>
         </w:tc>
@@ -9947,7 +8861,23 @@
                 <w:sz w:val="22"/>
                 <w:szCs w:val="22"/>
               </w:rPr>
-              <w:t>12.20</w:t>
+              <w:t>12.</w:t>
+            </w:r>
+            <w:r>
+              <w:rPr>
+                <w:rFonts w:ascii="Segoe UI" w:hAnsi="Segoe UI" w:cs="Segoe UI"/>
+                <w:sz w:val="22"/>
+                <w:szCs w:val="22"/>
+              </w:rPr>
+              <w:t>0</w:t>
+            </w:r>
+            <w:r>
+              <w:rPr>
+                <w:rFonts w:ascii="Segoe UI" w:hAnsi="Segoe UI" w:cs="Segoe UI"/>
+                <w:sz w:val="22"/>
+                <w:szCs w:val="22"/>
+              </w:rPr>
+              <w:t>0</w:t>
             </w:r>
           </w:p>
         </w:tc>
@@ -9994,23 +8924,13 @@
                 <w:szCs w:val="22"/>
               </w:rPr>
             </w:pPr>
-            <w:proofErr w:type="gramStart"/>
-            <w:r>
-              <w:rPr>
-                <w:rFonts w:ascii="Segoe UI" w:hAnsi="Segoe UI" w:cs="Segoe UI"/>
-                <w:sz w:val="22"/>
-                <w:szCs w:val="22"/>
-              </w:rPr>
-              <w:t>{{ nivel</w:t>
-            </w:r>
-            <w:proofErr w:type="gramEnd"/>
-            <w:r>
-              <w:rPr>
-                <w:rFonts w:ascii="Segoe UI" w:hAnsi="Segoe UI" w:cs="Segoe UI"/>
-                <w:sz w:val="22"/>
-                <w:szCs w:val="22"/>
-              </w:rPr>
-              <w:t>_actual_ps }}</w:t>
+            <w:r>
+              <w:rPr>
+                <w:rFonts w:ascii="Segoe UI" w:hAnsi="Segoe UI" w:cs="Segoe UI"/>
+                <w:sz w:val="22"/>
+                <w:szCs w:val="22"/>
+              </w:rPr>
+              <w:t>{{ nivel_actual_ps }}</w:t>
             </w:r>
           </w:p>
         </w:tc>
@@ -10029,23 +8949,13 @@
                 <w:szCs w:val="22"/>
               </w:rPr>
             </w:pPr>
-            <w:proofErr w:type="gramStart"/>
-            <w:r>
-              <w:rPr>
-                <w:rFonts w:ascii="Segoe UI" w:hAnsi="Segoe UI" w:cs="Segoe UI"/>
-                <w:sz w:val="22"/>
-                <w:szCs w:val="22"/>
-              </w:rPr>
-              <w:t>{{ tasa</w:t>
-            </w:r>
-            <w:proofErr w:type="gramEnd"/>
-            <w:r>
-              <w:rPr>
-                <w:rFonts w:ascii="Segoe UI" w:hAnsi="Segoe UI" w:cs="Segoe UI"/>
-                <w:sz w:val="22"/>
-                <w:szCs w:val="22"/>
-              </w:rPr>
-              <w:t>_ps }}</w:t>
+            <w:r>
+              <w:rPr>
+                <w:rFonts w:ascii="Segoe UI" w:hAnsi="Segoe UI" w:cs="Segoe UI"/>
+                <w:sz w:val="22"/>
+                <w:szCs w:val="22"/>
+              </w:rPr>
+              <w:t>{{ tasa_ps }}</w:t>
             </w:r>
           </w:p>
         </w:tc>
@@ -10064,23 +8974,13 @@
                 <w:szCs w:val="22"/>
               </w:rPr>
             </w:pPr>
-            <w:proofErr w:type="gramStart"/>
-            <w:r>
-              <w:rPr>
-                <w:rFonts w:ascii="Segoe UI" w:hAnsi="Segoe UI" w:cs="Segoe UI"/>
-                <w:sz w:val="22"/>
-                <w:szCs w:val="22"/>
-              </w:rPr>
-              <w:t>{{ tendencia</w:t>
-            </w:r>
-            <w:proofErr w:type="gramEnd"/>
-            <w:r>
-              <w:rPr>
-                <w:rFonts w:ascii="Segoe UI" w:hAnsi="Segoe UI" w:cs="Segoe UI"/>
-                <w:sz w:val="22"/>
-                <w:szCs w:val="22"/>
-              </w:rPr>
-              <w:t>_ps }}</w:t>
+            <w:r>
+              <w:rPr>
+                <w:rFonts w:ascii="Segoe UI" w:hAnsi="Segoe UI" w:cs="Segoe UI"/>
+                <w:sz w:val="22"/>
+                <w:szCs w:val="22"/>
+              </w:rPr>
+              <w:t>{{ tendencia_ps }}</w:t>
             </w:r>
           </w:p>
         </w:tc>
@@ -10152,23 +9052,13 @@
                 <w:szCs w:val="22"/>
               </w:rPr>
             </w:pPr>
-            <w:proofErr w:type="gramStart"/>
-            <w:r>
-              <w:rPr>
-                <w:rFonts w:ascii="Segoe UI" w:hAnsi="Segoe UI" w:cs="Segoe UI"/>
-                <w:sz w:val="22"/>
-                <w:szCs w:val="22"/>
-              </w:rPr>
-              <w:t>{{ nivel</w:t>
-            </w:r>
-            <w:proofErr w:type="gramEnd"/>
-            <w:r>
-              <w:rPr>
-                <w:rFonts w:ascii="Segoe UI" w:hAnsi="Segoe UI" w:cs="Segoe UI"/>
-                <w:sz w:val="22"/>
-                <w:szCs w:val="22"/>
-              </w:rPr>
-              <w:t>_actual_bentos }}</w:t>
+            <w:r>
+              <w:rPr>
+                <w:rFonts w:ascii="Segoe UI" w:hAnsi="Segoe UI" w:cs="Segoe UI"/>
+                <w:sz w:val="22"/>
+                <w:szCs w:val="22"/>
+              </w:rPr>
+              <w:t>{{ nivel_actual_bentos }}</w:t>
             </w:r>
           </w:p>
         </w:tc>
@@ -10187,23 +9077,13 @@
                 <w:szCs w:val="22"/>
               </w:rPr>
             </w:pPr>
-            <w:proofErr w:type="gramStart"/>
-            <w:r>
-              <w:rPr>
-                <w:rFonts w:ascii="Segoe UI" w:hAnsi="Segoe UI" w:cs="Segoe UI"/>
-                <w:sz w:val="22"/>
-                <w:szCs w:val="22"/>
-              </w:rPr>
-              <w:t>{{ tasa</w:t>
-            </w:r>
-            <w:proofErr w:type="gramEnd"/>
-            <w:r>
-              <w:rPr>
-                <w:rFonts w:ascii="Segoe UI" w:hAnsi="Segoe UI" w:cs="Segoe UI"/>
-                <w:sz w:val="22"/>
-                <w:szCs w:val="22"/>
-              </w:rPr>
-              <w:t>_bentos }}</w:t>
+            <w:r>
+              <w:rPr>
+                <w:rFonts w:ascii="Segoe UI" w:hAnsi="Segoe UI" w:cs="Segoe UI"/>
+                <w:sz w:val="22"/>
+                <w:szCs w:val="22"/>
+              </w:rPr>
+              <w:t>{{ tasa_bentos }}</w:t>
             </w:r>
           </w:p>
         </w:tc>
@@ -10222,23 +9102,13 @@
                 <w:szCs w:val="22"/>
               </w:rPr>
             </w:pPr>
-            <w:proofErr w:type="gramStart"/>
-            <w:r>
-              <w:rPr>
-                <w:rFonts w:ascii="Segoe UI" w:hAnsi="Segoe UI" w:cs="Segoe UI"/>
-                <w:sz w:val="22"/>
-                <w:szCs w:val="22"/>
-              </w:rPr>
-              <w:t>{{ tendencia</w:t>
-            </w:r>
-            <w:proofErr w:type="gramEnd"/>
-            <w:r>
-              <w:rPr>
-                <w:rFonts w:ascii="Segoe UI" w:hAnsi="Segoe UI" w:cs="Segoe UI"/>
-                <w:sz w:val="22"/>
-                <w:szCs w:val="22"/>
-              </w:rPr>
-              <w:t>_bentos }}</w:t>
+            <w:r>
+              <w:rPr>
+                <w:rFonts w:ascii="Segoe UI" w:hAnsi="Segoe UI" w:cs="Segoe UI"/>
+                <w:sz w:val="22"/>
+                <w:szCs w:val="22"/>
+              </w:rPr>
+              <w:t>{{ tendencia_bentos }}</w:t>
             </w:r>
           </w:p>
         </w:tc>
@@ -10379,7 +9249,6 @@
               </w:rPr>
               <w:t xml:space="preserve"> </w:t>
             </w:r>
-            <w:proofErr w:type="gramStart"/>
             <w:r>
               <w:rPr>
                 <w:rFonts w:ascii="Segoe UI" w:hAnsi="Segoe UI" w:cs="Segoe UI"/>
@@ -10408,50 +9277,17 @@
                 <w:sz w:val="22"/>
                 <w:szCs w:val="22"/>
               </w:rPr>
-              <w:t>q</w:t>
-            </w:r>
-            <w:proofErr w:type="gramEnd"/>
-            <w:r>
-              <w:rPr>
-                <w:rFonts w:ascii="Segoe UI" w:hAnsi="Segoe UI" w:cs="Segoe UI"/>
-                <w:b w:val="0"/>
-                <w:bCs w:val="0"/>
-                <w:sz w:val="22"/>
-                <w:szCs w:val="22"/>
-              </w:rPr>
-              <w:t>_erogado_</w:t>
-            </w:r>
-            <w:proofErr w:type="gramStart"/>
-            <w:r>
-              <w:rPr>
-                <w:rFonts w:ascii="Segoe UI" w:hAnsi="Segoe UI" w:cs="Segoe UI"/>
-                <w:b w:val="0"/>
-                <w:bCs w:val="0"/>
-                <w:sz w:val="22"/>
-                <w:szCs w:val="22"/>
-              </w:rPr>
-              <w:t>ctm</w:t>
-            </w:r>
-            <w:r>
-              <w:rPr>
-                <w:rFonts w:ascii="Segoe UI" w:hAnsi="Segoe UI" w:cs="Segoe UI"/>
-                <w:b w:val="0"/>
-                <w:bCs w:val="0"/>
-                <w:sz w:val="22"/>
-                <w:szCs w:val="22"/>
-              </w:rPr>
-              <w:t xml:space="preserve"> }</w:t>
-            </w:r>
-            <w:proofErr w:type="gramEnd"/>
-            <w:r>
-              <w:rPr>
-                <w:rFonts w:ascii="Segoe UI" w:hAnsi="Segoe UI" w:cs="Segoe UI"/>
-                <w:b w:val="0"/>
-                <w:bCs w:val="0"/>
-                <w:sz w:val="22"/>
-                <w:szCs w:val="22"/>
-              </w:rPr>
-              <w:t>}</w:t>
+              <w:t>q_erogado_ctm</w:t>
+            </w:r>
+            <w:r>
+              <w:rPr>
+                <w:rFonts w:ascii="Segoe UI" w:hAnsi="Segoe UI" w:cs="Segoe UI"/>
+                <w:b w:val="0"/>
+                <w:bCs w:val="0"/>
+                <w:sz w:val="22"/>
+                <w:szCs w:val="22"/>
+              </w:rPr>
+              <w:t xml:space="preserve"> }}</w:t>
             </w:r>
             <w:r>
               <w:rPr>
@@ -10674,23 +9510,13 @@
                 <w:szCs w:val="22"/>
               </w:rPr>
             </w:pPr>
-            <w:proofErr w:type="gramStart"/>
-            <w:r>
-              <w:rPr>
-                <w:rFonts w:ascii="Segoe UI" w:hAnsi="Segoe UI" w:cs="Segoe UI"/>
-                <w:sz w:val="22"/>
-                <w:szCs w:val="22"/>
-              </w:rPr>
-              <w:t>{{ pronos</w:t>
-            </w:r>
-            <w:proofErr w:type="gramEnd"/>
-            <w:r>
-              <w:rPr>
-                <w:rFonts w:ascii="Segoe UI" w:hAnsi="Segoe UI" w:cs="Segoe UI"/>
-                <w:sz w:val="22"/>
-                <w:szCs w:val="22"/>
-              </w:rPr>
-              <w:t>_bellaunion }}</w:t>
+            <w:r>
+              <w:rPr>
+                <w:rFonts w:ascii="Segoe UI" w:hAnsi="Segoe UI" w:cs="Segoe UI"/>
+                <w:sz w:val="22"/>
+                <w:szCs w:val="22"/>
+              </w:rPr>
+              <w:t>{{ pronos_bellaunion }}</w:t>
             </w:r>
           </w:p>
         </w:tc>
@@ -10709,23 +9535,13 @@
                 <w:szCs w:val="22"/>
               </w:rPr>
             </w:pPr>
-            <w:proofErr w:type="gramStart"/>
-            <w:r>
-              <w:rPr>
-                <w:rFonts w:ascii="Segoe UI" w:hAnsi="Segoe UI" w:cs="Segoe UI"/>
-                <w:sz w:val="22"/>
-                <w:szCs w:val="22"/>
-              </w:rPr>
-              <w:t>{{ fecha</w:t>
-            </w:r>
-            <w:proofErr w:type="gramEnd"/>
-            <w:r>
-              <w:rPr>
-                <w:rFonts w:ascii="Segoe UI" w:hAnsi="Segoe UI" w:cs="Segoe UI"/>
-                <w:sz w:val="22"/>
-                <w:szCs w:val="22"/>
-              </w:rPr>
-              <w:t>_bellaunion }}</w:t>
+            <w:r>
+              <w:rPr>
+                <w:rFonts w:ascii="Segoe UI" w:hAnsi="Segoe UI" w:cs="Segoe UI"/>
+                <w:sz w:val="22"/>
+                <w:szCs w:val="22"/>
+              </w:rPr>
+              <w:t>{{ fecha_bellaunion }}</w:t>
             </w:r>
           </w:p>
         </w:tc>
@@ -10774,23 +9590,13 @@
                 <w:szCs w:val="22"/>
               </w:rPr>
             </w:pPr>
-            <w:proofErr w:type="gramStart"/>
-            <w:r>
-              <w:rPr>
-                <w:rFonts w:ascii="Segoe UI" w:hAnsi="Segoe UI" w:cs="Segoe UI"/>
-                <w:sz w:val="22"/>
-                <w:szCs w:val="22"/>
-              </w:rPr>
-              <w:t>{{ pronos</w:t>
-            </w:r>
-            <w:proofErr w:type="gramEnd"/>
-            <w:r>
-              <w:rPr>
-                <w:rFonts w:ascii="Segoe UI" w:hAnsi="Segoe UI" w:cs="Segoe UI"/>
-                <w:sz w:val="22"/>
-                <w:szCs w:val="22"/>
-              </w:rPr>
-              <w:t>_salto }}</w:t>
+            <w:r>
+              <w:rPr>
+                <w:rFonts w:ascii="Segoe UI" w:hAnsi="Segoe UI" w:cs="Segoe UI"/>
+                <w:sz w:val="22"/>
+                <w:szCs w:val="22"/>
+              </w:rPr>
+              <w:t>{{ pronos_salto }}</w:t>
             </w:r>
           </w:p>
         </w:tc>
@@ -10809,23 +9615,13 @@
                 <w:szCs w:val="22"/>
               </w:rPr>
             </w:pPr>
-            <w:proofErr w:type="gramStart"/>
-            <w:r>
-              <w:rPr>
-                <w:rFonts w:ascii="Segoe UI" w:hAnsi="Segoe UI" w:cs="Segoe UI"/>
-                <w:sz w:val="22"/>
-                <w:szCs w:val="22"/>
-              </w:rPr>
-              <w:t>{{ fecha</w:t>
-            </w:r>
-            <w:proofErr w:type="gramEnd"/>
-            <w:r>
-              <w:rPr>
-                <w:rFonts w:ascii="Segoe UI" w:hAnsi="Segoe UI" w:cs="Segoe UI"/>
-                <w:sz w:val="22"/>
-                <w:szCs w:val="22"/>
-              </w:rPr>
-              <w:t>_salto }}</w:t>
+            <w:r>
+              <w:rPr>
+                <w:rFonts w:ascii="Segoe UI" w:hAnsi="Segoe UI" w:cs="Segoe UI"/>
+                <w:sz w:val="22"/>
+                <w:szCs w:val="22"/>
+              </w:rPr>
+              <w:t>{{ fecha_salto }}</w:t>
             </w:r>
           </w:p>
         </w:tc>
@@ -10874,23 +9670,13 @@
                 <w:szCs w:val="22"/>
               </w:rPr>
             </w:pPr>
-            <w:proofErr w:type="gramStart"/>
-            <w:r>
-              <w:rPr>
-                <w:rFonts w:ascii="Segoe UI" w:hAnsi="Segoe UI" w:cs="Segoe UI"/>
-                <w:sz w:val="22"/>
-                <w:szCs w:val="22"/>
-              </w:rPr>
-              <w:t>{{ pronos</w:t>
-            </w:r>
-            <w:proofErr w:type="gramEnd"/>
-            <w:r>
-              <w:rPr>
-                <w:rFonts w:ascii="Segoe UI" w:hAnsi="Segoe UI" w:cs="Segoe UI"/>
-                <w:sz w:val="22"/>
-                <w:szCs w:val="22"/>
-              </w:rPr>
-              <w:t>_paysandu }}</w:t>
+            <w:r>
+              <w:rPr>
+                <w:rFonts w:ascii="Segoe UI" w:hAnsi="Segoe UI" w:cs="Segoe UI"/>
+                <w:sz w:val="22"/>
+                <w:szCs w:val="22"/>
+              </w:rPr>
+              <w:t>{{ pronos_paysandu }}</w:t>
             </w:r>
           </w:p>
         </w:tc>
@@ -10909,23 +9695,13 @@
                 <w:szCs w:val="22"/>
               </w:rPr>
             </w:pPr>
-            <w:proofErr w:type="gramStart"/>
-            <w:r>
-              <w:rPr>
-                <w:rFonts w:ascii="Segoe UI" w:hAnsi="Segoe UI" w:cs="Segoe UI"/>
-                <w:sz w:val="22"/>
-                <w:szCs w:val="22"/>
-              </w:rPr>
-              <w:t>{{ fecha</w:t>
-            </w:r>
-            <w:proofErr w:type="gramEnd"/>
-            <w:r>
-              <w:rPr>
-                <w:rFonts w:ascii="Segoe UI" w:hAnsi="Segoe UI" w:cs="Segoe UI"/>
-                <w:sz w:val="22"/>
-                <w:szCs w:val="22"/>
-              </w:rPr>
-              <w:t>_paysandu }}</w:t>
+            <w:r>
+              <w:rPr>
+                <w:rFonts w:ascii="Segoe UI" w:hAnsi="Segoe UI" w:cs="Segoe UI"/>
+                <w:sz w:val="22"/>
+                <w:szCs w:val="22"/>
+              </w:rPr>
+              <w:t>{{ fecha_paysandu }}</w:t>
             </w:r>
           </w:p>
         </w:tc>
@@ -10974,23 +9750,13 @@
                 <w:szCs w:val="22"/>
               </w:rPr>
             </w:pPr>
-            <w:proofErr w:type="gramStart"/>
-            <w:r>
-              <w:rPr>
-                <w:rFonts w:ascii="Segoe UI" w:hAnsi="Segoe UI" w:cs="Segoe UI"/>
-                <w:sz w:val="22"/>
-                <w:szCs w:val="22"/>
-              </w:rPr>
-              <w:t>{{ pronos</w:t>
-            </w:r>
-            <w:proofErr w:type="gramEnd"/>
-            <w:r>
-              <w:rPr>
-                <w:rFonts w:ascii="Segoe UI" w:hAnsi="Segoe UI" w:cs="Segoe UI"/>
-                <w:sz w:val="22"/>
-                <w:szCs w:val="22"/>
-              </w:rPr>
-              <w:t>_fraybentos }}</w:t>
+            <w:r>
+              <w:rPr>
+                <w:rFonts w:ascii="Segoe UI" w:hAnsi="Segoe UI" w:cs="Segoe UI"/>
+                <w:sz w:val="22"/>
+                <w:szCs w:val="22"/>
+              </w:rPr>
+              <w:t>{{ pronos_fraybentos }}</w:t>
             </w:r>
           </w:p>
         </w:tc>
@@ -11009,23 +9775,13 @@
                 <w:szCs w:val="22"/>
               </w:rPr>
             </w:pPr>
-            <w:proofErr w:type="gramStart"/>
-            <w:r>
-              <w:rPr>
-                <w:rFonts w:ascii="Segoe UI" w:hAnsi="Segoe UI" w:cs="Segoe UI"/>
-                <w:sz w:val="22"/>
-                <w:szCs w:val="22"/>
-              </w:rPr>
-              <w:t>{{ fecha</w:t>
-            </w:r>
-            <w:proofErr w:type="gramEnd"/>
-            <w:r>
-              <w:rPr>
-                <w:rFonts w:ascii="Segoe UI" w:hAnsi="Segoe UI" w:cs="Segoe UI"/>
-                <w:sz w:val="22"/>
-                <w:szCs w:val="22"/>
-              </w:rPr>
-              <w:t>_fraybentos }}</w:t>
+            <w:r>
+              <w:rPr>
+                <w:rFonts w:ascii="Segoe UI" w:hAnsi="Segoe UI" w:cs="Segoe UI"/>
+                <w:sz w:val="22"/>
+                <w:szCs w:val="22"/>
+              </w:rPr>
+              <w:t>{{ fecha_fraybentos }}</w:t>
             </w:r>
           </w:p>
         </w:tc>
@@ -11082,7 +9838,6 @@
                 <w:lang w:val="en-US"/>
               </w:rPr>
             </w:pPr>
-            <w:proofErr w:type="gramStart"/>
             <w:r>
               <w:rPr>
                 <w:rFonts w:ascii="Segoe UI" w:hAnsi="Segoe UI" w:cs="Segoe UI"/>
@@ -11092,19 +9847,7 @@
                 <w:szCs w:val="22"/>
                 <w:lang w:val="en-US"/>
               </w:rPr>
-              <w:t>{{ diagnostico</w:t>
-            </w:r>
-            <w:proofErr w:type="gramEnd"/>
-            <w:r>
-              <w:rPr>
-                <w:rFonts w:ascii="Segoe UI" w:hAnsi="Segoe UI" w:cs="Segoe UI"/>
-                <w:b w:val="0"/>
-                <w:bCs w:val="0"/>
-                <w:sz w:val="22"/>
-                <w:szCs w:val="22"/>
-                <w:lang w:val="en-US"/>
-              </w:rPr>
-              <w:t>_uruguay }}</w:t>
+              <w:t>{{ diagnostico_uruguay }}</w:t>
             </w:r>
           </w:p>
         </w:tc>
@@ -11161,7 +9904,6 @@
                 <w:lang w:val="en-US"/>
               </w:rPr>
             </w:pPr>
-            <w:proofErr w:type="gramStart"/>
             <w:r>
               <w:rPr>
                 <w:rFonts w:ascii="Segoe UI" w:hAnsi="Segoe UI" w:cs="Segoe UI"/>
@@ -11171,43 +9913,7 @@
                 <w:szCs w:val="22"/>
                 <w:lang w:val="en-US"/>
               </w:rPr>
-              <w:t>{{ recomendacion</w:t>
-            </w:r>
-            <w:proofErr w:type="gramEnd"/>
-            <w:r>
-              <w:rPr>
-                <w:rFonts w:ascii="Segoe UI" w:hAnsi="Segoe UI" w:cs="Segoe UI"/>
-                <w:b w:val="0"/>
-                <w:bCs w:val="0"/>
-                <w:sz w:val="22"/>
-                <w:szCs w:val="22"/>
-                <w:lang w:val="en-US"/>
-              </w:rPr>
-              <w:t>_</w:t>
-            </w:r>
-            <w:proofErr w:type="gramStart"/>
-            <w:r>
-              <w:rPr>
-                <w:rFonts w:ascii="Segoe UI" w:hAnsi="Segoe UI" w:cs="Segoe UI"/>
-                <w:b w:val="0"/>
-                <w:bCs w:val="0"/>
-                <w:sz w:val="22"/>
-                <w:szCs w:val="22"/>
-                <w:lang w:val="en-US"/>
-              </w:rPr>
-              <w:t>uruguay }</w:t>
-            </w:r>
-            <w:proofErr w:type="gramEnd"/>
-            <w:r>
-              <w:rPr>
-                <w:rFonts w:ascii="Segoe UI" w:hAnsi="Segoe UI" w:cs="Segoe UI"/>
-                <w:b w:val="0"/>
-                <w:bCs w:val="0"/>
-                <w:sz w:val="22"/>
-                <w:szCs w:val="22"/>
-                <w:lang w:val="en-US"/>
-              </w:rPr>
-              <w:t>}</w:t>
+              <w:t>{{ recomendacion_uruguay }}</w:t>
             </w:r>
             <w:r>
               <w:rPr>
@@ -11672,23 +10378,13 @@
                 <w:szCs w:val="22"/>
               </w:rPr>
             </w:pPr>
-            <w:proofErr w:type="gramStart"/>
-            <w:r>
-              <w:rPr>
-                <w:rFonts w:ascii="Segoe UI" w:hAnsi="Segoe UI" w:cs="Segoe UI"/>
-                <w:sz w:val="22"/>
-                <w:szCs w:val="22"/>
-              </w:rPr>
-              <w:t>{{ nivel</w:t>
-            </w:r>
-            <w:proofErr w:type="gramEnd"/>
-            <w:r>
-              <w:rPr>
-                <w:rFonts w:ascii="Segoe UI" w:hAnsi="Segoe UI" w:cs="Segoe UI"/>
-                <w:sz w:val="22"/>
-                <w:szCs w:val="22"/>
-              </w:rPr>
-              <w:t>_actual_gregorio }}</w:t>
+            <w:r>
+              <w:rPr>
+                <w:rFonts w:ascii="Segoe UI" w:hAnsi="Segoe UI" w:cs="Segoe UI"/>
+                <w:sz w:val="22"/>
+                <w:szCs w:val="22"/>
+              </w:rPr>
+              <w:t>{{ nivel_actual_gregorio }}</w:t>
             </w:r>
           </w:p>
         </w:tc>
@@ -11707,23 +10403,13 @@
                 <w:szCs w:val="22"/>
               </w:rPr>
             </w:pPr>
-            <w:proofErr w:type="gramStart"/>
-            <w:r>
-              <w:rPr>
-                <w:rFonts w:ascii="Segoe UI" w:hAnsi="Segoe UI" w:cs="Segoe UI"/>
-                <w:sz w:val="22"/>
-                <w:szCs w:val="22"/>
-              </w:rPr>
-              <w:t>{{ tasa</w:t>
-            </w:r>
-            <w:proofErr w:type="gramEnd"/>
-            <w:r>
-              <w:rPr>
-                <w:rFonts w:ascii="Segoe UI" w:hAnsi="Segoe UI" w:cs="Segoe UI"/>
-                <w:sz w:val="22"/>
-                <w:szCs w:val="22"/>
-              </w:rPr>
-              <w:t>_gregorio }}</w:t>
+            <w:r>
+              <w:rPr>
+                <w:rFonts w:ascii="Segoe UI" w:hAnsi="Segoe UI" w:cs="Segoe UI"/>
+                <w:sz w:val="22"/>
+                <w:szCs w:val="22"/>
+              </w:rPr>
+              <w:t>{{ tasa_gregorio }}</w:t>
             </w:r>
           </w:p>
         </w:tc>
@@ -11742,23 +10428,13 @@
                 <w:szCs w:val="22"/>
               </w:rPr>
             </w:pPr>
-            <w:proofErr w:type="gramStart"/>
-            <w:r>
-              <w:rPr>
-                <w:rFonts w:ascii="Segoe UI" w:hAnsi="Segoe UI" w:cs="Segoe UI"/>
-                <w:sz w:val="22"/>
-                <w:szCs w:val="22"/>
-              </w:rPr>
-              <w:t>{{ tendencia</w:t>
-            </w:r>
-            <w:proofErr w:type="gramEnd"/>
-            <w:r>
-              <w:rPr>
-                <w:rFonts w:ascii="Segoe UI" w:hAnsi="Segoe UI" w:cs="Segoe UI"/>
-                <w:sz w:val="22"/>
-                <w:szCs w:val="22"/>
-              </w:rPr>
-              <w:t>_gregorio }}</w:t>
+            <w:r>
+              <w:rPr>
+                <w:rFonts w:ascii="Segoe UI" w:hAnsi="Segoe UI" w:cs="Segoe UI"/>
+                <w:sz w:val="22"/>
+                <w:szCs w:val="22"/>
+              </w:rPr>
+              <w:t>{{ tendencia_gregorio }}</w:t>
             </w:r>
           </w:p>
         </w:tc>
@@ -11829,23 +10505,13 @@
                 <w:szCs w:val="22"/>
               </w:rPr>
             </w:pPr>
-            <w:proofErr w:type="gramStart"/>
-            <w:r>
-              <w:rPr>
-                <w:rFonts w:ascii="Segoe UI" w:hAnsi="Segoe UI" w:cs="Segoe UI"/>
-                <w:sz w:val="22"/>
-                <w:szCs w:val="22"/>
-              </w:rPr>
-              <w:t>{{ nivel</w:t>
-            </w:r>
-            <w:proofErr w:type="gramEnd"/>
-            <w:r>
-              <w:rPr>
-                <w:rFonts w:ascii="Segoe UI" w:hAnsi="Segoe UI" w:cs="Segoe UI"/>
-                <w:sz w:val="22"/>
-                <w:szCs w:val="22"/>
-              </w:rPr>
-              <w:t>_actual_mercedes }}</w:t>
+            <w:r>
+              <w:rPr>
+                <w:rFonts w:ascii="Segoe UI" w:hAnsi="Segoe UI" w:cs="Segoe UI"/>
+                <w:sz w:val="22"/>
+                <w:szCs w:val="22"/>
+              </w:rPr>
+              <w:t>{{ nivel_actual_mercedes }}</w:t>
             </w:r>
           </w:p>
         </w:tc>
@@ -11864,23 +10530,13 @@
                 <w:szCs w:val="22"/>
               </w:rPr>
             </w:pPr>
-            <w:proofErr w:type="gramStart"/>
-            <w:r>
-              <w:rPr>
-                <w:rFonts w:ascii="Segoe UI" w:hAnsi="Segoe UI" w:cs="Segoe UI"/>
-                <w:sz w:val="22"/>
-                <w:szCs w:val="22"/>
-              </w:rPr>
-              <w:t>{{ tasa</w:t>
-            </w:r>
-            <w:proofErr w:type="gramEnd"/>
-            <w:r>
-              <w:rPr>
-                <w:rFonts w:ascii="Segoe UI" w:hAnsi="Segoe UI" w:cs="Segoe UI"/>
-                <w:sz w:val="22"/>
-                <w:szCs w:val="22"/>
-              </w:rPr>
-              <w:t>_mercedes }}</w:t>
+            <w:r>
+              <w:rPr>
+                <w:rFonts w:ascii="Segoe UI" w:hAnsi="Segoe UI" w:cs="Segoe UI"/>
+                <w:sz w:val="22"/>
+                <w:szCs w:val="22"/>
+              </w:rPr>
+              <w:t>{{ tasa_mercedes }}</w:t>
             </w:r>
           </w:p>
         </w:tc>
@@ -11899,23 +10555,13 @@
                 <w:szCs w:val="22"/>
               </w:rPr>
             </w:pPr>
-            <w:proofErr w:type="gramStart"/>
-            <w:r>
-              <w:rPr>
-                <w:rFonts w:ascii="Segoe UI" w:hAnsi="Segoe UI" w:cs="Segoe UI"/>
-                <w:sz w:val="22"/>
-                <w:szCs w:val="22"/>
-              </w:rPr>
-              <w:t>{{ tendencia</w:t>
-            </w:r>
-            <w:proofErr w:type="gramEnd"/>
-            <w:r>
-              <w:rPr>
-                <w:rFonts w:ascii="Segoe UI" w:hAnsi="Segoe UI" w:cs="Segoe UI"/>
-                <w:sz w:val="22"/>
-                <w:szCs w:val="22"/>
-              </w:rPr>
-              <w:t>_mercedes }}</w:t>
+            <w:r>
+              <w:rPr>
+                <w:rFonts w:ascii="Segoe UI" w:hAnsi="Segoe UI" w:cs="Segoe UI"/>
+                <w:sz w:val="22"/>
+                <w:szCs w:val="22"/>
+              </w:rPr>
+              <w:t>{{ tendencia_mercedes }}</w:t>
             </w:r>
           </w:p>
         </w:tc>
@@ -12006,49 +10652,15 @@
               </w:rPr>
               <w:t xml:space="preserve">Según el comunicado diario de UTE, se proyecta que los caudales a erogar en las centrales hidroeléctricas de Rincón del Bonete y Constitución oscilen entre </w:t>
             </w:r>
-            <w:proofErr w:type="gramStart"/>
-            <w:r>
-              <w:rPr>
-                <w:rFonts w:ascii="Segoe UI" w:hAnsi="Segoe UI" w:cs="Segoe UI"/>
-                <w:b w:val="0"/>
-                <w:bCs w:val="0"/>
-                <w:sz w:val="22"/>
-                <w:szCs w:val="22"/>
-              </w:rPr>
-              <w:t>{{ q</w:t>
-            </w:r>
-            <w:proofErr w:type="gramEnd"/>
-            <w:r>
-              <w:rPr>
-                <w:rFonts w:ascii="Segoe UI" w:hAnsi="Segoe UI" w:cs="Segoe UI"/>
-                <w:b w:val="0"/>
-                <w:bCs w:val="0"/>
-                <w:sz w:val="22"/>
-                <w:szCs w:val="22"/>
-              </w:rPr>
-              <w:t>_erogado_</w:t>
-            </w:r>
-            <w:proofErr w:type="gramStart"/>
-            <w:r>
-              <w:rPr>
-                <w:rFonts w:ascii="Segoe UI" w:hAnsi="Segoe UI" w:cs="Segoe UI"/>
-                <w:b w:val="0"/>
-                <w:bCs w:val="0"/>
-                <w:sz w:val="22"/>
-                <w:szCs w:val="22"/>
-              </w:rPr>
-              <w:t>bonete }</w:t>
-            </w:r>
-            <w:proofErr w:type="gramEnd"/>
-            <w:r>
-              <w:rPr>
-                <w:rFonts w:ascii="Segoe UI" w:hAnsi="Segoe UI" w:cs="Segoe UI"/>
-                <w:b w:val="0"/>
-                <w:bCs w:val="0"/>
-                <w:sz w:val="22"/>
-                <w:szCs w:val="22"/>
-              </w:rPr>
-              <w:t xml:space="preserve">} </w:t>
+            <w:r>
+              <w:rPr>
+                <w:rFonts w:ascii="Segoe UI" w:hAnsi="Segoe UI" w:cs="Segoe UI"/>
+                <w:b w:val="0"/>
+                <w:bCs w:val="0"/>
+                <w:sz w:val="22"/>
+                <w:szCs w:val="22"/>
+              </w:rPr>
+              <w:t xml:space="preserve">{{ q_erogado_bonete }} </w:t>
             </w:r>
             <w:r>
               <w:rPr>
@@ -12060,49 +10672,15 @@
               </w:rPr>
               <w:t xml:space="preserve">m³/s, y </w:t>
             </w:r>
-            <w:proofErr w:type="gramStart"/>
-            <w:r>
-              <w:rPr>
-                <w:rFonts w:ascii="Segoe UI" w:hAnsi="Segoe UI" w:cs="Segoe UI"/>
-                <w:b w:val="0"/>
-                <w:bCs w:val="0"/>
-                <w:sz w:val="22"/>
-                <w:szCs w:val="22"/>
-              </w:rPr>
-              <w:t>{{ q</w:t>
-            </w:r>
-            <w:proofErr w:type="gramEnd"/>
-            <w:r>
-              <w:rPr>
-                <w:rFonts w:ascii="Segoe UI" w:hAnsi="Segoe UI" w:cs="Segoe UI"/>
-                <w:b w:val="0"/>
-                <w:bCs w:val="0"/>
-                <w:sz w:val="22"/>
-                <w:szCs w:val="22"/>
-              </w:rPr>
-              <w:t>_erogado_</w:t>
-            </w:r>
-            <w:proofErr w:type="gramStart"/>
-            <w:r>
-              <w:rPr>
-                <w:rFonts w:ascii="Segoe UI" w:hAnsi="Segoe UI" w:cs="Segoe UI"/>
-                <w:b w:val="0"/>
-                <w:bCs w:val="0"/>
-                <w:sz w:val="22"/>
-                <w:szCs w:val="22"/>
-              </w:rPr>
-              <w:t>palmar }</w:t>
-            </w:r>
-            <w:proofErr w:type="gramEnd"/>
-            <w:r>
-              <w:rPr>
-                <w:rFonts w:ascii="Segoe UI" w:hAnsi="Segoe UI" w:cs="Segoe UI"/>
-                <w:b w:val="0"/>
-                <w:bCs w:val="0"/>
-                <w:sz w:val="22"/>
-                <w:szCs w:val="22"/>
-              </w:rPr>
-              <w:t xml:space="preserve">} </w:t>
+            <w:r>
+              <w:rPr>
+                <w:rFonts w:ascii="Segoe UI" w:hAnsi="Segoe UI" w:cs="Segoe UI"/>
+                <w:b w:val="0"/>
+                <w:bCs w:val="0"/>
+                <w:sz w:val="22"/>
+                <w:szCs w:val="22"/>
+              </w:rPr>
+              <w:t xml:space="preserve">{{ q_erogado_palmar }} </w:t>
             </w:r>
             <w:r>
               <w:rPr>
@@ -12304,23 +10882,13 @@
                 <w:szCs w:val="22"/>
               </w:rPr>
             </w:pPr>
-            <w:proofErr w:type="gramStart"/>
-            <w:r>
-              <w:rPr>
-                <w:rFonts w:ascii="Segoe UI" w:hAnsi="Segoe UI" w:cs="Segoe UI"/>
-                <w:sz w:val="22"/>
-                <w:szCs w:val="22"/>
-              </w:rPr>
-              <w:t>{{ pronos</w:t>
-            </w:r>
-            <w:proofErr w:type="gramEnd"/>
-            <w:r>
-              <w:rPr>
-                <w:rFonts w:ascii="Segoe UI" w:hAnsi="Segoe UI" w:cs="Segoe UI"/>
-                <w:sz w:val="22"/>
-                <w:szCs w:val="22"/>
-              </w:rPr>
-              <w:t>_gregorio }}</w:t>
+            <w:r>
+              <w:rPr>
+                <w:rFonts w:ascii="Segoe UI" w:hAnsi="Segoe UI" w:cs="Segoe UI"/>
+                <w:sz w:val="22"/>
+                <w:szCs w:val="22"/>
+              </w:rPr>
+              <w:t>{{ pronos_gregorio }}</w:t>
             </w:r>
           </w:p>
         </w:tc>
@@ -12339,23 +10907,13 @@
                 <w:szCs w:val="22"/>
               </w:rPr>
             </w:pPr>
-            <w:proofErr w:type="gramStart"/>
-            <w:r>
-              <w:rPr>
-                <w:rFonts w:ascii="Segoe UI" w:hAnsi="Segoe UI" w:cs="Segoe UI"/>
-                <w:sz w:val="22"/>
-                <w:szCs w:val="22"/>
-              </w:rPr>
-              <w:t>{{ fecha</w:t>
-            </w:r>
-            <w:proofErr w:type="gramEnd"/>
-            <w:r>
-              <w:rPr>
-                <w:rFonts w:ascii="Segoe UI" w:hAnsi="Segoe UI" w:cs="Segoe UI"/>
-                <w:sz w:val="22"/>
-                <w:szCs w:val="22"/>
-              </w:rPr>
-              <w:t>_gregorio }}</w:t>
+            <w:r>
+              <w:rPr>
+                <w:rFonts w:ascii="Segoe UI" w:hAnsi="Segoe UI" w:cs="Segoe UI"/>
+                <w:sz w:val="22"/>
+                <w:szCs w:val="22"/>
+              </w:rPr>
+              <w:t>{{ fecha_gregorio }}</w:t>
             </w:r>
           </w:p>
         </w:tc>
@@ -12404,23 +10962,13 @@
                 <w:szCs w:val="22"/>
               </w:rPr>
             </w:pPr>
-            <w:proofErr w:type="gramStart"/>
-            <w:r>
-              <w:rPr>
-                <w:rFonts w:ascii="Segoe UI" w:hAnsi="Segoe UI" w:cs="Segoe UI"/>
-                <w:sz w:val="22"/>
-                <w:szCs w:val="22"/>
-              </w:rPr>
-              <w:t>{{ pronos</w:t>
-            </w:r>
-            <w:proofErr w:type="gramEnd"/>
-            <w:r>
-              <w:rPr>
-                <w:rFonts w:ascii="Segoe UI" w:hAnsi="Segoe UI" w:cs="Segoe UI"/>
-                <w:sz w:val="22"/>
-                <w:szCs w:val="22"/>
-              </w:rPr>
-              <w:t>_mercedes }}</w:t>
+            <w:r>
+              <w:rPr>
+                <w:rFonts w:ascii="Segoe UI" w:hAnsi="Segoe UI" w:cs="Segoe UI"/>
+                <w:sz w:val="22"/>
+                <w:szCs w:val="22"/>
+              </w:rPr>
+              <w:t>{{ pronos_mercedes }}</w:t>
             </w:r>
           </w:p>
         </w:tc>
@@ -12439,23 +10987,13 @@
                 <w:szCs w:val="22"/>
               </w:rPr>
             </w:pPr>
-            <w:proofErr w:type="gramStart"/>
-            <w:r>
-              <w:rPr>
-                <w:rFonts w:ascii="Segoe UI" w:hAnsi="Segoe UI" w:cs="Segoe UI"/>
-                <w:sz w:val="22"/>
-                <w:szCs w:val="22"/>
-              </w:rPr>
-              <w:t>{{ fecha</w:t>
-            </w:r>
-            <w:proofErr w:type="gramEnd"/>
-            <w:r>
-              <w:rPr>
-                <w:rFonts w:ascii="Segoe UI" w:hAnsi="Segoe UI" w:cs="Segoe UI"/>
-                <w:sz w:val="22"/>
-                <w:szCs w:val="22"/>
-              </w:rPr>
-              <w:t>_mercedes }}</w:t>
+            <w:r>
+              <w:rPr>
+                <w:rFonts w:ascii="Segoe UI" w:hAnsi="Segoe UI" w:cs="Segoe UI"/>
+                <w:sz w:val="22"/>
+                <w:szCs w:val="22"/>
+              </w:rPr>
+              <w:t>{{ fecha_mercedes }}</w:t>
             </w:r>
           </w:p>
         </w:tc>
@@ -12512,7 +11050,6 @@
                 <w:lang w:val="en-US"/>
               </w:rPr>
             </w:pPr>
-            <w:proofErr w:type="gramStart"/>
             <w:r>
               <w:rPr>
                 <w:rFonts w:ascii="Segoe UI" w:hAnsi="Segoe UI" w:cs="Segoe UI"/>
@@ -12522,19 +11059,7 @@
                 <w:szCs w:val="22"/>
                 <w:lang w:val="en-US"/>
               </w:rPr>
-              <w:t>{{ diagnostico</w:t>
-            </w:r>
-            <w:proofErr w:type="gramEnd"/>
-            <w:r>
-              <w:rPr>
-                <w:rFonts w:ascii="Segoe UI" w:hAnsi="Segoe UI" w:cs="Segoe UI"/>
-                <w:b w:val="0"/>
-                <w:bCs w:val="0"/>
-                <w:sz w:val="22"/>
-                <w:szCs w:val="22"/>
-                <w:lang w:val="en-US"/>
-              </w:rPr>
-              <w:t>_negro }}</w:t>
+              <w:t>{{ diagnostico_negro }}</w:t>
             </w:r>
           </w:p>
         </w:tc>
@@ -12591,7 +11116,6 @@
                 <w:lang w:val="en-US"/>
               </w:rPr>
             </w:pPr>
-            <w:proofErr w:type="gramStart"/>
             <w:r>
               <w:rPr>
                 <w:rFonts w:ascii="Segoe UI" w:hAnsi="Segoe UI" w:cs="Segoe UI"/>
@@ -12601,43 +11125,7 @@
                 <w:szCs w:val="22"/>
                 <w:lang w:val="en-US"/>
               </w:rPr>
-              <w:t>{{ recomendacion</w:t>
-            </w:r>
-            <w:proofErr w:type="gramEnd"/>
-            <w:r>
-              <w:rPr>
-                <w:rFonts w:ascii="Segoe UI" w:hAnsi="Segoe UI" w:cs="Segoe UI"/>
-                <w:b w:val="0"/>
-                <w:bCs w:val="0"/>
-                <w:sz w:val="22"/>
-                <w:szCs w:val="22"/>
-                <w:lang w:val="en-US"/>
-              </w:rPr>
-              <w:t>_</w:t>
-            </w:r>
-            <w:proofErr w:type="gramStart"/>
-            <w:r>
-              <w:rPr>
-                <w:rFonts w:ascii="Segoe UI" w:hAnsi="Segoe UI" w:cs="Segoe UI"/>
-                <w:b w:val="0"/>
-                <w:bCs w:val="0"/>
-                <w:sz w:val="22"/>
-                <w:szCs w:val="22"/>
-                <w:lang w:val="en-US"/>
-              </w:rPr>
-              <w:t>negro }</w:t>
-            </w:r>
-            <w:proofErr w:type="gramEnd"/>
-            <w:r>
-              <w:rPr>
-                <w:rFonts w:ascii="Segoe UI" w:hAnsi="Segoe UI" w:cs="Segoe UI"/>
-                <w:b w:val="0"/>
-                <w:bCs w:val="0"/>
-                <w:sz w:val="22"/>
-                <w:szCs w:val="22"/>
-                <w:lang w:val="en-US"/>
-              </w:rPr>
-              <w:t>}</w:t>
+              <w:t>{{ recomendacion_negro }}</w:t>
             </w:r>
             <w:r>
               <w:rPr>
@@ -13238,7 +11726,6 @@
                 <w:lang w:eastAsia="en-US"/>
               </w:rPr>
             </w:pPr>
-            <w:proofErr w:type="gramStart"/>
             <w:r>
               <w:rPr>
                 <w:rFonts w:ascii="Segoe UI" w:hAnsi="Segoe UI" w:cs="Segoe UI"/>
@@ -13246,17 +11733,7 @@
                 <w:szCs w:val="22"/>
                 <w:lang w:eastAsia="en-US"/>
               </w:rPr>
-              <w:t>{{ nivel</w:t>
-            </w:r>
-            <w:proofErr w:type="gramEnd"/>
-            <w:r>
-              <w:rPr>
-                <w:rFonts w:ascii="Segoe UI" w:hAnsi="Segoe UI" w:cs="Segoe UI"/>
-                <w:sz w:val="22"/>
-                <w:szCs w:val="22"/>
-                <w:lang w:eastAsia="en-US"/>
-              </w:rPr>
-              <w:t>_actual_</w:t>
+              <w:t>{{ nivel_actual_</w:t>
             </w:r>
             <w:r>
               <w:rPr>
@@ -13301,7 +11778,6 @@
                 <w:lang w:eastAsia="en-US"/>
               </w:rPr>
             </w:pPr>
-            <w:proofErr w:type="gramStart"/>
             <w:r>
               <w:rPr>
                 <w:rFonts w:ascii="Segoe UI" w:hAnsi="Segoe UI" w:cs="Segoe UI"/>
@@ -13311,7 +11787,6 @@
               </w:rPr>
               <w:t>{{ tasa</w:t>
             </w:r>
-            <w:proofErr w:type="gramEnd"/>
             <w:r>
               <w:rPr>
                 <w:rFonts w:ascii="Segoe UI" w:hAnsi="Segoe UI" w:cs="Segoe UI"/>
@@ -13355,7 +11830,6 @@
                 <w:lang w:eastAsia="en-US"/>
               </w:rPr>
             </w:pPr>
-            <w:proofErr w:type="gramStart"/>
             <w:r>
               <w:rPr>
                 <w:rFonts w:ascii="Segoe UI" w:hAnsi="Segoe UI" w:cs="Segoe UI"/>
@@ -13363,17 +11837,7 @@
                 <w:szCs w:val="22"/>
                 <w:lang w:eastAsia="en-US"/>
               </w:rPr>
-              <w:t>{{ tendencia</w:t>
-            </w:r>
-            <w:proofErr w:type="gramEnd"/>
-            <w:r>
-              <w:rPr>
-                <w:rFonts w:ascii="Segoe UI" w:hAnsi="Segoe UI" w:cs="Segoe UI"/>
-                <w:sz w:val="22"/>
-                <w:szCs w:val="22"/>
-                <w:lang w:eastAsia="en-US"/>
-              </w:rPr>
-              <w:t>_</w:t>
+              <w:t>{{ tendencia_</w:t>
             </w:r>
             <w:r>
               <w:rPr>
@@ -13585,51 +12049,7 @@
                 <w:sz w:val="22"/>
                 <w:szCs w:val="22"/>
               </w:rPr>
-              <w:t xml:space="preserve"> </w:t>
-            </w:r>
-            <w:proofErr w:type="gramStart"/>
-            <w:r>
-              <w:rPr>
-                <w:rFonts w:ascii="Segoe UI" w:hAnsi="Segoe UI" w:cs="Segoe UI"/>
-                <w:b w:val="0"/>
-                <w:bCs w:val="0"/>
-                <w:sz w:val="22"/>
-                <w:szCs w:val="22"/>
-              </w:rPr>
-              <w:t>{{ pobs</w:t>
-            </w:r>
-            <w:proofErr w:type="gramEnd"/>
-            <w:r>
-              <w:rPr>
-                <w:rFonts w:ascii="Segoe UI" w:hAnsi="Segoe UI" w:cs="Segoe UI"/>
-                <w:b w:val="0"/>
-                <w:bCs w:val="0"/>
-                <w:sz w:val="22"/>
-                <w:szCs w:val="22"/>
-              </w:rPr>
-              <w:t>_24_</w:t>
-            </w:r>
-            <w:proofErr w:type="gramStart"/>
-            <w:r>
-              <w:rPr>
-                <w:rFonts w:ascii="Segoe UI" w:hAnsi="Segoe UI" w:cs="Segoe UI"/>
-                <w:b w:val="0"/>
-                <w:bCs w:val="0"/>
-                <w:sz w:val="22"/>
-                <w:szCs w:val="22"/>
-              </w:rPr>
-              <w:t>olimar }</w:t>
-            </w:r>
-            <w:proofErr w:type="gramEnd"/>
-            <w:r>
-              <w:rPr>
-                <w:rFonts w:ascii="Segoe UI" w:hAnsi="Segoe UI" w:cs="Segoe UI"/>
-                <w:b w:val="0"/>
-                <w:bCs w:val="0"/>
-                <w:sz w:val="22"/>
-                <w:szCs w:val="22"/>
-              </w:rPr>
-              <w:t>} mm</w:t>
+              <w:t xml:space="preserve"> {{ pobs_24_olimar }} mm</w:t>
             </w:r>
           </w:p>
           <w:p>
@@ -13674,51 +12094,7 @@
                 <w:sz w:val="22"/>
                 <w:szCs w:val="22"/>
               </w:rPr>
-              <w:t xml:space="preserve"> </w:t>
-            </w:r>
-            <w:proofErr w:type="gramStart"/>
-            <w:r>
-              <w:rPr>
-                <w:rFonts w:ascii="Segoe UI" w:hAnsi="Segoe UI" w:cs="Segoe UI"/>
-                <w:b w:val="0"/>
-                <w:bCs w:val="0"/>
-                <w:sz w:val="22"/>
-                <w:szCs w:val="22"/>
-              </w:rPr>
-              <w:t>{{ pobs</w:t>
-            </w:r>
-            <w:proofErr w:type="gramEnd"/>
-            <w:r>
-              <w:rPr>
-                <w:rFonts w:ascii="Segoe UI" w:hAnsi="Segoe UI" w:cs="Segoe UI"/>
-                <w:b w:val="0"/>
-                <w:bCs w:val="0"/>
-                <w:sz w:val="22"/>
-                <w:szCs w:val="22"/>
-              </w:rPr>
-              <w:t>_48_</w:t>
-            </w:r>
-            <w:proofErr w:type="gramStart"/>
-            <w:r>
-              <w:rPr>
-                <w:rFonts w:ascii="Segoe UI" w:hAnsi="Segoe UI" w:cs="Segoe UI"/>
-                <w:b w:val="0"/>
-                <w:bCs w:val="0"/>
-                <w:sz w:val="22"/>
-                <w:szCs w:val="22"/>
-              </w:rPr>
-              <w:t>olimar }</w:t>
-            </w:r>
-            <w:proofErr w:type="gramEnd"/>
-            <w:r>
-              <w:rPr>
-                <w:rFonts w:ascii="Segoe UI" w:hAnsi="Segoe UI" w:cs="Segoe UI"/>
-                <w:b w:val="0"/>
-                <w:bCs w:val="0"/>
-                <w:sz w:val="22"/>
-                <w:szCs w:val="22"/>
-              </w:rPr>
-              <w:t>} mm</w:t>
+              <w:t xml:space="preserve"> {{ pobs_48_olimar }} mm</w:t>
             </w:r>
           </w:p>
           <w:p>
@@ -13761,51 +12137,7 @@
                 <w:sz w:val="22"/>
                 <w:szCs w:val="22"/>
               </w:rPr>
-              <w:t xml:space="preserve"> </w:t>
-            </w:r>
-            <w:proofErr w:type="gramStart"/>
-            <w:r>
-              <w:rPr>
-                <w:rFonts w:ascii="Segoe UI" w:hAnsi="Segoe UI" w:cs="Segoe UI"/>
-                <w:b w:val="0"/>
-                <w:bCs w:val="0"/>
-                <w:sz w:val="22"/>
-                <w:szCs w:val="22"/>
-              </w:rPr>
-              <w:t>{{ pobs</w:t>
-            </w:r>
-            <w:proofErr w:type="gramEnd"/>
-            <w:r>
-              <w:rPr>
-                <w:rFonts w:ascii="Segoe UI" w:hAnsi="Segoe UI" w:cs="Segoe UI"/>
-                <w:b w:val="0"/>
-                <w:bCs w:val="0"/>
-                <w:sz w:val="22"/>
-                <w:szCs w:val="22"/>
-              </w:rPr>
-              <w:t>_72_</w:t>
-            </w:r>
-            <w:proofErr w:type="gramStart"/>
-            <w:r>
-              <w:rPr>
-                <w:rFonts w:ascii="Segoe UI" w:hAnsi="Segoe UI" w:cs="Segoe UI"/>
-                <w:b w:val="0"/>
-                <w:bCs w:val="0"/>
-                <w:sz w:val="22"/>
-                <w:szCs w:val="22"/>
-              </w:rPr>
-              <w:t>olimar }</w:t>
-            </w:r>
-            <w:proofErr w:type="gramEnd"/>
-            <w:r>
-              <w:rPr>
-                <w:rFonts w:ascii="Segoe UI" w:hAnsi="Segoe UI" w:cs="Segoe UI"/>
-                <w:b w:val="0"/>
-                <w:bCs w:val="0"/>
-                <w:sz w:val="22"/>
-                <w:szCs w:val="22"/>
-              </w:rPr>
-              <w:t>} mm</w:t>
+              <w:t xml:space="preserve"> {{ pobs_72_olimar }} mm</w:t>
             </w:r>
           </w:p>
         </w:tc>
@@ -14010,51 +12342,7 @@
                 <w:sz w:val="22"/>
                 <w:szCs w:val="22"/>
               </w:rPr>
-              <w:t xml:space="preserve"> </w:t>
-            </w:r>
-            <w:proofErr w:type="gramStart"/>
-            <w:r>
-              <w:rPr>
-                <w:rFonts w:ascii="Segoe UI" w:hAnsi="Segoe UI" w:cs="Segoe UI"/>
-                <w:b w:val="0"/>
-                <w:bCs w:val="0"/>
-                <w:sz w:val="22"/>
-                <w:szCs w:val="22"/>
-              </w:rPr>
-              <w:t>{{ psim</w:t>
-            </w:r>
-            <w:proofErr w:type="gramEnd"/>
-            <w:r>
-              <w:rPr>
-                <w:rFonts w:ascii="Segoe UI" w:hAnsi="Segoe UI" w:cs="Segoe UI"/>
-                <w:b w:val="0"/>
-                <w:bCs w:val="0"/>
-                <w:sz w:val="22"/>
-                <w:szCs w:val="22"/>
-              </w:rPr>
-              <w:t>_24_</w:t>
-            </w:r>
-            <w:proofErr w:type="gramStart"/>
-            <w:r>
-              <w:rPr>
-                <w:rFonts w:ascii="Segoe UI" w:hAnsi="Segoe UI" w:cs="Segoe UI"/>
-                <w:b w:val="0"/>
-                <w:bCs w:val="0"/>
-                <w:sz w:val="22"/>
-                <w:szCs w:val="22"/>
-              </w:rPr>
-              <w:t>olimar }</w:t>
-            </w:r>
-            <w:proofErr w:type="gramEnd"/>
-            <w:r>
-              <w:rPr>
-                <w:rFonts w:ascii="Segoe UI" w:hAnsi="Segoe UI" w:cs="Segoe UI"/>
-                <w:b w:val="0"/>
-                <w:bCs w:val="0"/>
-                <w:sz w:val="22"/>
-                <w:szCs w:val="22"/>
-              </w:rPr>
-              <w:t>} mm</w:t>
+              <w:t xml:space="preserve"> {{ psim_24_olimar }} mm</w:t>
             </w:r>
           </w:p>
           <w:p>
@@ -14098,51 +12386,7 @@
                 <w:sz w:val="22"/>
                 <w:szCs w:val="22"/>
               </w:rPr>
-              <w:t xml:space="preserve"> </w:t>
-            </w:r>
-            <w:proofErr w:type="gramStart"/>
-            <w:r>
-              <w:rPr>
-                <w:rFonts w:ascii="Segoe UI" w:hAnsi="Segoe UI" w:cs="Segoe UI"/>
-                <w:b w:val="0"/>
-                <w:bCs w:val="0"/>
-                <w:sz w:val="22"/>
-                <w:szCs w:val="22"/>
-              </w:rPr>
-              <w:t>{{ psim</w:t>
-            </w:r>
-            <w:proofErr w:type="gramEnd"/>
-            <w:r>
-              <w:rPr>
-                <w:rFonts w:ascii="Segoe UI" w:hAnsi="Segoe UI" w:cs="Segoe UI"/>
-                <w:b w:val="0"/>
-                <w:bCs w:val="0"/>
-                <w:sz w:val="22"/>
-                <w:szCs w:val="22"/>
-              </w:rPr>
-              <w:t>_48_</w:t>
-            </w:r>
-            <w:proofErr w:type="gramStart"/>
-            <w:r>
-              <w:rPr>
-                <w:rFonts w:ascii="Segoe UI" w:hAnsi="Segoe UI" w:cs="Segoe UI"/>
-                <w:b w:val="0"/>
-                <w:bCs w:val="0"/>
-                <w:sz w:val="22"/>
-                <w:szCs w:val="22"/>
-              </w:rPr>
-              <w:t>olimar }</w:t>
-            </w:r>
-            <w:proofErr w:type="gramEnd"/>
-            <w:r>
-              <w:rPr>
-                <w:rFonts w:ascii="Segoe UI" w:hAnsi="Segoe UI" w:cs="Segoe UI"/>
-                <w:b w:val="0"/>
-                <w:bCs w:val="0"/>
-                <w:sz w:val="22"/>
-                <w:szCs w:val="22"/>
-              </w:rPr>
-              <w:t>} mm</w:t>
+              <w:t xml:space="preserve"> {{ psim_48_olimar }} mm</w:t>
             </w:r>
           </w:p>
           <w:p>
@@ -14186,51 +12430,7 @@
                 <w:sz w:val="22"/>
                 <w:szCs w:val="22"/>
               </w:rPr>
-              <w:t xml:space="preserve"> </w:t>
-            </w:r>
-            <w:proofErr w:type="gramStart"/>
-            <w:r>
-              <w:rPr>
-                <w:rFonts w:ascii="Segoe UI" w:hAnsi="Segoe UI" w:cs="Segoe UI"/>
-                <w:b w:val="0"/>
-                <w:bCs w:val="0"/>
-                <w:sz w:val="22"/>
-                <w:szCs w:val="22"/>
-              </w:rPr>
-              <w:t>{{ psim</w:t>
-            </w:r>
-            <w:proofErr w:type="gramEnd"/>
-            <w:r>
-              <w:rPr>
-                <w:rFonts w:ascii="Segoe UI" w:hAnsi="Segoe UI" w:cs="Segoe UI"/>
-                <w:b w:val="0"/>
-                <w:bCs w:val="0"/>
-                <w:sz w:val="22"/>
-                <w:szCs w:val="22"/>
-              </w:rPr>
-              <w:t>_72_</w:t>
-            </w:r>
-            <w:proofErr w:type="gramStart"/>
-            <w:r>
-              <w:rPr>
-                <w:rFonts w:ascii="Segoe UI" w:hAnsi="Segoe UI" w:cs="Segoe UI"/>
-                <w:b w:val="0"/>
-                <w:bCs w:val="0"/>
-                <w:sz w:val="22"/>
-                <w:szCs w:val="22"/>
-              </w:rPr>
-              <w:t>olimar }</w:t>
-            </w:r>
-            <w:proofErr w:type="gramEnd"/>
-            <w:r>
-              <w:rPr>
-                <w:rFonts w:ascii="Segoe UI" w:hAnsi="Segoe UI" w:cs="Segoe UI"/>
-                <w:b w:val="0"/>
-                <w:bCs w:val="0"/>
-                <w:sz w:val="22"/>
-                <w:szCs w:val="22"/>
-              </w:rPr>
-              <w:t>} mm</w:t>
+              <w:t xml:space="preserve"> {{ psim_72_olimar }} mm</w:t>
             </w:r>
           </w:p>
           <w:p>
@@ -14493,7 +12693,6 @@
                 <w:lang w:eastAsia="en-US"/>
               </w:rPr>
             </w:pPr>
-            <w:proofErr w:type="gramStart"/>
             <w:r>
               <w:rPr>
                 <w:rFonts w:ascii="Segoe UI" w:hAnsi="Segoe UI" w:cs="Segoe UI"/>
@@ -14501,17 +12700,7 @@
                 <w:szCs w:val="22"/>
                 <w:lang w:eastAsia="en-US"/>
               </w:rPr>
-              <w:t>{{ pronos</w:t>
-            </w:r>
-            <w:proofErr w:type="gramEnd"/>
-            <w:r>
-              <w:rPr>
-                <w:rFonts w:ascii="Segoe UI" w:hAnsi="Segoe UI" w:cs="Segoe UI"/>
-                <w:sz w:val="22"/>
-                <w:szCs w:val="22"/>
-                <w:lang w:eastAsia="en-US"/>
-              </w:rPr>
-              <w:t>_</w:t>
+              <w:t>{{ pronos_</w:t>
             </w:r>
             <w:r>
               <w:rPr>
@@ -14556,7 +12745,6 @@
                 <w:lang w:eastAsia="en-US"/>
               </w:rPr>
             </w:pPr>
-            <w:proofErr w:type="gramStart"/>
             <w:r>
               <w:rPr>
                 <w:rFonts w:ascii="Segoe UI" w:hAnsi="Segoe UI" w:cs="Segoe UI"/>
@@ -14564,17 +12752,7 @@
                 <w:szCs w:val="22"/>
                 <w:lang w:eastAsia="en-US"/>
               </w:rPr>
-              <w:t>{{ fecha</w:t>
-            </w:r>
-            <w:proofErr w:type="gramEnd"/>
-            <w:r>
-              <w:rPr>
-                <w:rFonts w:ascii="Segoe UI" w:hAnsi="Segoe UI" w:cs="Segoe UI"/>
-                <w:sz w:val="22"/>
-                <w:szCs w:val="22"/>
-                <w:lang w:eastAsia="en-US"/>
-              </w:rPr>
-              <w:t>_</w:t>
+              <w:t>{{ fecha_</w:t>
             </w:r>
             <w:r>
               <w:rPr>
@@ -14665,7 +12843,6 @@
                 <w:lang w:val="en-US" w:eastAsia="en-US"/>
               </w:rPr>
             </w:pPr>
-            <w:proofErr w:type="gramStart"/>
             <w:r>
               <w:rPr>
                 <w:rFonts w:ascii="Segoe UI" w:hAnsi="Segoe UI" w:cs="Segoe UI"/>
@@ -14675,19 +12852,7 @@
                 <w:szCs w:val="22"/>
                 <w:lang w:val="en-US" w:eastAsia="en-US"/>
               </w:rPr>
-              <w:t>{{ diagnostico</w:t>
-            </w:r>
-            <w:proofErr w:type="gramEnd"/>
-            <w:r>
-              <w:rPr>
-                <w:rFonts w:ascii="Segoe UI" w:hAnsi="Segoe UI" w:cs="Segoe UI"/>
-                <w:b w:val="0"/>
-                <w:bCs w:val="0"/>
-                <w:sz w:val="22"/>
-                <w:szCs w:val="22"/>
-                <w:lang w:val="en-US" w:eastAsia="en-US"/>
-              </w:rPr>
-              <w:t>_olimar }}</w:t>
+              <w:t>{{ diagnostico_olimar }}</w:t>
             </w:r>
           </w:p>
         </w:tc>
@@ -14760,7 +12925,6 @@
                 <w:lang w:val="en-US" w:eastAsia="en-US"/>
               </w:rPr>
             </w:pPr>
-            <w:proofErr w:type="gramStart"/>
             <w:r>
               <w:rPr>
                 <w:rFonts w:ascii="Segoe UI" w:hAnsi="Segoe UI" w:cs="Segoe UI"/>
@@ -14770,43 +12934,7 @@
                 <w:szCs w:val="22"/>
                 <w:lang w:val="en-US" w:eastAsia="en-US"/>
               </w:rPr>
-              <w:t>{{ recomendacion</w:t>
-            </w:r>
-            <w:proofErr w:type="gramEnd"/>
-            <w:r>
-              <w:rPr>
-                <w:rFonts w:ascii="Segoe UI" w:hAnsi="Segoe UI" w:cs="Segoe UI"/>
-                <w:b w:val="0"/>
-                <w:bCs w:val="0"/>
-                <w:sz w:val="22"/>
-                <w:szCs w:val="22"/>
-                <w:lang w:val="en-US" w:eastAsia="en-US"/>
-              </w:rPr>
-              <w:t>_</w:t>
-            </w:r>
-            <w:proofErr w:type="gramStart"/>
-            <w:r>
-              <w:rPr>
-                <w:rFonts w:ascii="Segoe UI" w:hAnsi="Segoe UI" w:cs="Segoe UI"/>
-                <w:b w:val="0"/>
-                <w:bCs w:val="0"/>
-                <w:sz w:val="22"/>
-                <w:szCs w:val="22"/>
-                <w:lang w:val="en-US" w:eastAsia="en-US"/>
-              </w:rPr>
-              <w:t>olimar }</w:t>
-            </w:r>
-            <w:proofErr w:type="gramEnd"/>
-            <w:r>
-              <w:rPr>
-                <w:rFonts w:ascii="Segoe UI" w:hAnsi="Segoe UI" w:cs="Segoe UI"/>
-                <w:b w:val="0"/>
-                <w:bCs w:val="0"/>
-                <w:sz w:val="22"/>
-                <w:szCs w:val="22"/>
-                <w:lang w:val="en-US" w:eastAsia="en-US"/>
-              </w:rPr>
-              <w:t xml:space="preserve">} </w:t>
+              <w:t xml:space="preserve">{{ recomendacion_olimar }} </w:t>
             </w:r>
           </w:p>
         </w:tc>
@@ -15411,23 +13539,13 @@
                 <w:lang w:eastAsia="en-US"/>
               </w:rPr>
             </w:pPr>
-            <w:proofErr w:type="gramStart"/>
-            <w:r>
-              <w:rPr>
-                <w:rFonts w:ascii="Segoe UI" w:hAnsi="Segoe UI" w:cs="Segoe UI"/>
-                <w:sz w:val="22"/>
-                <w:szCs w:val="22"/>
-              </w:rPr>
-              <w:t>{{ nivel</w:t>
-            </w:r>
-            <w:proofErr w:type="gramEnd"/>
-            <w:r>
-              <w:rPr>
-                <w:rFonts w:ascii="Segoe UI" w:hAnsi="Segoe UI" w:cs="Segoe UI"/>
-                <w:sz w:val="22"/>
-                <w:szCs w:val="22"/>
-              </w:rPr>
-              <w:t>_actual_varela }}</w:t>
+            <w:r>
+              <w:rPr>
+                <w:rFonts w:ascii="Segoe UI" w:hAnsi="Segoe UI" w:cs="Segoe UI"/>
+                <w:sz w:val="22"/>
+                <w:szCs w:val="22"/>
+              </w:rPr>
+              <w:t>{{ nivel_actual_varela }}</w:t>
             </w:r>
           </w:p>
         </w:tc>
@@ -15454,23 +13572,13 @@
                 <w:lang w:eastAsia="en-US"/>
               </w:rPr>
             </w:pPr>
-            <w:proofErr w:type="gramStart"/>
-            <w:r>
-              <w:rPr>
-                <w:rFonts w:ascii="Segoe UI" w:hAnsi="Segoe UI" w:cs="Segoe UI"/>
-                <w:sz w:val="22"/>
-                <w:szCs w:val="22"/>
-              </w:rPr>
-              <w:t>{{ tasa</w:t>
-            </w:r>
-            <w:proofErr w:type="gramEnd"/>
-            <w:r>
-              <w:rPr>
-                <w:rFonts w:ascii="Segoe UI" w:hAnsi="Segoe UI" w:cs="Segoe UI"/>
-                <w:sz w:val="22"/>
-                <w:szCs w:val="22"/>
-              </w:rPr>
-              <w:t>_varela }}</w:t>
+            <w:r>
+              <w:rPr>
+                <w:rFonts w:ascii="Segoe UI" w:hAnsi="Segoe UI" w:cs="Segoe UI"/>
+                <w:sz w:val="22"/>
+                <w:szCs w:val="22"/>
+              </w:rPr>
+              <w:t>{{ tasa_varela }}</w:t>
             </w:r>
           </w:p>
         </w:tc>
@@ -15497,23 +13605,13 @@
                 <w:lang w:eastAsia="en-US"/>
               </w:rPr>
             </w:pPr>
-            <w:proofErr w:type="gramStart"/>
-            <w:r>
-              <w:rPr>
-                <w:rFonts w:ascii="Segoe UI" w:hAnsi="Segoe UI" w:cs="Segoe UI"/>
-                <w:sz w:val="22"/>
-                <w:szCs w:val="22"/>
-              </w:rPr>
-              <w:t>{{ tendencia</w:t>
-            </w:r>
-            <w:proofErr w:type="gramEnd"/>
-            <w:r>
-              <w:rPr>
-                <w:rFonts w:ascii="Segoe UI" w:hAnsi="Segoe UI" w:cs="Segoe UI"/>
-                <w:sz w:val="22"/>
-                <w:szCs w:val="22"/>
-              </w:rPr>
-              <w:t>_varela }}</w:t>
+            <w:r>
+              <w:rPr>
+                <w:rFonts w:ascii="Segoe UI" w:hAnsi="Segoe UI" w:cs="Segoe UI"/>
+                <w:sz w:val="22"/>
+                <w:szCs w:val="22"/>
+              </w:rPr>
+              <w:t>{{ tendencia_varela }}</w:t>
             </w:r>
           </w:p>
         </w:tc>
@@ -15718,51 +13816,7 @@
                 <w:sz w:val="22"/>
                 <w:szCs w:val="22"/>
               </w:rPr>
-              <w:t xml:space="preserve"> </w:t>
-            </w:r>
-            <w:proofErr w:type="gramStart"/>
-            <w:r>
-              <w:rPr>
-                <w:rFonts w:ascii="Segoe UI" w:hAnsi="Segoe UI" w:cs="Segoe UI"/>
-                <w:b w:val="0"/>
-                <w:bCs w:val="0"/>
-                <w:sz w:val="22"/>
-                <w:szCs w:val="22"/>
-              </w:rPr>
-              <w:t>{{ pobs</w:t>
-            </w:r>
-            <w:proofErr w:type="gramEnd"/>
-            <w:r>
-              <w:rPr>
-                <w:rFonts w:ascii="Segoe UI" w:hAnsi="Segoe UI" w:cs="Segoe UI"/>
-                <w:b w:val="0"/>
-                <w:bCs w:val="0"/>
-                <w:sz w:val="22"/>
-                <w:szCs w:val="22"/>
-              </w:rPr>
-              <w:t>_24_</w:t>
-            </w:r>
-            <w:proofErr w:type="gramStart"/>
-            <w:r>
-              <w:rPr>
-                <w:rFonts w:ascii="Segoe UI" w:hAnsi="Segoe UI" w:cs="Segoe UI"/>
-                <w:b w:val="0"/>
-                <w:bCs w:val="0"/>
-                <w:sz w:val="22"/>
-                <w:szCs w:val="22"/>
-              </w:rPr>
-              <w:t>jose }</w:t>
-            </w:r>
-            <w:proofErr w:type="gramEnd"/>
-            <w:r>
-              <w:rPr>
-                <w:rFonts w:ascii="Segoe UI" w:hAnsi="Segoe UI" w:cs="Segoe UI"/>
-                <w:b w:val="0"/>
-                <w:bCs w:val="0"/>
-                <w:sz w:val="22"/>
-                <w:szCs w:val="22"/>
-              </w:rPr>
-              <w:t>} mm</w:t>
+              <w:t xml:space="preserve"> {{ pobs_24_jose }} mm</w:t>
             </w:r>
           </w:p>
           <w:p>
@@ -15807,51 +13861,7 @@
                 <w:sz w:val="22"/>
                 <w:szCs w:val="22"/>
               </w:rPr>
-              <w:t xml:space="preserve"> </w:t>
-            </w:r>
-            <w:proofErr w:type="gramStart"/>
-            <w:r>
-              <w:rPr>
-                <w:rFonts w:ascii="Segoe UI" w:hAnsi="Segoe UI" w:cs="Segoe UI"/>
-                <w:b w:val="0"/>
-                <w:bCs w:val="0"/>
-                <w:sz w:val="22"/>
-                <w:szCs w:val="22"/>
-              </w:rPr>
-              <w:t>{{ pobs</w:t>
-            </w:r>
-            <w:proofErr w:type="gramEnd"/>
-            <w:r>
-              <w:rPr>
-                <w:rFonts w:ascii="Segoe UI" w:hAnsi="Segoe UI" w:cs="Segoe UI"/>
-                <w:b w:val="0"/>
-                <w:bCs w:val="0"/>
-                <w:sz w:val="22"/>
-                <w:szCs w:val="22"/>
-              </w:rPr>
-              <w:t>_48_</w:t>
-            </w:r>
-            <w:proofErr w:type="gramStart"/>
-            <w:r>
-              <w:rPr>
-                <w:rFonts w:ascii="Segoe UI" w:hAnsi="Segoe UI" w:cs="Segoe UI"/>
-                <w:b w:val="0"/>
-                <w:bCs w:val="0"/>
-                <w:sz w:val="22"/>
-                <w:szCs w:val="22"/>
-              </w:rPr>
-              <w:t>jose }</w:t>
-            </w:r>
-            <w:proofErr w:type="gramEnd"/>
-            <w:r>
-              <w:rPr>
-                <w:rFonts w:ascii="Segoe UI" w:hAnsi="Segoe UI" w:cs="Segoe UI"/>
-                <w:b w:val="0"/>
-                <w:bCs w:val="0"/>
-                <w:sz w:val="22"/>
-                <w:szCs w:val="22"/>
-              </w:rPr>
-              <w:t>} mm</w:t>
+              <w:t xml:space="preserve"> {{ pobs_48_jose }} mm</w:t>
             </w:r>
           </w:p>
           <w:p>
@@ -15894,51 +13904,7 @@
                 <w:sz w:val="22"/>
                 <w:szCs w:val="22"/>
               </w:rPr>
-              <w:t xml:space="preserve"> </w:t>
-            </w:r>
-            <w:proofErr w:type="gramStart"/>
-            <w:r>
-              <w:rPr>
-                <w:rFonts w:ascii="Segoe UI" w:hAnsi="Segoe UI" w:cs="Segoe UI"/>
-                <w:b w:val="0"/>
-                <w:bCs w:val="0"/>
-                <w:sz w:val="22"/>
-                <w:szCs w:val="22"/>
-              </w:rPr>
-              <w:t>{{ pobs</w:t>
-            </w:r>
-            <w:proofErr w:type="gramEnd"/>
-            <w:r>
-              <w:rPr>
-                <w:rFonts w:ascii="Segoe UI" w:hAnsi="Segoe UI" w:cs="Segoe UI"/>
-                <w:b w:val="0"/>
-                <w:bCs w:val="0"/>
-                <w:sz w:val="22"/>
-                <w:szCs w:val="22"/>
-              </w:rPr>
-              <w:t>_72_</w:t>
-            </w:r>
-            <w:proofErr w:type="gramStart"/>
-            <w:r>
-              <w:rPr>
-                <w:rFonts w:ascii="Segoe UI" w:hAnsi="Segoe UI" w:cs="Segoe UI"/>
-                <w:b w:val="0"/>
-                <w:bCs w:val="0"/>
-                <w:sz w:val="22"/>
-                <w:szCs w:val="22"/>
-              </w:rPr>
-              <w:t>jose }</w:t>
-            </w:r>
-            <w:proofErr w:type="gramEnd"/>
-            <w:r>
-              <w:rPr>
-                <w:rFonts w:ascii="Segoe UI" w:hAnsi="Segoe UI" w:cs="Segoe UI"/>
-                <w:b w:val="0"/>
-                <w:bCs w:val="0"/>
-                <w:sz w:val="22"/>
-                <w:szCs w:val="22"/>
-              </w:rPr>
-              <w:t>} mm</w:t>
+              <w:t xml:space="preserve"> {{ pobs_72_jose }} mm</w:t>
             </w:r>
           </w:p>
         </w:tc>
@@ -16133,31 +14099,8 @@
                 <w:sz w:val="22"/>
                 <w:szCs w:val="22"/>
               </w:rPr>
-              <w:t xml:space="preserve"> </w:t>
-            </w:r>
-            <w:proofErr w:type="gramStart"/>
-            <w:r>
-              <w:rPr>
-                <w:rFonts w:ascii="Segoe UI" w:hAnsi="Segoe UI" w:cs="Segoe UI"/>
-                <w:b w:val="0"/>
-                <w:bCs w:val="0"/>
-                <w:sz w:val="22"/>
-                <w:szCs w:val="22"/>
-              </w:rPr>
-              <w:t>{{ psim</w:t>
-            </w:r>
-            <w:proofErr w:type="gramEnd"/>
-            <w:r>
-              <w:rPr>
-                <w:rFonts w:ascii="Segoe UI" w:hAnsi="Segoe UI" w:cs="Segoe UI"/>
-                <w:b w:val="0"/>
-                <w:bCs w:val="0"/>
-                <w:sz w:val="22"/>
-                <w:szCs w:val="22"/>
-              </w:rPr>
-              <w:t>_24_</w:t>
-            </w:r>
-            <w:proofErr w:type="gramStart"/>
+              <w:t xml:space="preserve"> {{ psim_24_</w:t>
+            </w:r>
             <w:r>
               <w:rPr>
                 <w:rFonts w:ascii="Segoe UI" w:hAnsi="Segoe UI" w:cs="Segoe UI"/>
@@ -16176,18 +14119,7 @@
                 <w:sz w:val="22"/>
                 <w:szCs w:val="22"/>
               </w:rPr>
-              <w:t xml:space="preserve"> }</w:t>
-            </w:r>
-            <w:proofErr w:type="gramEnd"/>
-            <w:r>
-              <w:rPr>
-                <w:rFonts w:ascii="Segoe UI" w:hAnsi="Segoe UI" w:cs="Segoe UI"/>
-                <w:b w:val="0"/>
-                <w:bCs w:val="0"/>
-                <w:sz w:val="22"/>
-                <w:szCs w:val="22"/>
-              </w:rPr>
-              <w:t>} mm</w:t>
+              <w:t xml:space="preserve"> }} mm</w:t>
             </w:r>
           </w:p>
           <w:p>
@@ -16231,31 +14163,8 @@
                 <w:sz w:val="22"/>
                 <w:szCs w:val="22"/>
               </w:rPr>
-              <w:t xml:space="preserve"> </w:t>
-            </w:r>
-            <w:proofErr w:type="gramStart"/>
-            <w:r>
-              <w:rPr>
-                <w:rFonts w:ascii="Segoe UI" w:hAnsi="Segoe UI" w:cs="Segoe UI"/>
-                <w:b w:val="0"/>
-                <w:bCs w:val="0"/>
-                <w:sz w:val="22"/>
-                <w:szCs w:val="22"/>
-              </w:rPr>
-              <w:t>{{ psim</w:t>
-            </w:r>
-            <w:proofErr w:type="gramEnd"/>
-            <w:r>
-              <w:rPr>
-                <w:rFonts w:ascii="Segoe UI" w:hAnsi="Segoe UI" w:cs="Segoe UI"/>
-                <w:b w:val="0"/>
-                <w:bCs w:val="0"/>
-                <w:sz w:val="22"/>
-                <w:szCs w:val="22"/>
-              </w:rPr>
-              <w:t>_48_</w:t>
-            </w:r>
-            <w:proofErr w:type="gramStart"/>
+              <w:t xml:space="preserve"> {{ psim_48_</w:t>
+            </w:r>
             <w:r>
               <w:rPr>
                 <w:rFonts w:ascii="Segoe UI" w:hAnsi="Segoe UI" w:cs="Segoe UI"/>
@@ -16274,18 +14183,7 @@
                 <w:sz w:val="22"/>
                 <w:szCs w:val="22"/>
               </w:rPr>
-              <w:t xml:space="preserve"> }</w:t>
-            </w:r>
-            <w:proofErr w:type="gramEnd"/>
-            <w:r>
-              <w:rPr>
-                <w:rFonts w:ascii="Segoe UI" w:hAnsi="Segoe UI" w:cs="Segoe UI"/>
-                <w:b w:val="0"/>
-                <w:bCs w:val="0"/>
-                <w:sz w:val="22"/>
-                <w:szCs w:val="22"/>
-              </w:rPr>
-              <w:t>} mm</w:t>
+              <w:t xml:space="preserve"> }} mm</w:t>
             </w:r>
           </w:p>
           <w:p>
@@ -16329,31 +14227,8 @@
                 <w:sz w:val="22"/>
                 <w:szCs w:val="22"/>
               </w:rPr>
-              <w:t xml:space="preserve"> </w:t>
-            </w:r>
-            <w:proofErr w:type="gramStart"/>
-            <w:r>
-              <w:rPr>
-                <w:rFonts w:ascii="Segoe UI" w:hAnsi="Segoe UI" w:cs="Segoe UI"/>
-                <w:b w:val="0"/>
-                <w:bCs w:val="0"/>
-                <w:sz w:val="22"/>
-                <w:szCs w:val="22"/>
-              </w:rPr>
-              <w:t>{{ psim</w:t>
-            </w:r>
-            <w:proofErr w:type="gramEnd"/>
-            <w:r>
-              <w:rPr>
-                <w:rFonts w:ascii="Segoe UI" w:hAnsi="Segoe UI" w:cs="Segoe UI"/>
-                <w:b w:val="0"/>
-                <w:bCs w:val="0"/>
-                <w:sz w:val="22"/>
-                <w:szCs w:val="22"/>
-              </w:rPr>
-              <w:t>_72_</w:t>
-            </w:r>
-            <w:proofErr w:type="gramStart"/>
+              <w:t xml:space="preserve"> {{ psim_72_</w:t>
+            </w:r>
             <w:r>
               <w:rPr>
                 <w:rFonts w:ascii="Segoe UI" w:hAnsi="Segoe UI" w:cs="Segoe UI"/>
@@ -16372,18 +14247,7 @@
                 <w:sz w:val="22"/>
                 <w:szCs w:val="22"/>
               </w:rPr>
-              <w:t xml:space="preserve"> }</w:t>
-            </w:r>
-            <w:proofErr w:type="gramEnd"/>
-            <w:r>
-              <w:rPr>
-                <w:rFonts w:ascii="Segoe UI" w:hAnsi="Segoe UI" w:cs="Segoe UI"/>
-                <w:b w:val="0"/>
-                <w:bCs w:val="0"/>
-                <w:sz w:val="22"/>
-                <w:szCs w:val="22"/>
-              </w:rPr>
-              <w:t>} mm</w:t>
+              <w:t xml:space="preserve"> }} mm</w:t>
             </w:r>
           </w:p>
           <w:p>
@@ -16645,23 +14509,13 @@
                 <w:lang w:eastAsia="en-US"/>
               </w:rPr>
             </w:pPr>
-            <w:proofErr w:type="gramStart"/>
-            <w:r>
-              <w:rPr>
-                <w:rFonts w:ascii="Segoe UI" w:hAnsi="Segoe UI" w:cs="Segoe UI"/>
-                <w:sz w:val="22"/>
-                <w:szCs w:val="22"/>
-              </w:rPr>
-              <w:t>{{ pronos</w:t>
-            </w:r>
-            <w:proofErr w:type="gramEnd"/>
-            <w:r>
-              <w:rPr>
-                <w:rFonts w:ascii="Segoe UI" w:hAnsi="Segoe UI" w:cs="Segoe UI"/>
-                <w:sz w:val="22"/>
-                <w:szCs w:val="22"/>
-              </w:rPr>
-              <w:t>_varela }}</w:t>
+            <w:r>
+              <w:rPr>
+                <w:rFonts w:ascii="Segoe UI" w:hAnsi="Segoe UI" w:cs="Segoe UI"/>
+                <w:sz w:val="22"/>
+                <w:szCs w:val="22"/>
+              </w:rPr>
+              <w:t>{{ pronos_varela }}</w:t>
             </w:r>
           </w:p>
         </w:tc>
@@ -16688,23 +14542,13 @@
                 <w:lang w:eastAsia="en-US"/>
               </w:rPr>
             </w:pPr>
-            <w:proofErr w:type="gramStart"/>
-            <w:r>
-              <w:rPr>
-                <w:rFonts w:ascii="Segoe UI" w:hAnsi="Segoe UI" w:cs="Segoe UI"/>
-                <w:sz w:val="22"/>
-                <w:szCs w:val="22"/>
-              </w:rPr>
-              <w:t>{{ fecha</w:t>
-            </w:r>
-            <w:proofErr w:type="gramEnd"/>
-            <w:r>
-              <w:rPr>
-                <w:rFonts w:ascii="Segoe UI" w:hAnsi="Segoe UI" w:cs="Segoe UI"/>
-                <w:sz w:val="22"/>
-                <w:szCs w:val="22"/>
-              </w:rPr>
-              <w:t>_varela }}</w:t>
+            <w:r>
+              <w:rPr>
+                <w:rFonts w:ascii="Segoe UI" w:hAnsi="Segoe UI" w:cs="Segoe UI"/>
+                <w:sz w:val="22"/>
+                <w:szCs w:val="22"/>
+              </w:rPr>
+              <w:t>{{ fecha_varela }}</w:t>
             </w:r>
           </w:p>
         </w:tc>
@@ -16777,7 +14621,6 @@
                 <w:lang w:val="en-US" w:eastAsia="en-US"/>
               </w:rPr>
             </w:pPr>
-            <w:proofErr w:type="gramStart"/>
             <w:r>
               <w:rPr>
                 <w:rFonts w:ascii="Segoe UI" w:hAnsi="Segoe UI" w:cs="Segoe UI"/>
@@ -16787,19 +14630,7 @@
                 <w:szCs w:val="22"/>
                 <w:lang w:val="en-US" w:eastAsia="en-US"/>
               </w:rPr>
-              <w:t>{{ diagnostico</w:t>
-            </w:r>
-            <w:proofErr w:type="gramEnd"/>
-            <w:r>
-              <w:rPr>
-                <w:rFonts w:ascii="Segoe UI" w:hAnsi="Segoe UI" w:cs="Segoe UI"/>
-                <w:b w:val="0"/>
-                <w:bCs w:val="0"/>
-                <w:sz w:val="22"/>
-                <w:szCs w:val="22"/>
-                <w:lang w:val="en-US" w:eastAsia="en-US"/>
-              </w:rPr>
-              <w:t>_</w:t>
+              <w:t>{{ diagnostico_</w:t>
             </w:r>
             <w:r>
               <w:rPr>
@@ -16894,7 +14725,6 @@
                 <w:lang w:val="en-US" w:eastAsia="en-US"/>
               </w:rPr>
             </w:pPr>
-            <w:proofErr w:type="gramStart"/>
             <w:r>
               <w:rPr>
                 <w:rFonts w:ascii="Segoe UI" w:hAnsi="Segoe UI" w:cs="Segoe UI"/>
@@ -16904,9 +14734,8 @@
                 <w:szCs w:val="22"/>
                 <w:lang w:val="en-US" w:eastAsia="en-US"/>
               </w:rPr>
-              <w:t>{{ recomendacion</w:t>
-            </w:r>
-            <w:proofErr w:type="gramEnd"/>
+              <w:t>{{ recomendacion_</w:t>
+            </w:r>
             <w:r>
               <w:rPr>
                 <w:rFonts w:ascii="Segoe UI" w:hAnsi="Segoe UI" w:cs="Segoe UI"/>
@@ -16916,9 +14745,8 @@
                 <w:szCs w:val="22"/>
                 <w:lang w:val="en-US" w:eastAsia="en-US"/>
               </w:rPr>
-              <w:t>_</w:t>
-            </w:r>
-            <w:proofErr w:type="gramStart"/>
+              <w:t>jose</w:t>
+            </w:r>
             <w:r>
               <w:rPr>
                 <w:rFonts w:ascii="Segoe UI" w:hAnsi="Segoe UI" w:cs="Segoe UI"/>
@@ -16928,30 +14756,7 @@
                 <w:szCs w:val="22"/>
                 <w:lang w:val="en-US" w:eastAsia="en-US"/>
               </w:rPr>
-              <w:t>jose</w:t>
-            </w:r>
-            <w:r>
-              <w:rPr>
-                <w:rFonts w:ascii="Segoe UI" w:hAnsi="Segoe UI" w:cs="Segoe UI"/>
-                <w:b w:val="0"/>
-                <w:bCs w:val="0"/>
-                <w:sz w:val="22"/>
-                <w:szCs w:val="22"/>
-                <w:lang w:val="en-US" w:eastAsia="en-US"/>
-              </w:rPr>
-              <w:t xml:space="preserve"> }</w:t>
-            </w:r>
-            <w:proofErr w:type="gramEnd"/>
-            <w:r>
-              <w:rPr>
-                <w:rFonts w:ascii="Segoe UI" w:hAnsi="Segoe UI" w:cs="Segoe UI"/>
-                <w:b w:val="0"/>
-                <w:bCs w:val="0"/>
-                <w:sz w:val="22"/>
-                <w:szCs w:val="22"/>
-                <w:lang w:val="en-US" w:eastAsia="en-US"/>
-              </w:rPr>
-              <w:t xml:space="preserve">} </w:t>
+              <w:t xml:space="preserve"> }} </w:t>
             </w:r>
           </w:p>
         </w:tc>
@@ -16978,7 +14783,7 @@
 </file>
 
 <file path=word/endnotes.xml><?xml version="1.0" encoding="utf-8"?>
-<w:endnotes xmlns:wpc="http://schemas.microsoft.com/office/word/2010/wordprocessingCanvas" xmlns:cx="http://schemas.microsoft.com/office/drawing/2014/chartex" xmlns:cx1="http://schemas.microsoft.com/office/drawing/2015/9/8/chartex" xmlns:cx2="http://schemas.microsoft.com/office/drawing/2015/10/21/chartex" xmlns:cx3="http://schemas.microsoft.com/office/drawing/2016/5/9/chartex" xmlns:cx4="http://schemas.microsoft.com/office/drawing/2016/5/10/chartex" xmlns:cx5="http://schemas.microsoft.com/office/drawing/2016/5/11/chartex" xmlns:cx6="http://schemas.microsoft.com/office/drawing/2016/5/12/chartex" xmlns:cx7="http://schemas.microsoft.com/office/drawing/2016/5/13/chartex" xmlns:cx8="http://schemas.microsoft.com/office/drawing/2016/5/14/chartex" xmlns:mc="http://schemas.openxmlformats.org/markup-compatibility/2006" xmlns:aink="http://schemas.microsoft.com/office/drawing/2016/ink" xmlns:am3d="http://schemas.microsoft.com/office/drawing/2017/model3d" xmlns:o="urn:schemas-microsoft-com:office:office" xmlns:oel="http://schemas.microsoft.com/office/2019/extlst" xmlns:r="http://schemas.openxmlformats.org/officeDocument/2006/relationships" xmlns:m="http://schemas.openxmlformats.org/officeDocument/2006/math" xmlns:v="urn:schemas-microsoft-com:vml" xmlns:wp14="http://schemas.microsoft.com/office/word/2010/wordprocessingDrawing" xmlns:wp="http://schemas.openxmlformats.org/drawingml/2006/wordprocessingDrawing" xmlns:w10="urn:schemas-microsoft-com:office:word" xmlns:w="http://schemas.openxmlformats.org/wordprocessingml/2006/main" xmlns:w14="http://schemas.microsoft.com/office/word/2010/wordml" xmlns:w15="http://schemas.microsoft.com/office/word/2012/wordml" xmlns:w16cei="http://schemas.microsoft.com/office/word/2026/wordml/cei" xmlns:w16cex="http://schemas.microsoft.com/office/word/2018/wordml/cex" xmlns:w16cid="http://schemas.microsoft.com/office/word/2016/wordml/cid" xmlns:w16="http://schemas.microsoft.com/office/word/2018/wordml" xmlns:w16du="http://schemas.microsoft.com/office/word/2023/wordml/word16du" xmlns:w16sdtdh="http://schemas.microsoft.com/office/word/2020/wordml/sdtdatahash" xmlns:w16sdtfl="http://schemas.microsoft.com/office/word/2024/wordml/sdtformatlock" xmlns:w16se="http://schemas.microsoft.com/office/word/2015/wordml/symex" xmlns:wpg="http://schemas.microsoft.com/office/word/2010/wordprocessingGroup" xmlns:wpi="http://schemas.microsoft.com/office/word/2010/wordprocessingInk" xmlns:wne="http://schemas.microsoft.com/office/word/2006/wordml" xmlns:wps="http://schemas.microsoft.com/office/word/2010/wordprocessingShape" mc:Ignorable="w14 w15 w16se w16cid w16 w16cex w16sdtdh w16sdtfl w16du wp14">
+<w:endnotes xmlns:wpc="http://schemas.microsoft.com/office/word/2010/wordprocessingCanvas" xmlns:cx="http://schemas.microsoft.com/office/drawing/2014/chartex" xmlns:cx1="http://schemas.microsoft.com/office/drawing/2015/9/8/chartex" xmlns:cx2="http://schemas.microsoft.com/office/drawing/2015/10/21/chartex" xmlns:cx3="http://schemas.microsoft.com/office/drawing/2016/5/9/chartex" xmlns:cx4="http://schemas.microsoft.com/office/drawing/2016/5/10/chartex" xmlns:cx5="http://schemas.microsoft.com/office/drawing/2016/5/11/chartex" xmlns:cx6="http://schemas.microsoft.com/office/drawing/2016/5/12/chartex" xmlns:cx7="http://schemas.microsoft.com/office/drawing/2016/5/13/chartex" xmlns:cx8="http://schemas.microsoft.com/office/drawing/2016/5/14/chartex" xmlns:mc="http://schemas.openxmlformats.org/markup-compatibility/2006" xmlns:aink="http://schemas.microsoft.com/office/drawing/2016/ink" xmlns:am3d="http://schemas.microsoft.com/office/drawing/2017/model3d" xmlns:o="urn:schemas-microsoft-com:office:office" xmlns:oel="http://schemas.microsoft.com/office/2019/extlst" xmlns:r="http://schemas.openxmlformats.org/officeDocument/2006/relationships" xmlns:m="http://schemas.openxmlformats.org/officeDocument/2006/math" xmlns:v="urn:schemas-microsoft-com:vml" xmlns:wp14="http://schemas.microsoft.com/office/word/2010/wordprocessingDrawing" xmlns:wp="http://schemas.openxmlformats.org/drawingml/2006/wordprocessingDrawing" xmlns:w10="urn:schemas-microsoft-com:office:word" xmlns:w="http://schemas.openxmlformats.org/wordprocessingml/2006/main" xmlns:w14="http://schemas.microsoft.com/office/word/2010/wordml" xmlns:w15="http://schemas.microsoft.com/office/word/2012/wordml" xmlns:w16cex="http://schemas.microsoft.com/office/word/2018/wordml/cex" xmlns:w16cid="http://schemas.microsoft.com/office/word/2016/wordml/cid" xmlns:w16="http://schemas.microsoft.com/office/word/2018/wordml" xmlns:w16du="http://schemas.microsoft.com/office/word/2023/wordml/word16du" xmlns:w16sdtdh="http://schemas.microsoft.com/office/word/2020/wordml/sdtdatahash" xmlns:w16sdtfl="http://schemas.microsoft.com/office/word/2024/wordml/sdtformatlock" xmlns:w16se="http://schemas.microsoft.com/office/word/2015/wordml/symex" xmlns:wpg="http://schemas.microsoft.com/office/word/2010/wordprocessingGroup" xmlns:wpi="http://schemas.microsoft.com/office/word/2010/wordprocessingInk" xmlns:wne="http://schemas.microsoft.com/office/word/2006/wordml" xmlns:wps="http://schemas.microsoft.com/office/word/2010/wordprocessingShape" mc:Ignorable="w14 w15 w16se w16cid w16 w16cex w16sdtdh w16sdtfl w16du wp14">
   <w:endnote w:type="separator" w:id="-1">
     <w:p>
       <w:pPr>
@@ -17003,7 +14808,7 @@
 </file>
 
 <file path=word/footer1.xml><?xml version="1.0" encoding="utf-8"?>
-<w:ftr xmlns:wpc="http://schemas.microsoft.com/office/word/2010/wordprocessingCanvas" xmlns:cx="http://schemas.microsoft.com/office/drawing/2014/chartex" xmlns:cx1="http://schemas.microsoft.com/office/drawing/2015/9/8/chartex" xmlns:cx2="http://schemas.microsoft.com/office/drawing/2015/10/21/chartex" xmlns:cx3="http://schemas.microsoft.com/office/drawing/2016/5/9/chartex" xmlns:cx4="http://schemas.microsoft.com/office/drawing/2016/5/10/chartex" xmlns:cx5="http://schemas.microsoft.com/office/drawing/2016/5/11/chartex" xmlns:cx6="http://schemas.microsoft.com/office/drawing/2016/5/12/chartex" xmlns:cx7="http://schemas.microsoft.com/office/drawing/2016/5/13/chartex" xmlns:cx8="http://schemas.microsoft.com/office/drawing/2016/5/14/chartex" xmlns:mc="http://schemas.openxmlformats.org/markup-compatibility/2006" xmlns:aink="http://schemas.microsoft.com/office/drawing/2016/ink" xmlns:am3d="http://schemas.microsoft.com/office/drawing/2017/model3d" xmlns:o="urn:schemas-microsoft-com:office:office" xmlns:oel="http://schemas.microsoft.com/office/2019/extlst" xmlns:r="http://schemas.openxmlformats.org/officeDocument/2006/relationships" xmlns:m="http://schemas.openxmlformats.org/officeDocument/2006/math" xmlns:v="urn:schemas-microsoft-com:vml" xmlns:wp14="http://schemas.microsoft.com/office/word/2010/wordprocessingDrawing" xmlns:wp="http://schemas.openxmlformats.org/drawingml/2006/wordprocessingDrawing" xmlns:w10="urn:schemas-microsoft-com:office:word" xmlns:w="http://schemas.openxmlformats.org/wordprocessingml/2006/main" xmlns:w14="http://schemas.microsoft.com/office/word/2010/wordml" xmlns:w15="http://schemas.microsoft.com/office/word/2012/wordml" xmlns:w16cei="http://schemas.microsoft.com/office/word/2026/wordml/cei" xmlns:w16cex="http://schemas.microsoft.com/office/word/2018/wordml/cex" xmlns:w16cid="http://schemas.microsoft.com/office/word/2016/wordml/cid" xmlns:w16="http://schemas.microsoft.com/office/word/2018/wordml" xmlns:w16du="http://schemas.microsoft.com/office/word/2023/wordml/word16du" xmlns:w16sdtdh="http://schemas.microsoft.com/office/word/2020/wordml/sdtdatahash" xmlns:w16sdtfl="http://schemas.microsoft.com/office/word/2024/wordml/sdtformatlock" xmlns:w16se="http://schemas.microsoft.com/office/word/2015/wordml/symex" xmlns:wpg="http://schemas.microsoft.com/office/word/2010/wordprocessingGroup" xmlns:wpi="http://schemas.microsoft.com/office/word/2010/wordprocessingInk" xmlns:wne="http://schemas.microsoft.com/office/word/2006/wordml" xmlns:wps="http://schemas.microsoft.com/office/word/2010/wordprocessingShape" mc:Ignorable="w14 w15 w16se w16cid w16 w16cex w16sdtdh w16sdtfl w16du wp14">
+<w:ftr xmlns:wpc="http://schemas.microsoft.com/office/word/2010/wordprocessingCanvas" xmlns:cx="http://schemas.microsoft.com/office/drawing/2014/chartex" xmlns:cx1="http://schemas.microsoft.com/office/drawing/2015/9/8/chartex" xmlns:cx2="http://schemas.microsoft.com/office/drawing/2015/10/21/chartex" xmlns:cx3="http://schemas.microsoft.com/office/drawing/2016/5/9/chartex" xmlns:cx4="http://schemas.microsoft.com/office/drawing/2016/5/10/chartex" xmlns:cx5="http://schemas.microsoft.com/office/drawing/2016/5/11/chartex" xmlns:cx6="http://schemas.microsoft.com/office/drawing/2016/5/12/chartex" xmlns:cx7="http://schemas.microsoft.com/office/drawing/2016/5/13/chartex" xmlns:cx8="http://schemas.microsoft.com/office/drawing/2016/5/14/chartex" xmlns:mc="http://schemas.openxmlformats.org/markup-compatibility/2006" xmlns:aink="http://schemas.microsoft.com/office/drawing/2016/ink" xmlns:am3d="http://schemas.microsoft.com/office/drawing/2017/model3d" xmlns:o="urn:schemas-microsoft-com:office:office" xmlns:oel="http://schemas.microsoft.com/office/2019/extlst" xmlns:r="http://schemas.openxmlformats.org/officeDocument/2006/relationships" xmlns:m="http://schemas.openxmlformats.org/officeDocument/2006/math" xmlns:v="urn:schemas-microsoft-com:vml" xmlns:wp14="http://schemas.microsoft.com/office/word/2010/wordprocessingDrawing" xmlns:wp="http://schemas.openxmlformats.org/drawingml/2006/wordprocessingDrawing" xmlns:w10="urn:schemas-microsoft-com:office:word" xmlns:w="http://schemas.openxmlformats.org/wordprocessingml/2006/main" xmlns:w14="http://schemas.microsoft.com/office/word/2010/wordml" xmlns:w15="http://schemas.microsoft.com/office/word/2012/wordml" xmlns:w16cex="http://schemas.microsoft.com/office/word/2018/wordml/cex" xmlns:w16cid="http://schemas.microsoft.com/office/word/2016/wordml/cid" xmlns:w16="http://schemas.microsoft.com/office/word/2018/wordml" xmlns:w16du="http://schemas.microsoft.com/office/word/2023/wordml/word16du" xmlns:w16sdtdh="http://schemas.microsoft.com/office/word/2020/wordml/sdtdatahash" xmlns:w16sdtfl="http://schemas.microsoft.com/office/word/2024/wordml/sdtformatlock" xmlns:w16se="http://schemas.microsoft.com/office/word/2015/wordml/symex" xmlns:wpg="http://schemas.microsoft.com/office/word/2010/wordprocessingGroup" xmlns:wpi="http://schemas.microsoft.com/office/word/2010/wordprocessingInk" xmlns:wne="http://schemas.microsoft.com/office/word/2006/wordml" xmlns:wps="http://schemas.microsoft.com/office/word/2010/wordprocessingShape" mc:Ignorable="w14 w15 w16se w16cid w16 w16cex w16sdtdh w16sdtfl w16du wp14">
   <w:sdt>
     <w:sdtPr>
       <w:id w:val="186641544"/>
@@ -17084,7 +14889,7 @@
                 </wp:anchor>
               </w:drawing>
             </mc:Choice>
-            <mc:Fallback>
+            <mc:Fallback xmlns:w16cei="http://schemas.microsoft.com/office/word/2026/wordml/cei">
               <w:pict>
                 <v:line w14:anchorId="094DA931" id="Conector recto 11" o:spid="_x0000_s1026" style="position:absolute;z-index:251662336;visibility:visible;mso-wrap-style:square;mso-width-percent:0;mso-height-percent:0;mso-wrap-distance-left:9pt;mso-wrap-distance-top:0;mso-wrap-distance-right:9pt;mso-wrap-distance-bottom:0;mso-position-horizontal:absolute;mso-position-horizontal-relative:margin;mso-position-vertical:absolute;mso-position-vertical-relative:text;mso-width-percent:0;mso-height-percent:0;mso-width-relative:margin;mso-height-relative:margin" from="0,-.4pt" to="1149.85pt,-.4pt" o:gfxdata="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" strokecolor="#4472c4 [3204]" strokeweight="3pt">
                   <v:stroke joinstyle="miter"/>
@@ -17228,7 +15033,7 @@
 </file>
 
 <file path=word/footer2.xml><?xml version="1.0" encoding="utf-8"?>
-<w:ftr xmlns:wpc="http://schemas.microsoft.com/office/word/2010/wordprocessingCanvas" xmlns:cx="http://schemas.microsoft.com/office/drawing/2014/chartex" xmlns:cx1="http://schemas.microsoft.com/office/drawing/2015/9/8/chartex" xmlns:cx2="http://schemas.microsoft.com/office/drawing/2015/10/21/chartex" xmlns:cx3="http://schemas.microsoft.com/office/drawing/2016/5/9/chartex" xmlns:cx4="http://schemas.microsoft.com/office/drawing/2016/5/10/chartex" xmlns:cx5="http://schemas.microsoft.com/office/drawing/2016/5/11/chartex" xmlns:cx6="http://schemas.microsoft.com/office/drawing/2016/5/12/chartex" xmlns:cx7="http://schemas.microsoft.com/office/drawing/2016/5/13/chartex" xmlns:cx8="http://schemas.microsoft.com/office/drawing/2016/5/14/chartex" xmlns:mc="http://schemas.openxmlformats.org/markup-compatibility/2006" xmlns:aink="http://schemas.microsoft.com/office/drawing/2016/ink" xmlns:am3d="http://schemas.microsoft.com/office/drawing/2017/model3d" xmlns:o="urn:schemas-microsoft-com:office:office" xmlns:oel="http://schemas.microsoft.com/office/2019/extlst" xmlns:r="http://schemas.openxmlformats.org/officeDocument/2006/relationships" xmlns:m="http://schemas.openxmlformats.org/officeDocument/2006/math" xmlns:v="urn:schemas-microsoft-com:vml" xmlns:wp14="http://schemas.microsoft.com/office/word/2010/wordprocessingDrawing" xmlns:wp="http://schemas.openxmlformats.org/drawingml/2006/wordprocessingDrawing" xmlns:w10="urn:schemas-microsoft-com:office:word" xmlns:w="http://schemas.openxmlformats.org/wordprocessingml/2006/main" xmlns:w14="http://schemas.microsoft.com/office/word/2010/wordml" xmlns:w15="http://schemas.microsoft.com/office/word/2012/wordml" xmlns:w16cei="http://schemas.microsoft.com/office/word/2026/wordml/cei" xmlns:w16cex="http://schemas.microsoft.com/office/word/2018/wordml/cex" xmlns:w16cid="http://schemas.microsoft.com/office/word/2016/wordml/cid" xmlns:w16="http://schemas.microsoft.com/office/word/2018/wordml" xmlns:w16du="http://schemas.microsoft.com/office/word/2023/wordml/word16du" xmlns:w16sdtdh="http://schemas.microsoft.com/office/word/2020/wordml/sdtdatahash" xmlns:w16sdtfl="http://schemas.microsoft.com/office/word/2024/wordml/sdtformatlock" xmlns:w16se="http://schemas.microsoft.com/office/word/2015/wordml/symex" xmlns:wpg="http://schemas.microsoft.com/office/word/2010/wordprocessingGroup" xmlns:wpi="http://schemas.microsoft.com/office/word/2010/wordprocessingInk" xmlns:wne="http://schemas.microsoft.com/office/word/2006/wordml" xmlns:wps="http://schemas.microsoft.com/office/word/2010/wordprocessingShape" mc:Ignorable="w14 w15 w16se w16cid w16 w16cex w16sdtdh w16sdtfl w16du wp14">
+<w:ftr xmlns:wpc="http://schemas.microsoft.com/office/word/2010/wordprocessingCanvas" xmlns:cx="http://schemas.microsoft.com/office/drawing/2014/chartex" xmlns:cx1="http://schemas.microsoft.com/office/drawing/2015/9/8/chartex" xmlns:cx2="http://schemas.microsoft.com/office/drawing/2015/10/21/chartex" xmlns:cx3="http://schemas.microsoft.com/office/drawing/2016/5/9/chartex" xmlns:cx4="http://schemas.microsoft.com/office/drawing/2016/5/10/chartex" xmlns:cx5="http://schemas.microsoft.com/office/drawing/2016/5/11/chartex" xmlns:cx6="http://schemas.microsoft.com/office/drawing/2016/5/12/chartex" xmlns:cx7="http://schemas.microsoft.com/office/drawing/2016/5/13/chartex" xmlns:cx8="http://schemas.microsoft.com/office/drawing/2016/5/14/chartex" xmlns:mc="http://schemas.openxmlformats.org/markup-compatibility/2006" xmlns:aink="http://schemas.microsoft.com/office/drawing/2016/ink" xmlns:am3d="http://schemas.microsoft.com/office/drawing/2017/model3d" xmlns:o="urn:schemas-microsoft-com:office:office" xmlns:oel="http://schemas.microsoft.com/office/2019/extlst" xmlns:r="http://schemas.openxmlformats.org/officeDocument/2006/relationships" xmlns:m="http://schemas.openxmlformats.org/officeDocument/2006/math" xmlns:v="urn:schemas-microsoft-com:vml" xmlns:wp14="http://schemas.microsoft.com/office/word/2010/wordprocessingDrawing" xmlns:wp="http://schemas.openxmlformats.org/drawingml/2006/wordprocessingDrawing" xmlns:w10="urn:schemas-microsoft-com:office:word" xmlns:w="http://schemas.openxmlformats.org/wordprocessingml/2006/main" xmlns:w14="http://schemas.microsoft.com/office/word/2010/wordml" xmlns:w15="http://schemas.microsoft.com/office/word/2012/wordml" xmlns:w16cex="http://schemas.microsoft.com/office/word/2018/wordml/cex" xmlns:w16cid="http://schemas.microsoft.com/office/word/2016/wordml/cid" xmlns:w16="http://schemas.microsoft.com/office/word/2018/wordml" xmlns:w16du="http://schemas.microsoft.com/office/word/2023/wordml/word16du" xmlns:w16sdtdh="http://schemas.microsoft.com/office/word/2020/wordml/sdtdatahash" xmlns:w16sdtfl="http://schemas.microsoft.com/office/word/2024/wordml/sdtformatlock" xmlns:w16se="http://schemas.microsoft.com/office/word/2015/wordml/symex" xmlns:wpg="http://schemas.microsoft.com/office/word/2010/wordprocessingGroup" xmlns:wpi="http://schemas.microsoft.com/office/word/2010/wordprocessingInk" xmlns:wne="http://schemas.microsoft.com/office/word/2006/wordml" xmlns:wps="http://schemas.microsoft.com/office/word/2010/wordprocessingShape" mc:Ignorable="w14 w15 w16se w16cid w16 w16cex w16sdtdh w16sdtfl w16du wp14">
   <w:sdt>
     <w:sdtPr>
       <w:id w:val="-1198398042"/>
@@ -17281,7 +15086,7 @@
 </file>
 
 <file path=word/footnotes.xml><?xml version="1.0" encoding="utf-8"?>
-<w:footnotes xmlns:wpc="http://schemas.microsoft.com/office/word/2010/wordprocessingCanvas" xmlns:cx="http://schemas.microsoft.com/office/drawing/2014/chartex" xmlns:cx1="http://schemas.microsoft.com/office/drawing/2015/9/8/chartex" xmlns:cx2="http://schemas.microsoft.com/office/drawing/2015/10/21/chartex" xmlns:cx3="http://schemas.microsoft.com/office/drawing/2016/5/9/chartex" xmlns:cx4="http://schemas.microsoft.com/office/drawing/2016/5/10/chartex" xmlns:cx5="http://schemas.microsoft.com/office/drawing/2016/5/11/chartex" xmlns:cx6="http://schemas.microsoft.com/office/drawing/2016/5/12/chartex" xmlns:cx7="http://schemas.microsoft.com/office/drawing/2016/5/13/chartex" xmlns:cx8="http://schemas.microsoft.com/office/drawing/2016/5/14/chartex" xmlns:mc="http://schemas.openxmlformats.org/markup-compatibility/2006" xmlns:aink="http://schemas.microsoft.com/office/drawing/2016/ink" xmlns:am3d="http://schemas.microsoft.com/office/drawing/2017/model3d" xmlns:o="urn:schemas-microsoft-com:office:office" xmlns:oel="http://schemas.microsoft.com/office/2019/extlst" xmlns:r="http://schemas.openxmlformats.org/officeDocument/2006/relationships" xmlns:m="http://schemas.openxmlformats.org/officeDocument/2006/math" xmlns:v="urn:schemas-microsoft-com:vml" xmlns:wp14="http://schemas.microsoft.com/office/word/2010/wordprocessingDrawing" xmlns:wp="http://schemas.openxmlformats.org/drawingml/2006/wordprocessingDrawing" xmlns:w10="urn:schemas-microsoft-com:office:word" xmlns:w="http://schemas.openxmlformats.org/wordprocessingml/2006/main" xmlns:w14="http://schemas.microsoft.com/office/word/2010/wordml" xmlns:w15="http://schemas.microsoft.com/office/word/2012/wordml" xmlns:w16cei="http://schemas.microsoft.com/office/word/2026/wordml/cei" xmlns:w16cex="http://schemas.microsoft.com/office/word/2018/wordml/cex" xmlns:w16cid="http://schemas.microsoft.com/office/word/2016/wordml/cid" xmlns:w16="http://schemas.microsoft.com/office/word/2018/wordml" xmlns:w16du="http://schemas.microsoft.com/office/word/2023/wordml/word16du" xmlns:w16sdtdh="http://schemas.microsoft.com/office/word/2020/wordml/sdtdatahash" xmlns:w16sdtfl="http://schemas.microsoft.com/office/word/2024/wordml/sdtformatlock" xmlns:w16se="http://schemas.microsoft.com/office/word/2015/wordml/symex" xmlns:wpg="http://schemas.microsoft.com/office/word/2010/wordprocessingGroup" xmlns:wpi="http://schemas.microsoft.com/office/word/2010/wordprocessingInk" xmlns:wne="http://schemas.microsoft.com/office/word/2006/wordml" xmlns:wps="http://schemas.microsoft.com/office/word/2010/wordprocessingShape" mc:Ignorable="w14 w15 w16se w16cid w16 w16cex w16sdtdh w16sdtfl w16du wp14">
+<w:footnotes xmlns:wpc="http://schemas.microsoft.com/office/word/2010/wordprocessingCanvas" xmlns:cx="http://schemas.microsoft.com/office/drawing/2014/chartex" xmlns:cx1="http://schemas.microsoft.com/office/drawing/2015/9/8/chartex" xmlns:cx2="http://schemas.microsoft.com/office/drawing/2015/10/21/chartex" xmlns:cx3="http://schemas.microsoft.com/office/drawing/2016/5/9/chartex" xmlns:cx4="http://schemas.microsoft.com/office/drawing/2016/5/10/chartex" xmlns:cx5="http://schemas.microsoft.com/office/drawing/2016/5/11/chartex" xmlns:cx6="http://schemas.microsoft.com/office/drawing/2016/5/12/chartex" xmlns:cx7="http://schemas.microsoft.com/office/drawing/2016/5/13/chartex" xmlns:cx8="http://schemas.microsoft.com/office/drawing/2016/5/14/chartex" xmlns:mc="http://schemas.openxmlformats.org/markup-compatibility/2006" xmlns:aink="http://schemas.microsoft.com/office/drawing/2016/ink" xmlns:am3d="http://schemas.microsoft.com/office/drawing/2017/model3d" xmlns:o="urn:schemas-microsoft-com:office:office" xmlns:oel="http://schemas.microsoft.com/office/2019/extlst" xmlns:r="http://schemas.openxmlformats.org/officeDocument/2006/relationships" xmlns:m="http://schemas.openxmlformats.org/officeDocument/2006/math" xmlns:v="urn:schemas-microsoft-com:vml" xmlns:wp14="http://schemas.microsoft.com/office/word/2010/wordprocessingDrawing" xmlns:wp="http://schemas.openxmlformats.org/drawingml/2006/wordprocessingDrawing" xmlns:w10="urn:schemas-microsoft-com:office:word" xmlns:w="http://schemas.openxmlformats.org/wordprocessingml/2006/main" xmlns:w14="http://schemas.microsoft.com/office/word/2010/wordml" xmlns:w15="http://schemas.microsoft.com/office/word/2012/wordml" xmlns:w16cex="http://schemas.microsoft.com/office/word/2018/wordml/cex" xmlns:w16cid="http://schemas.microsoft.com/office/word/2016/wordml/cid" xmlns:w16="http://schemas.microsoft.com/office/word/2018/wordml" xmlns:w16du="http://schemas.microsoft.com/office/word/2023/wordml/word16du" xmlns:w16sdtdh="http://schemas.microsoft.com/office/word/2020/wordml/sdtdatahash" xmlns:w16sdtfl="http://schemas.microsoft.com/office/word/2024/wordml/sdtformatlock" xmlns:w16se="http://schemas.microsoft.com/office/word/2015/wordml/symex" xmlns:wpg="http://schemas.microsoft.com/office/word/2010/wordprocessingGroup" xmlns:wpi="http://schemas.microsoft.com/office/word/2010/wordprocessingInk" xmlns:wne="http://schemas.microsoft.com/office/word/2006/wordml" xmlns:wps="http://schemas.microsoft.com/office/word/2010/wordprocessingShape" mc:Ignorable="w14 w15 w16se w16cid w16 w16cex w16sdtdh w16sdtfl w16du wp14">
   <w:footnote w:type="separator" w:id="-1">
     <w:p>
       <w:pPr>
@@ -17306,7 +15111,7 @@
 </file>
 
 <file path=word/header1.xml><?xml version="1.0" encoding="utf-8"?>
-<w:hdr xmlns:wpc="http://schemas.microsoft.com/office/word/2010/wordprocessingCanvas" xmlns:cx="http://schemas.microsoft.com/office/drawing/2014/chartex" xmlns:cx1="http://schemas.microsoft.com/office/drawing/2015/9/8/chartex" xmlns:cx2="http://schemas.microsoft.com/office/drawing/2015/10/21/chartex" xmlns:cx3="http://schemas.microsoft.com/office/drawing/2016/5/9/chartex" xmlns:cx4="http://schemas.microsoft.com/office/drawing/2016/5/10/chartex" xmlns:cx5="http://schemas.microsoft.com/office/drawing/2016/5/11/chartex" xmlns:cx6="http://schemas.microsoft.com/office/drawing/2016/5/12/chartex" xmlns:cx7="http://schemas.microsoft.com/office/drawing/2016/5/13/chartex" xmlns:cx8="http://schemas.microsoft.com/office/drawing/2016/5/14/chartex" xmlns:mc="http://schemas.openxmlformats.org/markup-compatibility/2006" xmlns:aink="http://schemas.microsoft.com/office/drawing/2016/ink" xmlns:am3d="http://schemas.microsoft.com/office/drawing/2017/model3d" xmlns:o="urn:schemas-microsoft-com:office:office" xmlns:oel="http://schemas.microsoft.com/office/2019/extlst" xmlns:r="http://schemas.openxmlformats.org/officeDocument/2006/relationships" xmlns:m="http://schemas.openxmlformats.org/officeDocument/2006/math" xmlns:v="urn:schemas-microsoft-com:vml" xmlns:wp14="http://schemas.microsoft.com/office/word/2010/wordprocessingDrawing" xmlns:wp="http://schemas.openxmlformats.org/drawingml/2006/wordprocessingDrawing" xmlns:w10="urn:schemas-microsoft-com:office:word" xmlns:w="http://schemas.openxmlformats.org/wordprocessingml/2006/main" xmlns:w14="http://schemas.microsoft.com/office/word/2010/wordml" xmlns:w15="http://schemas.microsoft.com/office/word/2012/wordml" xmlns:w16cei="http://schemas.microsoft.com/office/word/2026/wordml/cei" xmlns:w16cex="http://schemas.microsoft.com/office/word/2018/wordml/cex" xmlns:w16cid="http://schemas.microsoft.com/office/word/2016/wordml/cid" xmlns:w16="http://schemas.microsoft.com/office/word/2018/wordml" xmlns:w16du="http://schemas.microsoft.com/office/word/2023/wordml/word16du" xmlns:w16sdtdh="http://schemas.microsoft.com/office/word/2020/wordml/sdtdatahash" xmlns:w16sdtfl="http://schemas.microsoft.com/office/word/2024/wordml/sdtformatlock" xmlns:w16se="http://schemas.microsoft.com/office/word/2015/wordml/symex" xmlns:wpg="http://schemas.microsoft.com/office/word/2010/wordprocessingGroup" xmlns:wpi="http://schemas.microsoft.com/office/word/2010/wordprocessingInk" xmlns:wne="http://schemas.microsoft.com/office/word/2006/wordml" xmlns:wps="http://schemas.microsoft.com/office/word/2010/wordprocessingShape" mc:Ignorable="w14 w15 w16se w16cid w16 w16cex w16sdtdh w16sdtfl w16du wp14">
+<w:hdr xmlns:wpc="http://schemas.microsoft.com/office/word/2010/wordprocessingCanvas" xmlns:cx="http://schemas.microsoft.com/office/drawing/2014/chartex" xmlns:cx1="http://schemas.microsoft.com/office/drawing/2015/9/8/chartex" xmlns:cx2="http://schemas.microsoft.com/office/drawing/2015/10/21/chartex" xmlns:cx3="http://schemas.microsoft.com/office/drawing/2016/5/9/chartex" xmlns:cx4="http://schemas.microsoft.com/office/drawing/2016/5/10/chartex" xmlns:cx5="http://schemas.microsoft.com/office/drawing/2016/5/11/chartex" xmlns:cx6="http://schemas.microsoft.com/office/drawing/2016/5/12/chartex" xmlns:cx7="http://schemas.microsoft.com/office/drawing/2016/5/13/chartex" xmlns:cx8="http://schemas.microsoft.com/office/drawing/2016/5/14/chartex" xmlns:mc="http://schemas.openxmlformats.org/markup-compatibility/2006" xmlns:aink="http://schemas.microsoft.com/office/drawing/2016/ink" xmlns:am3d="http://schemas.microsoft.com/office/drawing/2017/model3d" xmlns:o="urn:schemas-microsoft-com:office:office" xmlns:oel="http://schemas.microsoft.com/office/2019/extlst" xmlns:r="http://schemas.openxmlformats.org/officeDocument/2006/relationships" xmlns:m="http://schemas.openxmlformats.org/officeDocument/2006/math" xmlns:v="urn:schemas-microsoft-com:vml" xmlns:wp14="http://schemas.microsoft.com/office/word/2010/wordprocessingDrawing" xmlns:wp="http://schemas.openxmlformats.org/drawingml/2006/wordprocessingDrawing" xmlns:w10="urn:schemas-microsoft-com:office:word" xmlns:w="http://schemas.openxmlformats.org/wordprocessingml/2006/main" xmlns:w14="http://schemas.microsoft.com/office/word/2010/wordml" xmlns:w15="http://schemas.microsoft.com/office/word/2012/wordml" xmlns:w16cex="http://schemas.microsoft.com/office/word/2018/wordml/cex" xmlns:w16cid="http://schemas.microsoft.com/office/word/2016/wordml/cid" xmlns:w16="http://schemas.microsoft.com/office/word/2018/wordml" xmlns:w16du="http://schemas.microsoft.com/office/word/2023/wordml/word16du" xmlns:w16sdtdh="http://schemas.microsoft.com/office/word/2020/wordml/sdtdatahash" xmlns:w16sdtfl="http://schemas.microsoft.com/office/word/2024/wordml/sdtformatlock" xmlns:w16se="http://schemas.microsoft.com/office/word/2015/wordml/symex" xmlns:wpg="http://schemas.microsoft.com/office/word/2010/wordprocessingGroup" xmlns:wpi="http://schemas.microsoft.com/office/word/2010/wordprocessingInk" xmlns:wne="http://schemas.microsoft.com/office/word/2006/wordml" xmlns:wps="http://schemas.microsoft.com/office/word/2010/wordprocessingShape" mc:Ignorable="w14 w15 w16se w16cid w16 w16cex w16sdtdh w16sdtfl w16du wp14">
   <w:p>
     <w:pPr>
       <w:pStyle w:val="Header"/>
@@ -17449,7 +15254,7 @@
             </wp:anchor>
           </w:drawing>
         </mc:Choice>
-        <mc:Fallback>
+        <mc:Fallback xmlns:w16cei="http://schemas.microsoft.com/office/word/2026/wordml/cei">
           <w:pict>
             <v:line w14:anchorId="37F3FFE6" id="Conector recto 11" o:spid="_x0000_s1026" style="position:absolute;z-index:251660288;visibility:visible;mso-wrap-style:square;mso-width-percent:0;mso-height-percent:0;mso-wrap-distance-left:9pt;mso-wrap-distance-top:0;mso-wrap-distance-right:9pt;mso-wrap-distance-bottom:0;mso-position-horizontal:absolute;mso-position-horizontal-relative:margin;mso-position-vertical:absolute;mso-position-vertical-relative:text;mso-width-percent:0;mso-height-percent:0;mso-width-relative:margin;mso-height-relative:margin" from="2.15pt,50.85pt" to="16in,50.85pt" o:gfxdata="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" strokecolor="#4472c4 [3204]" strokeweight="3pt">
               <v:stroke joinstyle="miter"/>
@@ -17464,7 +15269,7 @@
 </file>
 
 <file path=word/numbering.xml><?xml version="1.0" encoding="utf-8"?>
-<w:numbering xmlns:wpc="http://schemas.microsoft.com/office/word/2010/wordprocessingCanvas" xmlns:cx="http://schemas.microsoft.com/office/drawing/2014/chartex" xmlns:cx1="http://schemas.microsoft.com/office/drawing/2015/9/8/chartex" xmlns:cx2="http://schemas.microsoft.com/office/drawing/2015/10/21/chartex" xmlns:cx3="http://schemas.microsoft.com/office/drawing/2016/5/9/chartex" xmlns:cx4="http://schemas.microsoft.com/office/drawing/2016/5/10/chartex" xmlns:cx5="http://schemas.microsoft.com/office/drawing/2016/5/11/chartex" xmlns:cx6="http://schemas.microsoft.com/office/drawing/2016/5/12/chartex" xmlns:cx7="http://schemas.microsoft.com/office/drawing/2016/5/13/chartex" xmlns:cx8="http://schemas.microsoft.com/office/drawing/2016/5/14/chartex" xmlns:mc="http://schemas.openxmlformats.org/markup-compatibility/2006" xmlns:aink="http://schemas.microsoft.com/office/drawing/2016/ink" xmlns:am3d="http://schemas.microsoft.com/office/drawing/2017/model3d" xmlns:o="urn:schemas-microsoft-com:office:office" xmlns:oel="http://schemas.microsoft.com/office/2019/extlst" xmlns:r="http://schemas.openxmlformats.org/officeDocument/2006/relationships" xmlns:m="http://schemas.openxmlformats.org/officeDocument/2006/math" xmlns:v="urn:schemas-microsoft-com:vml" xmlns:wp14="http://schemas.microsoft.com/office/word/2010/wordprocessingDrawing" xmlns:wp="http://schemas.openxmlformats.org/drawingml/2006/wordprocessingDrawing" xmlns:w10="urn:schemas-microsoft-com:office:word" xmlns:w="http://schemas.openxmlformats.org/wordprocessingml/2006/main" xmlns:w14="http://schemas.microsoft.com/office/word/2010/wordml" xmlns:w15="http://schemas.microsoft.com/office/word/2012/wordml" xmlns:w16cei="http://schemas.microsoft.com/office/word/2026/wordml/cei" xmlns:w16cex="http://schemas.microsoft.com/office/word/2018/wordml/cex" xmlns:w16cid="http://schemas.microsoft.com/office/word/2016/wordml/cid" xmlns:w16="http://schemas.microsoft.com/office/word/2018/wordml" xmlns:w16du="http://schemas.microsoft.com/office/word/2023/wordml/word16du" xmlns:w16sdtdh="http://schemas.microsoft.com/office/word/2020/wordml/sdtdatahash" xmlns:w16sdtfl="http://schemas.microsoft.com/office/word/2024/wordml/sdtformatlock" xmlns:w16se="http://schemas.microsoft.com/office/word/2015/wordml/symex" xmlns:wpg="http://schemas.microsoft.com/office/word/2010/wordprocessingGroup" xmlns:wpi="http://schemas.microsoft.com/office/word/2010/wordprocessingInk" xmlns:wne="http://schemas.microsoft.com/office/word/2006/wordml" xmlns:wps="http://schemas.microsoft.com/office/word/2010/wordprocessingShape" mc:Ignorable="w14 w15 w16se w16cid w16 w16cex w16sdtdh w16sdtfl w16du wp14">
+<w:numbering xmlns:wpc="http://schemas.microsoft.com/office/word/2010/wordprocessingCanvas" xmlns:cx="http://schemas.microsoft.com/office/drawing/2014/chartex" xmlns:cx1="http://schemas.microsoft.com/office/drawing/2015/9/8/chartex" xmlns:cx2="http://schemas.microsoft.com/office/drawing/2015/10/21/chartex" xmlns:cx3="http://schemas.microsoft.com/office/drawing/2016/5/9/chartex" xmlns:cx4="http://schemas.microsoft.com/office/drawing/2016/5/10/chartex" xmlns:cx5="http://schemas.microsoft.com/office/drawing/2016/5/11/chartex" xmlns:cx6="http://schemas.microsoft.com/office/drawing/2016/5/12/chartex" xmlns:cx7="http://schemas.microsoft.com/office/drawing/2016/5/13/chartex" xmlns:cx8="http://schemas.microsoft.com/office/drawing/2016/5/14/chartex" xmlns:mc="http://schemas.openxmlformats.org/markup-compatibility/2006" xmlns:aink="http://schemas.microsoft.com/office/drawing/2016/ink" xmlns:am3d="http://schemas.microsoft.com/office/drawing/2017/model3d" xmlns:o="urn:schemas-microsoft-com:office:office" xmlns:oel="http://schemas.microsoft.com/office/2019/extlst" xmlns:r="http://schemas.openxmlformats.org/officeDocument/2006/relationships" xmlns:m="http://schemas.openxmlformats.org/officeDocument/2006/math" xmlns:v="urn:schemas-microsoft-com:vml" xmlns:wp14="http://schemas.microsoft.com/office/word/2010/wordprocessingDrawing" xmlns:wp="http://schemas.openxmlformats.org/drawingml/2006/wordprocessingDrawing" xmlns:w10="urn:schemas-microsoft-com:office:word" xmlns:w="http://schemas.openxmlformats.org/wordprocessingml/2006/main" xmlns:w14="http://schemas.microsoft.com/office/word/2010/wordml" xmlns:w15="http://schemas.microsoft.com/office/word/2012/wordml" xmlns:w16cex="http://schemas.microsoft.com/office/word/2018/wordml/cex" xmlns:w16cid="http://schemas.microsoft.com/office/word/2016/wordml/cid" xmlns:w16="http://schemas.microsoft.com/office/word/2018/wordml" xmlns:w16du="http://schemas.microsoft.com/office/word/2023/wordml/word16du" xmlns:w16sdtdh="http://schemas.microsoft.com/office/word/2020/wordml/sdtdatahash" xmlns:w16sdtfl="http://schemas.microsoft.com/office/word/2024/wordml/sdtformatlock" xmlns:w16se="http://schemas.microsoft.com/office/word/2015/wordml/symex" xmlns:wpg="http://schemas.microsoft.com/office/word/2010/wordprocessingGroup" xmlns:wpi="http://schemas.microsoft.com/office/word/2010/wordprocessingInk" xmlns:wne="http://schemas.microsoft.com/office/word/2006/wordml" xmlns:wps="http://schemas.microsoft.com/office/word/2010/wordprocessingShape" mc:Ignorable="w14 w15 w16se w16cid w16 w16cex w16sdtdh w16sdtfl w16du wp14">
   <w:abstractNum w:abstractNumId="0" w15:restartNumberingAfterBreak="0">
     <w:nsid w:val="34642CE1"/>
     <w:multiLevelType w:val="hybridMultilevel"/>

</xml_diff>